<commit_message>
Update CV to Aug 2026 version
</commit_message>
<xml_diff>
--- a/CV.docx
+++ b/CV.docx
@@ -1,6 +1,6 @@
 
 <file path=word/document.xml><?xml version="1.0" encoding="utf-8"?>
-<w:document xmlns:wpc="http://schemas.microsoft.com/office/word/2010/wordprocessingCanvas" xmlns:cx="http://schemas.microsoft.com/office/drawing/2014/chartex" xmlns:cx1="http://schemas.microsoft.com/office/drawing/2015/9/8/chartex" xmlns:cx2="http://schemas.microsoft.com/office/drawing/2015/10/21/chartex" xmlns:cx3="http://schemas.microsoft.com/office/drawing/2016/5/9/chartex" xmlns:cx4="http://schemas.microsoft.com/office/drawing/2016/5/10/chartex" xmlns:cx5="http://schemas.microsoft.com/office/drawing/2016/5/11/chartex" xmlns:cx6="http://schemas.microsoft.com/office/drawing/2016/5/12/chartex" xmlns:cx7="http://schemas.microsoft.com/office/drawing/2016/5/13/chartex" xmlns:cx8="http://schemas.microsoft.com/office/drawing/2016/5/14/chartex" xmlns:mc="http://schemas.openxmlformats.org/markup-compatibility/2006" xmlns:aink="http://schemas.microsoft.com/office/drawing/2016/ink" xmlns:am3d="http://schemas.microsoft.com/office/drawing/2017/model3d" xmlns:o="urn:schemas-microsoft-com:office:office" xmlns:oel="http://schemas.microsoft.com/office/2019/extlst" xmlns:r="http://schemas.openxmlformats.org/officeDocument/2006/relationships" xmlns:m="http://schemas.openxmlformats.org/officeDocument/2006/math" xmlns:v="urn:schemas-microsoft-com:vml" xmlns:wp14="http://schemas.microsoft.com/office/word/2010/wordprocessingDrawing" xmlns:wp="http://schemas.openxmlformats.org/drawingml/2006/wordprocessingDrawing" xmlns:w10="urn:schemas-microsoft-com:office:word" xmlns:w="http://schemas.openxmlformats.org/wordprocessingml/2006/main" xmlns:w14="http://schemas.microsoft.com/office/word/2010/wordml" xmlns:w15="http://schemas.microsoft.com/office/word/2012/wordml" xmlns:w16cex="http://schemas.microsoft.com/office/word/2018/wordml/cex" xmlns:w16cid="http://schemas.microsoft.com/office/word/2016/wordml/cid" xmlns:w16="http://schemas.microsoft.com/office/word/2018/wordml" xmlns:w16du="http://schemas.microsoft.com/office/word/2023/wordml/word16du" xmlns:w16sdtdh="http://schemas.microsoft.com/office/word/2020/wordml/sdtdatahash" xmlns:w16sdtfl="http://schemas.microsoft.com/office/word/2024/wordml/sdtformatlock" xmlns:w16se="http://schemas.microsoft.com/office/word/2015/wordml/symex" xmlns:wpg="http://schemas.microsoft.com/office/word/2010/wordprocessingGroup" xmlns:wpi="http://schemas.microsoft.com/office/word/2010/wordprocessingInk" xmlns:wne="http://schemas.microsoft.com/office/word/2006/wordml" xmlns:wps="http://schemas.microsoft.com/office/word/2010/wordprocessingShape" mc:Ignorable="w14 w15 w16se w16cid w16 w16cex w16sdtdh w16sdtfl w16du wp14">
+<w:document xmlns:wpc="http://schemas.microsoft.com/office/word/2010/wordprocessingCanvas" xmlns:cx="http://schemas.microsoft.com/office/drawing/2014/chartex" xmlns:cx1="http://schemas.microsoft.com/office/drawing/2015/9/8/chartex" xmlns:cx2="http://schemas.microsoft.com/office/drawing/2015/10/21/chartex" xmlns:cx3="http://schemas.microsoft.com/office/drawing/2016/5/9/chartex" xmlns:cx4="http://schemas.microsoft.com/office/drawing/2016/5/10/chartex" xmlns:cx5="http://schemas.microsoft.com/office/drawing/2016/5/11/chartex" xmlns:cx6="http://schemas.microsoft.com/office/drawing/2016/5/12/chartex" xmlns:cx7="http://schemas.microsoft.com/office/drawing/2016/5/13/chartex" xmlns:cx8="http://schemas.microsoft.com/office/drawing/2016/5/14/chartex" xmlns:mc="http://schemas.openxmlformats.org/markup-compatibility/2006" xmlns:m="http://schemas.openxmlformats.org/officeDocument/2006/math" xmlns:aink="http://schemas.microsoft.com/office/drawing/2016/ink" xmlns:am3d="http://schemas.microsoft.com/office/drawing/2017/model3d" xmlns:oel="http://schemas.microsoft.com/office/2019/extlst" xmlns:r="http://schemas.openxmlformats.org/officeDocument/2006/relationships" xmlns:wp14="http://schemas.microsoft.com/office/word/2010/wordprocessingDrawing" xmlns:wp="http://schemas.openxmlformats.org/drawingml/2006/wordprocessingDrawing" xmlns:wpg="http://schemas.microsoft.com/office/word/2010/wordprocessingGroup" xmlns:wpi="http://schemas.microsoft.com/office/word/2010/wordprocessingInk" xmlns:wps="http://schemas.microsoft.com/office/word/2010/wordprocessingShape" xmlns:o="urn:schemas-microsoft-com:office:office" xmlns:v="urn:schemas-microsoft-com:vml" xmlns:w10="urn:schemas-microsoft-com:office:word" xmlns:w="http://schemas.openxmlformats.org/wordprocessingml/2006/main" xmlns:w14="http://schemas.microsoft.com/office/word/2010/wordml" xmlns:w15="http://schemas.microsoft.com/office/word/2012/wordml" xmlns:w16cei="http://schemas.microsoft.com/office/word/2026/wordml/cei" xmlns:w16cex="http://schemas.microsoft.com/office/word/2018/wordml/cex" xmlns:w16cid="http://schemas.microsoft.com/office/word/2016/wordml/cid" xmlns:w16="http://schemas.microsoft.com/office/word/2018/wordml" xmlns:w16sdtdh="http://schemas.microsoft.com/office/word/2020/wordml/sdtdatahash" xmlns:w16sdtfl="http://schemas.microsoft.com/office/word/2024/wordml/sdtformatlock" xmlns:w16se="http://schemas.microsoft.com/office/word/2015/wordml/symex" xmlns:w16du="http://schemas.microsoft.com/office/word/2023/wordml/word16du" xmlns:wne="http://schemas.microsoft.com/office/word/2006/wordml" mc:Ignorable="w14 w15 w16se w16cid w16 w16cex w16sdtdh w16sdtfl w16du wp14">
   <w:background w:color="FFFFFF" w:themeColor="background1"/>
   <w:body>
     <w:p>
@@ -111,7 +111,7 @@
     </w:p>
     <w:tbl>
       <w:tblPr>
-        <w:tblStyle w:val="ad"/>
+        <w:tblStyle w:val="TableGrid"/>
         <w:tblW w:w="0" w:type="auto"/>
         <w:tblInd w:w="108" w:type="dxa"/>
         <w:tblBorders>
@@ -154,7 +154,15 @@
             </w:r>
             <w:r>
               <w:rPr>
-                <w:rStyle w:val="ab"/>
+                <w:rFonts w:ascii="Courier New" w:hAnsi="Courier New" w:cs="Courier New" w:hint="eastAsia"/>
+                <w:sz w:val="20"/>
+                <w:szCs w:val="20"/>
+              </w:rPr>
+              <w:t xml:space="preserve"> </w:t>
+            </w:r>
+            <w:r>
+              <w:rPr>
+                <w:rStyle w:val="Hyperlink"/>
                 <w:lang w:val="nl-NL"/>
               </w:rPr>
               <w:t>H.Wang7@leeds.ac.uk</w:t>
@@ -203,7 +211,7 @@
             </w:r>
             <w:r>
               <w:rPr>
-                <w:rStyle w:val="ab"/>
+                <w:rStyle w:val="Hyperlink"/>
                 <w:rFonts w:hint="eastAsia"/>
                 <w:lang w:val="nl-NL"/>
               </w:rPr>
@@ -303,7 +311,7 @@
     </w:p>
     <w:tbl>
       <w:tblPr>
-        <w:tblStyle w:val="ad"/>
+        <w:tblStyle w:val="TableGrid"/>
         <w:tblW w:w="0" w:type="auto"/>
         <w:tblInd w:w="250" w:type="dxa"/>
         <w:tblBorders>
@@ -447,7 +455,7 @@
           </w:p>
           <w:p>
             <w:pPr>
-              <w:pStyle w:val="a"/>
+              <w:pStyle w:val="ListParagraph"/>
               <w:rPr>
                 <w:i/>
                 <w:iCs/>
@@ -516,7 +524,7 @@
           <w:p>
             <w:pPr>
               <w:rPr>
-                <w:rFonts w:ascii="Palatino Linotype" w:hAnsi="Palatino Linotype" w:cs="Times New Roman"/>
+                <w:rFonts w:ascii="Palatino Linotype" w:hAnsi="Palatino Linotype" w:cs="Times New Roman" w:hint="eastAsia"/>
                 <w:bCs/>
                 <w:sz w:val="20"/>
                 <w:szCs w:val="20"/>
@@ -588,7 +596,7 @@
           </w:p>
           <w:p>
             <w:pPr>
-              <w:pStyle w:val="a"/>
+              <w:pStyle w:val="ListParagraph"/>
             </w:pPr>
             <w:r>
               <w:t>First Class Scholarships (top 5% students</w:t>
@@ -797,7 +805,7 @@
     </w:p>
     <w:tbl>
       <w:tblPr>
-        <w:tblStyle w:val="ad"/>
+        <w:tblStyle w:val="TableGrid"/>
         <w:tblW w:w="0" w:type="auto"/>
         <w:tblInd w:w="250" w:type="dxa"/>
         <w:tblBorders>
@@ -811,17 +819,17 @@
         <w:tblLook w:val="04A0" w:firstRow="1" w:lastRow="0" w:firstColumn="1" w:lastColumn="0" w:noHBand="0" w:noVBand="1"/>
       </w:tblPr>
       <w:tblGrid>
-        <w:gridCol w:w="1805"/>
-        <w:gridCol w:w="2563"/>
-        <w:gridCol w:w="5020"/>
+        <w:gridCol w:w="1804"/>
+        <w:gridCol w:w="2561"/>
+        <w:gridCol w:w="5023"/>
       </w:tblGrid>
       <w:tr>
         <w:trPr>
-          <w:trHeight w:val="268"/>
+          <w:trHeight w:val="365"/>
         </w:trPr>
         <w:tc>
           <w:tcPr>
-            <w:tcW w:w="1811" w:type="dxa"/>
+            <w:tcW w:w="1804" w:type="dxa"/>
           </w:tcPr>
           <w:p>
             <w:pPr>
@@ -839,13 +847,40 @@
                 <w:szCs w:val="20"/>
                 <w:lang w:val="en-US"/>
               </w:rPr>
-              <w:t>12/2024 - Present</w:t>
+              <w:t>0</w:t>
+            </w:r>
+            <w:r>
+              <w:rPr>
+                <w:rFonts w:ascii="Palatino Linotype" w:hAnsi="Palatino Linotype" w:cs="Times New Roman" w:hint="eastAsia"/>
+                <w:sz w:val="20"/>
+                <w:szCs w:val="20"/>
+                <w:lang w:val="en-US"/>
+              </w:rPr>
+              <w:t>9</w:t>
+            </w:r>
+            <w:r>
+              <w:rPr>
+                <w:rFonts w:ascii="Palatino Linotype" w:hAnsi="Palatino Linotype" w:cs="Times New Roman" w:hint="eastAsia"/>
+                <w:sz w:val="20"/>
+                <w:szCs w:val="20"/>
+                <w:lang w:val="en-US"/>
+              </w:rPr>
+              <w:t xml:space="preserve">/2026 - </w:t>
+            </w:r>
+            <w:r>
+              <w:rPr>
+                <w:rFonts w:ascii="Palatino Linotype" w:hAnsi="Palatino Linotype" w:cs="Times New Roman"/>
+                <w:sz w:val="20"/>
+                <w:szCs w:val="20"/>
+                <w:lang w:val="en-US"/>
+              </w:rPr>
+              <w:t>Present</w:t>
             </w:r>
           </w:p>
         </w:tc>
         <w:tc>
           <w:tcPr>
-            <w:tcW w:w="2572" w:type="dxa"/>
+            <w:tcW w:w="2561" w:type="dxa"/>
           </w:tcPr>
           <w:p>
             <w:pPr>
@@ -871,11 +906,32 @@
         </w:tc>
         <w:tc>
           <w:tcPr>
-            <w:tcW w:w="5046" w:type="dxa"/>
+            <w:tcW w:w="5023" w:type="dxa"/>
           </w:tcPr>
           <w:p>
             <w:pPr>
               <w:rPr>
+                <w:rFonts w:ascii="Palatino Linotype" w:hAnsi="Palatino Linotype" w:cs="Times New Roman" w:hint="eastAsia"/>
+                <w:i/>
+                <w:iCs/>
+                <w:sz w:val="20"/>
+                <w:szCs w:val="20"/>
+                <w:lang w:val="en-US"/>
+              </w:rPr>
+            </w:pPr>
+            <w:r>
+              <w:rPr>
+                <w:rFonts w:ascii="Palatino Linotype" w:hAnsi="Palatino Linotype" w:cs="Times New Roman" w:hint="eastAsia"/>
+                <w:i/>
+                <w:iCs/>
+                <w:sz w:val="20"/>
+                <w:szCs w:val="20"/>
+                <w:lang w:val="en-US"/>
+              </w:rPr>
+              <w:t xml:space="preserve">Lecturer / </w:t>
+            </w:r>
+            <w:r>
+              <w:rPr>
                 <w:rFonts w:ascii="Palatino Linotype" w:hAnsi="Palatino Linotype" w:cs="Times New Roman"/>
                 <w:i/>
                 <w:iCs/>
@@ -883,7 +939,8 @@
                 <w:szCs w:val="20"/>
                 <w:lang w:val="en-US"/>
               </w:rPr>
-            </w:pPr>
+              <w:t>Assistant</w:t>
+            </w:r>
             <w:r>
               <w:rPr>
                 <w:rFonts w:ascii="Palatino Linotype" w:hAnsi="Palatino Linotype" w:cs="Times New Roman" w:hint="eastAsia"/>
@@ -893,7 +950,7 @@
                 <w:szCs w:val="20"/>
                 <w:lang w:val="en-US"/>
               </w:rPr>
-              <w:t>Research Fellow</w:t>
+              <w:t xml:space="preserve"> Professor</w:t>
             </w:r>
           </w:p>
         </w:tc>
@@ -904,7 +961,7 @@
         </w:trPr>
         <w:tc>
           <w:tcPr>
-            <w:tcW w:w="1811" w:type="dxa"/>
+            <w:tcW w:w="1804" w:type="dxa"/>
           </w:tcPr>
           <w:p>
             <w:pPr>
@@ -917,53 +974,36 @@
             </w:pPr>
             <w:r>
               <w:rPr>
-                <w:rFonts w:ascii="Palatino Linotype" w:hAnsi="Palatino Linotype" w:cs="Times New Roman"/>
+                <w:rFonts w:ascii="Palatino Linotype" w:hAnsi="Palatino Linotype" w:cs="Times New Roman" w:hint="eastAsia"/>
                 <w:sz w:val="20"/>
                 <w:szCs w:val="20"/>
                 <w:lang w:val="en-US"/>
               </w:rPr>
-              <w:t>08</w:t>
+              <w:t xml:space="preserve">12/2024 </w:t>
             </w:r>
             <w:r>
               <w:rPr>
-                <w:rFonts w:ascii="Palatino Linotype" w:hAnsi="Palatino Linotype" w:cs="Times New Roman" w:hint="eastAsia"/>
+                <w:rFonts w:ascii="Palatino Linotype" w:hAnsi="Palatino Linotype" w:cs="Times New Roman"/>
                 <w:sz w:val="20"/>
                 <w:szCs w:val="20"/>
                 <w:lang w:val="en-US"/>
               </w:rPr>
-              <w:t xml:space="preserve">/2021 </w:t>
+              <w:t>–</w:t>
             </w:r>
             <w:r>
               <w:rPr>
-                <w:rFonts w:ascii="Palatino Linotype" w:hAnsi="Palatino Linotype" w:cs="Times New Roman"/>
-                <w:sz w:val="20"/>
-                <w:szCs w:val="20"/>
-              </w:rPr>
-              <w:t xml:space="preserve">– </w:t>
-            </w:r>
-            <w:r>
-              <w:rPr>
-                <w:rFonts w:ascii="Palatino Linotype" w:hAnsi="Palatino Linotype" w:cs="Times New Roman"/>
+                <w:rFonts w:ascii="Palatino Linotype" w:hAnsi="Palatino Linotype" w:cs="Times New Roman" w:hint="eastAsia"/>
                 <w:sz w:val="20"/>
                 <w:szCs w:val="20"/>
                 <w:lang w:val="en-US"/>
               </w:rPr>
-              <w:t>11/2021</w:t>
-            </w:r>
-            <w:r>
-              <w:rPr>
-                <w:rFonts w:ascii="Palatino Linotype" w:hAnsi="Palatino Linotype" w:cs="Times New Roman" w:hint="eastAsia"/>
-                <w:sz w:val="20"/>
-                <w:szCs w:val="20"/>
-                <w:lang w:val="en-US"/>
-              </w:rPr>
-              <w:t xml:space="preserve"> </w:t>
+              <w:t xml:space="preserve"> 08/2026</w:t>
             </w:r>
           </w:p>
         </w:tc>
         <w:tc>
           <w:tcPr>
-            <w:tcW w:w="2572" w:type="dxa"/>
+            <w:tcW w:w="2561" w:type="dxa"/>
           </w:tcPr>
           <w:p>
             <w:pPr>
@@ -977,39 +1017,19 @@
             </w:pPr>
             <w:r>
               <w:rPr>
-                <w:rFonts w:ascii="Palatino Linotype" w:hAnsi="Palatino Linotype" w:cs="Times New Roman"/>
-                <w:bCs/>
-                <w:sz w:val="20"/>
-                <w:szCs w:val="20"/>
-                <w:lang w:val="en-US"/>
-              </w:rPr>
-              <w:t xml:space="preserve">Alibaba DAMO </w:t>
-            </w:r>
-            <w:r>
-              <w:rPr>
                 <w:rFonts w:ascii="Palatino Linotype" w:hAnsi="Palatino Linotype" w:cs="Times New Roman" w:hint="eastAsia"/>
                 <w:bCs/>
                 <w:sz w:val="20"/>
                 <w:szCs w:val="20"/>
                 <w:lang w:val="en-US"/>
               </w:rPr>
-              <w:t>A</w:t>
-            </w:r>
-            <w:r>
-              <w:rPr>
-                <w:rFonts w:ascii="Palatino Linotype" w:hAnsi="Palatino Linotype" w:cs="Times New Roman"/>
-                <w:bCs/>
-                <w:sz w:val="20"/>
-                <w:szCs w:val="20"/>
-                <w:lang w:val="en-US"/>
-              </w:rPr>
-              <w:t>cademic</w:t>
+              <w:t>University of Leeds</w:t>
             </w:r>
           </w:p>
         </w:tc>
         <w:tc>
           <w:tcPr>
-            <w:tcW w:w="5046" w:type="dxa"/>
+            <w:tcW w:w="5023" w:type="dxa"/>
           </w:tcPr>
           <w:p>
             <w:pPr>
@@ -1024,49 +1044,14 @@
             </w:pPr>
             <w:r>
               <w:rPr>
-                <w:rFonts w:ascii="Palatino Linotype" w:eastAsia="Palatino Linotype" w:hAnsi="Palatino Linotype" w:cs="Palatino Linotype"/>
+                <w:rFonts w:ascii="Palatino Linotype" w:hAnsi="Palatino Linotype" w:cs="Times New Roman" w:hint="eastAsia"/>
                 <w:i/>
                 <w:iCs/>
-                <w:color w:val="000000"/>
-                <w:lang w:val="en-US" w:bidi="ar"/>
-              </w:rPr>
-              <w:t>R</w:t>
-            </w:r>
-            <w:r>
-              <w:rPr>
-                <w:rFonts w:ascii="Palatino Linotype" w:eastAsia="Palatino Linotype" w:hAnsi="Palatino Linotype" w:cs="Palatino Linotype"/>
-                <w:i/>
-                <w:iCs/>
-                <w:color w:val="000000"/>
-                <w:sz w:val="19"/>
-                <w:szCs w:val="19"/>
-                <w:lang w:val="en-US" w:bidi="ar"/>
-              </w:rPr>
-              <w:t xml:space="preserve">esearch Intern in LLM </w:t>
-            </w:r>
-            <w:r>
-              <w:rPr>
-                <w:rFonts w:ascii="Palatino Linotype" w:eastAsia="Palatino Linotype" w:hAnsi="Palatino Linotype" w:cs="Palatino Linotype"/>
-                <w:i/>
-                <w:iCs/>
-                <w:color w:val="000000"/>
-                <w:sz w:val="19"/>
-                <w:szCs w:val="19"/>
-                <w:lang w:val="en-US" w:bidi="ar"/>
-              </w:rPr>
-              <w:t>G</w:t>
-            </w:r>
-            <w:r>
-              <w:rPr>
-                <w:rFonts w:ascii="Palatino Linotype" w:eastAsia="Palatino Linotype" w:hAnsi="Palatino Linotype" w:cs="Palatino Linotype"/>
-                <w:i/>
-                <w:iCs/>
-                <w:color w:val="000000"/>
-                <w:sz w:val="19"/>
-                <w:szCs w:val="19"/>
-                <w:lang w:val="en-US" w:bidi="ar"/>
-              </w:rPr>
-              <w:t>roup</w:t>
+                <w:sz w:val="20"/>
+                <w:szCs w:val="20"/>
+                <w:lang w:val="en-US"/>
+              </w:rPr>
+              <w:t>Research Fellow</w:t>
             </w:r>
           </w:p>
         </w:tc>
@@ -1077,7 +1062,7 @@
         </w:trPr>
         <w:tc>
           <w:tcPr>
-            <w:tcW w:w="1811" w:type="dxa"/>
+            <w:tcW w:w="1804" w:type="dxa"/>
           </w:tcPr>
           <w:p>
             <w:pPr>
@@ -1088,21 +1073,55 @@
                 <w:lang w:val="en-US"/>
               </w:rPr>
             </w:pPr>
-            <w:bookmarkStart w:id="3" w:name="OLE_LINK17"/>
-            <w:bookmarkStart w:id="4" w:name="OLE_LINK18"/>
             <w:r>
               <w:rPr>
                 <w:rFonts w:ascii="Palatino Linotype" w:hAnsi="Palatino Linotype" w:cs="Times New Roman"/>
                 <w:sz w:val="20"/>
                 <w:szCs w:val="20"/>
-              </w:rPr>
-              <w:t>07/2019 – 12/2019</w:t>
+                <w:lang w:val="en-US"/>
+              </w:rPr>
+              <w:t>08</w:t>
+            </w:r>
+            <w:r>
+              <w:rPr>
+                <w:rFonts w:ascii="Palatino Linotype" w:hAnsi="Palatino Linotype" w:cs="Times New Roman" w:hint="eastAsia"/>
+                <w:sz w:val="20"/>
+                <w:szCs w:val="20"/>
+                <w:lang w:val="en-US"/>
+              </w:rPr>
+              <w:t xml:space="preserve">/2021 </w:t>
+            </w:r>
+            <w:r>
+              <w:rPr>
+                <w:rFonts w:ascii="Palatino Linotype" w:hAnsi="Palatino Linotype" w:cs="Times New Roman"/>
+                <w:sz w:val="20"/>
+                <w:szCs w:val="20"/>
+              </w:rPr>
+              <w:t xml:space="preserve">– </w:t>
+            </w:r>
+            <w:r>
+              <w:rPr>
+                <w:rFonts w:ascii="Palatino Linotype" w:hAnsi="Palatino Linotype" w:cs="Times New Roman"/>
+                <w:sz w:val="20"/>
+                <w:szCs w:val="20"/>
+                <w:lang w:val="en-US"/>
+              </w:rPr>
+              <w:t>11/2021</w:t>
+            </w:r>
+            <w:r>
+              <w:rPr>
+                <w:rFonts w:ascii="Palatino Linotype" w:hAnsi="Palatino Linotype" w:cs="Times New Roman" w:hint="eastAsia"/>
+                <w:sz w:val="20"/>
+                <w:szCs w:val="20"/>
+                <w:lang w:val="en-US"/>
+              </w:rPr>
+              <w:t xml:space="preserve"> </w:t>
             </w:r>
           </w:p>
         </w:tc>
         <w:tc>
           <w:tcPr>
-            <w:tcW w:w="2572" w:type="dxa"/>
+            <w:tcW w:w="2561" w:type="dxa"/>
           </w:tcPr>
           <w:p>
             <w:pPr>
@@ -1116,19 +1135,29 @@
             </w:pPr>
             <w:r>
               <w:rPr>
-                <w:rFonts w:ascii="Palatino Linotype" w:hAnsi="Palatino Linotype" w:cs="Times New Roman" w:hint="eastAsia"/>
+                <w:rFonts w:ascii="Palatino Linotype" w:hAnsi="Palatino Linotype" w:cs="Times New Roman"/>
                 <w:bCs/>
                 <w:sz w:val="20"/>
                 <w:szCs w:val="20"/>
                 <w:lang w:val="en-US"/>
               </w:rPr>
-              <w:t>Ant Group</w:t>
+              <w:t xml:space="preserve">Alibaba DAMO </w:t>
+            </w:r>
+            <w:r>
+              <w:rPr>
+                <w:rFonts w:ascii="Palatino Linotype" w:hAnsi="Palatino Linotype" w:cs="Times New Roman"/>
+                <w:bCs/>
+                <w:sz w:val="20"/>
+                <w:szCs w:val="20"/>
+                <w:lang w:val="en-US"/>
+              </w:rPr>
+              <w:t>Academy</w:t>
             </w:r>
           </w:p>
         </w:tc>
         <w:tc>
           <w:tcPr>
-            <w:tcW w:w="5046" w:type="dxa"/>
+            <w:tcW w:w="5023" w:type="dxa"/>
           </w:tcPr>
           <w:p>
             <w:pPr>
@@ -1138,6 +1167,16 @@
                 <w:iCs/>
               </w:rPr>
             </w:pPr>
+            <w:r>
+              <w:rPr>
+                <w:rFonts w:ascii="Palatino Linotype" w:eastAsia="Palatino Linotype" w:hAnsi="Palatino Linotype" w:cs="Palatino Linotype"/>
+                <w:i/>
+                <w:iCs/>
+                <w:color w:val="000000"/>
+                <w:lang w:val="en-US" w:bidi="ar"/>
+              </w:rPr>
+              <w:t>R</w:t>
+            </w:r>
             <w:r>
               <w:rPr>
                 <w:rFonts w:ascii="Palatino Linotype" w:eastAsia="Palatino Linotype" w:hAnsi="Palatino Linotype" w:cs="Palatino Linotype"/>
@@ -1148,31 +1187,7 @@
                 <w:szCs w:val="19"/>
                 <w:lang w:val="en-US" w:bidi="ar"/>
               </w:rPr>
-              <w:t xml:space="preserve">Software Engineer Intern in Security </w:t>
-            </w:r>
-            <w:r>
-              <w:rPr>
-                <w:rFonts w:ascii="Palatino Linotype" w:eastAsia="Palatino Linotype" w:hAnsi="Palatino Linotype" w:cs="Palatino Linotype"/>
-                <w:i/>
-                <w:iCs/>
-                <w:color w:val="000000"/>
-                <w:sz w:val="19"/>
-                <w:szCs w:val="19"/>
-                <w:lang w:val="en-US" w:bidi="ar"/>
-              </w:rPr>
-              <w:t>G</w:t>
-            </w:r>
-            <w:r>
-              <w:rPr>
-                <w:rFonts w:ascii="Palatino Linotype" w:eastAsia="Palatino Linotype" w:hAnsi="Palatino Linotype" w:cs="Palatino Linotype"/>
-                <w:i/>
-                <w:iCs/>
-                <w:color w:val="000000"/>
-                <w:sz w:val="19"/>
-                <w:szCs w:val="19"/>
-                <w:lang w:val="en-US" w:bidi="ar"/>
-              </w:rPr>
-              <w:t>roup</w:t>
+              <w:t>esearch Intern in LLM Group</w:t>
             </w:r>
           </w:p>
         </w:tc>
@@ -1191,6 +1206,8 @@
           <w:szCs w:val="24"/>
         </w:rPr>
       </w:pPr>
+      <w:bookmarkStart w:id="3" w:name="OLE_LINK17"/>
+      <w:bookmarkStart w:id="4" w:name="OLE_LINK18"/>
       <w:r>
         <w:rPr>
           <w:rFonts w:ascii="Palatino Linotype" w:hAnsi="Palatino Linotype" w:cs="Times New Roman" w:hint="eastAsia"/>
@@ -1236,7 +1253,7 @@
       </w:pPr>
       <w:r>
         <w:rPr>
-          <w:rFonts w:ascii="Palatino Linotype" w:eastAsia="宋体" w:hAnsi="Palatino Linotype" w:hint="eastAsia"/>
+          <w:rFonts w:ascii="Palatino Linotype" w:eastAsia="SimSun" w:hAnsi="Palatino Linotype" w:hint="eastAsia"/>
           <w:bCs/>
           <w:sz w:val="20"/>
           <w:szCs w:val="20"/>
@@ -1256,28 +1273,37 @@
       </w:r>
       <w:r>
         <w:rPr>
-          <w:rFonts w:ascii="Palatino Linotype" w:eastAsia="宋体" w:hAnsi="Palatino Linotype"/>
-          <w:bCs/>
-          <w:sz w:val="20"/>
-          <w:szCs w:val="20"/>
+          <w:rFonts w:ascii="Palatino Linotype" w:hAnsi="Palatino Linotype"/>
+          <w:bCs/>
+          <w:i/>
+          <w:iCs/>
+          <w:sz w:val="20"/>
+          <w:szCs w:val="20"/>
+          <w:lang w:val="en-GB"/>
         </w:rPr>
         <w:t>SecureMind: A Framework for Benchmarking Large Language Models in</w:t>
       </w:r>
       <w:r>
         <w:rPr>
-          <w:rFonts w:ascii="Palatino Linotype" w:eastAsia="宋体" w:hAnsi="Palatino Linotype" w:hint="eastAsia"/>
-          <w:bCs/>
-          <w:sz w:val="20"/>
-          <w:szCs w:val="20"/>
+          <w:rFonts w:ascii="Palatino Linotype" w:hAnsi="Palatino Linotype" w:hint="eastAsia"/>
+          <w:bCs/>
+          <w:i/>
+          <w:iCs/>
+          <w:sz w:val="20"/>
+          <w:szCs w:val="20"/>
+          <w:lang w:val="en-GB"/>
         </w:rPr>
         <w:t xml:space="preserve"> </w:t>
       </w:r>
       <w:r>
         <w:rPr>
-          <w:rFonts w:ascii="Palatino Linotype" w:eastAsia="宋体" w:hAnsi="Palatino Linotype"/>
-          <w:bCs/>
-          <w:sz w:val="20"/>
-          <w:szCs w:val="20"/>
+          <w:rFonts w:ascii="Palatino Linotype" w:hAnsi="Palatino Linotype"/>
+          <w:bCs/>
+          <w:i/>
+          <w:iCs/>
+          <w:sz w:val="20"/>
+          <w:szCs w:val="20"/>
+          <w:lang w:val="en-GB"/>
         </w:rPr>
         <w:t>Bug Detection and Repair</w:t>
       </w:r>
@@ -1307,15 +1333,15 @@
         <w:spacing w:after="40"/>
         <w:ind w:left="410"/>
         <w:rPr>
-          <w:rFonts w:ascii="Palatino Linotype" w:eastAsia="宋体" w:hAnsi="Palatino Linotype"/>
-          <w:bCs/>
-          <w:sz w:val="20"/>
-          <w:szCs w:val="20"/>
-        </w:rPr>
-      </w:pPr>
-      <w:r>
-        <w:rPr>
-          <w:rFonts w:ascii="Palatino Linotype" w:eastAsia="宋体" w:hAnsi="Palatino Linotype" w:hint="eastAsia"/>
+          <w:rFonts w:ascii="Palatino Linotype" w:eastAsia="SimSun" w:hAnsi="Palatino Linotype"/>
+          <w:bCs/>
+          <w:sz w:val="20"/>
+          <w:szCs w:val="20"/>
+        </w:rPr>
+      </w:pPr>
+      <w:r>
+        <w:rPr>
+          <w:rFonts w:ascii="Palatino Linotype" w:eastAsia="SimSun" w:hAnsi="Palatino Linotype" w:hint="eastAsia"/>
           <w:b/>
           <w:sz w:val="20"/>
           <w:szCs w:val="20"/>
@@ -1324,7 +1350,7 @@
       </w:r>
       <w:r>
         <w:rPr>
-          <w:rFonts w:ascii="Palatino Linotype" w:eastAsia="宋体" w:hAnsi="Palatino Linotype" w:hint="eastAsia"/>
+          <w:rFonts w:ascii="Palatino Linotype" w:eastAsia="SimSun" w:hAnsi="Palatino Linotype" w:hint="eastAsia"/>
           <w:bCs/>
           <w:sz w:val="20"/>
           <w:szCs w:val="20"/>
@@ -1333,7 +1359,7 @@
       </w:r>
       <w:r>
         <w:rPr>
-          <w:rFonts w:ascii="Palatino Linotype" w:eastAsia="宋体" w:hAnsi="Palatino Linotype"/>
+          <w:rFonts w:ascii="Palatino Linotype" w:eastAsia="SimSun" w:hAnsi="Palatino Linotype"/>
           <w:bCs/>
           <w:sz w:val="20"/>
           <w:szCs w:val="20"/>
@@ -1343,7 +1369,7 @@
       </w:r>
       <w:r>
         <w:rPr>
-          <w:rFonts w:ascii="Palatino Linotype" w:eastAsia="宋体" w:hAnsi="Palatino Linotype"/>
+          <w:rFonts w:ascii="Palatino Linotype" w:eastAsia="SimSun" w:hAnsi="Palatino Linotype"/>
           <w:bCs/>
           <w:sz w:val="20"/>
           <w:szCs w:val="20"/>
@@ -1353,7 +1379,7 @@
       </w:r>
       <w:r>
         <w:rPr>
-          <w:rFonts w:ascii="Palatino Linotype" w:eastAsia="宋体" w:hAnsi="Palatino Linotype"/>
+          <w:rFonts w:ascii="Palatino Linotype" w:eastAsia="SimSun" w:hAnsi="Palatino Linotype"/>
           <w:bCs/>
           <w:sz w:val="20"/>
           <w:szCs w:val="20"/>
@@ -1363,7 +1389,7 @@
       </w:r>
       <w:r>
         <w:rPr>
-          <w:rFonts w:ascii="Palatino Linotype" w:eastAsia="宋体" w:hAnsi="Palatino Linotype" w:hint="eastAsia"/>
+          <w:rFonts w:ascii="Palatino Linotype" w:eastAsia="SimSun" w:hAnsi="Palatino Linotype" w:hint="eastAsia"/>
           <w:bCs/>
           <w:sz w:val="20"/>
           <w:szCs w:val="20"/>
@@ -1467,16 +1493,16 @@
         </w:tabs>
         <w:spacing w:after="40"/>
         <w:rPr>
-          <w:rFonts w:ascii="Palatino Linotype" w:eastAsia="宋体" w:hAnsi="Palatino Linotype"/>
-          <w:bCs/>
-          <w:sz w:val="20"/>
-          <w:szCs w:val="20"/>
-          <w:lang w:val="en-GB"/>
-        </w:rPr>
-      </w:pPr>
-      <w:r>
-        <w:rPr>
-          <w:rFonts w:ascii="Palatino Linotype" w:eastAsia="宋体" w:hAnsi="Palatino Linotype"/>
+          <w:rFonts w:ascii="Palatino Linotype" w:eastAsia="SimSun" w:hAnsi="Palatino Linotype"/>
+          <w:bCs/>
+          <w:sz w:val="20"/>
+          <w:szCs w:val="20"/>
+          <w:lang w:val="en-GB"/>
+        </w:rPr>
+      </w:pPr>
+      <w:r>
+        <w:rPr>
+          <w:rFonts w:ascii="Palatino Linotype" w:eastAsia="SimSun" w:hAnsi="Palatino Linotype"/>
           <w:bCs/>
           <w:sz w:val="20"/>
           <w:szCs w:val="20"/>
@@ -1485,16 +1511,19 @@
       </w:r>
       <w:r>
         <w:rPr>
-          <w:rFonts w:ascii="Palatino Linotype" w:eastAsia="宋体" w:hAnsi="Palatino Linotype"/>
-          <w:bCs/>
-          <w:sz w:val="20"/>
-          <w:szCs w:val="20"/>
+          <w:rFonts w:ascii="Palatino Linotype" w:hAnsi="Palatino Linotype"/>
+          <w:bCs/>
+          <w:i/>
+          <w:iCs/>
+          <w:sz w:val="20"/>
+          <w:szCs w:val="20"/>
+          <w:lang w:val="en-GB"/>
         </w:rPr>
         <w:t>Enhancing Deployment-Time Predictive Model Robustness for Code Analysis and Optimization</w:t>
       </w:r>
       <w:r>
         <w:rPr>
-          <w:rFonts w:ascii="Palatino Linotype" w:eastAsia="宋体" w:hAnsi="Palatino Linotype"/>
+          <w:rFonts w:ascii="Palatino Linotype" w:eastAsia="SimSun" w:hAnsi="Palatino Linotype"/>
           <w:bCs/>
           <w:sz w:val="20"/>
           <w:szCs w:val="20"/>
@@ -1517,15 +1546,15 @@
         <w:spacing w:after="40"/>
         <w:ind w:left="410"/>
         <w:rPr>
-          <w:rFonts w:ascii="Palatino Linotype" w:eastAsia="宋体" w:hAnsi="Palatino Linotype"/>
-          <w:bCs/>
-          <w:sz w:val="20"/>
-          <w:szCs w:val="20"/>
-        </w:rPr>
-      </w:pPr>
-      <w:r>
-        <w:rPr>
-          <w:rFonts w:ascii="Palatino Linotype" w:eastAsia="宋体" w:hAnsi="Palatino Linotype" w:hint="eastAsia"/>
+          <w:rFonts w:ascii="Palatino Linotype" w:eastAsia="SimSun" w:hAnsi="Palatino Linotype"/>
+          <w:bCs/>
+          <w:sz w:val="20"/>
+          <w:szCs w:val="20"/>
+        </w:rPr>
+      </w:pPr>
+      <w:r>
+        <w:rPr>
+          <w:rFonts w:ascii="Palatino Linotype" w:eastAsia="SimSun" w:hAnsi="Palatino Linotype" w:hint="eastAsia"/>
           <w:b/>
           <w:sz w:val="20"/>
           <w:szCs w:val="20"/>
@@ -1534,7 +1563,7 @@
       </w:r>
       <w:r>
         <w:rPr>
-          <w:rFonts w:ascii="Palatino Linotype" w:eastAsia="宋体" w:hAnsi="Palatino Linotype" w:hint="eastAsia"/>
+          <w:rFonts w:ascii="Palatino Linotype" w:eastAsia="SimSun" w:hAnsi="Palatino Linotype" w:hint="eastAsia"/>
           <w:bCs/>
           <w:sz w:val="20"/>
           <w:szCs w:val="20"/>
@@ -1709,7 +1738,7 @@
         </w:tabs>
         <w:spacing w:after="40"/>
         <w:rPr>
-          <w:rFonts w:ascii="Palatino Linotype" w:eastAsia="宋体" w:hAnsi="Palatino Linotype"/>
+          <w:rFonts w:ascii="Palatino Linotype" w:eastAsia="SimSun" w:hAnsi="Palatino Linotype"/>
           <w:bCs/>
           <w:i/>
           <w:iCs/>
@@ -1730,7 +1759,7 @@
       </w:r>
       <w:r>
         <w:rPr>
-          <w:rFonts w:ascii="Palatino Linotype" w:eastAsia="宋体" w:hAnsi="Palatino Linotype"/>
+          <w:rFonts w:ascii="Palatino Linotype" w:eastAsia="SimSun" w:hAnsi="Palatino Linotype"/>
           <w:bCs/>
           <w:sz w:val="20"/>
           <w:szCs w:val="20"/>
@@ -1773,7 +1802,7 @@
       </w:r>
       <w:r>
         <w:rPr>
-          <w:rFonts w:ascii="Palatino Linotype" w:eastAsia="宋体" w:hAnsi="Palatino Linotype" w:hint="eastAsia"/>
+          <w:rFonts w:ascii="Palatino Linotype" w:eastAsia="SimSun" w:hAnsi="Palatino Linotype" w:hint="eastAsia"/>
           <w:bCs/>
           <w:i/>
           <w:iCs/>
@@ -1829,7 +1858,7 @@
       </w:pPr>
       <w:r>
         <w:rPr>
-          <w:rFonts w:ascii="Palatino Linotype" w:eastAsia="宋体" w:hAnsi="Palatino Linotype" w:hint="eastAsia"/>
+          <w:rFonts w:ascii="Palatino Linotype" w:eastAsia="SimSun" w:hAnsi="Palatino Linotype" w:hint="eastAsia"/>
           <w:b/>
           <w:sz w:val="20"/>
           <w:szCs w:val="20"/>
@@ -1848,7 +1877,7 @@
       </w:r>
       <w:r>
         <w:rPr>
-          <w:rFonts w:ascii="Palatino Linotype" w:eastAsia="宋体" w:hAnsi="Palatino Linotype" w:hint="eastAsia"/>
+          <w:rFonts w:ascii="Palatino Linotype" w:eastAsia="SimSun" w:hAnsi="Palatino Linotype" w:hint="eastAsia"/>
           <w:b/>
           <w:sz w:val="20"/>
           <w:szCs w:val="20"/>
@@ -1857,12 +1886,30 @@
       </w:r>
       <w:r>
         <w:rPr>
-          <w:rFonts w:ascii="Palatino Linotype" w:eastAsia="宋体" w:hAnsi="Palatino Linotype" w:hint="eastAsia"/>
-          <w:bCs/>
-          <w:sz w:val="20"/>
-          <w:szCs w:val="20"/>
-        </w:rPr>
-        <w:t>Z. Tang, S. Chen, Jie. Wang, Y. Liu, H. Fang, C. Xia, Z. Wang,</w:t>
+          <w:rFonts w:ascii="Palatino Linotype" w:eastAsia="SimSun" w:hAnsi="Palatino Linotype" w:hint="eastAsia"/>
+          <w:bCs/>
+          <w:sz w:val="20"/>
+          <w:szCs w:val="20"/>
+        </w:rPr>
+        <w:t xml:space="preserve">Z. Tang, S. Chen, </w:t>
+      </w:r>
+      <w:r>
+        <w:rPr>
+          <w:rFonts w:ascii="Palatino Linotype" w:eastAsia="SimSun" w:hAnsi="Palatino Linotype"/>
+          <w:bCs/>
+          <w:sz w:val="20"/>
+          <w:szCs w:val="20"/>
+        </w:rPr>
+        <w:t>J.</w:t>
+      </w:r>
+      <w:r>
+        <w:rPr>
+          <w:rFonts w:ascii="Palatino Linotype" w:eastAsia="SimSun" w:hAnsi="Palatino Linotype" w:hint="eastAsia"/>
+          <w:bCs/>
+          <w:sz w:val="20"/>
+          <w:szCs w:val="20"/>
+        </w:rPr>
+        <w:t xml:space="preserve"> Wang, Y. Liu, H. Fang, C. Xia, Z. Wang,</w:t>
       </w:r>
       <w:r>
         <w:rPr>
@@ -1888,17 +1935,17 @@
         </w:tabs>
         <w:spacing w:after="40"/>
         <w:rPr>
-          <w:rFonts w:ascii="Palatino Linotype" w:eastAsia="宋体" w:hAnsi="Palatino Linotype"/>
-          <w:bCs/>
-          <w:i/>
-          <w:iCs/>
-          <w:sz w:val="20"/>
-          <w:szCs w:val="20"/>
-        </w:rPr>
-      </w:pPr>
-      <w:r>
-        <w:rPr>
-          <w:rFonts w:ascii="Palatino Linotype" w:eastAsia="宋体" w:hAnsi="Palatino Linotype" w:hint="eastAsia"/>
+          <w:rFonts w:ascii="Palatino Linotype" w:eastAsia="SimSun" w:hAnsi="Palatino Linotype"/>
+          <w:bCs/>
+          <w:i/>
+          <w:iCs/>
+          <w:sz w:val="20"/>
+          <w:szCs w:val="20"/>
+        </w:rPr>
+      </w:pPr>
+      <w:r>
+        <w:rPr>
+          <w:rFonts w:ascii="Palatino Linotype" w:eastAsia="SimSun" w:hAnsi="Palatino Linotype" w:hint="eastAsia"/>
           <w:b/>
           <w:i/>
           <w:iCs/>
@@ -1921,7 +1968,7 @@
       </w:r>
       <w:r>
         <w:rPr>
-          <w:rFonts w:ascii="Palatino Linotype" w:eastAsia="宋体" w:hAnsi="Palatino Linotype" w:hint="eastAsia"/>
+          <w:rFonts w:ascii="Palatino Linotype" w:eastAsia="SimSun" w:hAnsi="Palatino Linotype" w:hint="eastAsia"/>
           <w:b/>
           <w:i/>
           <w:iCs/>
@@ -1932,7 +1979,7 @@
       </w:r>
       <w:r>
         <w:rPr>
-          <w:rFonts w:ascii="Palatino Linotype" w:eastAsia="宋体" w:hAnsi="Palatino Linotype" w:hint="eastAsia"/>
+          <w:rFonts w:ascii="Palatino Linotype" w:eastAsia="SimSun" w:hAnsi="Palatino Linotype" w:hint="eastAsia"/>
           <w:bCs/>
           <w:i/>
           <w:iCs/>
@@ -1964,7 +2011,7 @@
       </w:pPr>
       <w:r>
         <w:rPr>
-          <w:rFonts w:ascii="Palatino Linotype" w:eastAsia="宋体" w:hAnsi="Palatino Linotype" w:hint="eastAsia"/>
+          <w:rFonts w:ascii="Palatino Linotype" w:eastAsia="SimSun" w:hAnsi="Palatino Linotype" w:hint="eastAsia"/>
           <w:bCs/>
           <w:i/>
           <w:iCs/>
@@ -1987,7 +2034,7 @@
       </w:r>
       <w:r>
         <w:rPr>
-          <w:rFonts w:ascii="Palatino Linotype" w:eastAsia="宋体" w:hAnsi="Palatino Linotype" w:hint="eastAsia"/>
+          <w:rFonts w:ascii="Palatino Linotype" w:eastAsia="SimSun" w:hAnsi="Palatino Linotype" w:hint="eastAsia"/>
           <w:b/>
           <w:i/>
           <w:iCs/>
@@ -2022,7 +2069,7 @@
         </w:tabs>
         <w:spacing w:after="40"/>
         <w:rPr>
-          <w:rFonts w:ascii="Palatino Linotype" w:eastAsia="宋体" w:hAnsi="Palatino Linotype"/>
+          <w:rFonts w:ascii="Palatino Linotype" w:eastAsia="SimSun" w:hAnsi="Palatino Linotype"/>
           <w:bCs/>
           <w:i/>
           <w:iCs/>
@@ -2043,7 +2090,7 @@
       </w:r>
       <w:r>
         <w:rPr>
-          <w:rFonts w:ascii="Palatino Linotype" w:eastAsia="宋体" w:hAnsi="Palatino Linotype"/>
+          <w:rFonts w:ascii="Palatino Linotype" w:eastAsia="SimSun" w:hAnsi="Palatino Linotype"/>
           <w:bCs/>
           <w:sz w:val="20"/>
           <w:szCs w:val="20"/>
@@ -2110,16 +2157,16 @@
         </w:tabs>
         <w:spacing w:after="40"/>
         <w:rPr>
-          <w:rFonts w:ascii="Palatino Linotype" w:eastAsia="宋体" w:hAnsi="Palatino Linotype"/>
-          <w:b/>
-          <w:sz w:val="20"/>
-          <w:szCs w:val="20"/>
-          <w:lang w:val="en-GB"/>
-        </w:rPr>
-      </w:pPr>
-      <w:r>
-        <w:rPr>
-          <w:rFonts w:ascii="Palatino Linotype" w:eastAsia="宋体" w:hAnsi="Palatino Linotype" w:hint="eastAsia"/>
+          <w:rFonts w:ascii="Palatino Linotype" w:eastAsia="SimSun" w:hAnsi="Palatino Linotype"/>
+          <w:b/>
+          <w:sz w:val="20"/>
+          <w:szCs w:val="20"/>
+          <w:lang w:val="en-GB"/>
+        </w:rPr>
+      </w:pPr>
+      <w:r>
+        <w:rPr>
+          <w:rFonts w:ascii="Palatino Linotype" w:eastAsia="SimSun" w:hAnsi="Palatino Linotype" w:hint="eastAsia"/>
           <w:b/>
           <w:sz w:val="20"/>
           <w:szCs w:val="20"/>
@@ -2138,7 +2185,7 @@
       </w:r>
       <w:r>
         <w:rPr>
-          <w:rFonts w:ascii="Palatino Linotype" w:eastAsia="宋体" w:hAnsi="Palatino Linotype" w:hint="eastAsia"/>
+          <w:rFonts w:ascii="Palatino Linotype" w:eastAsia="SimSun" w:hAnsi="Palatino Linotype" w:hint="eastAsia"/>
           <w:bCs/>
           <w:sz w:val="20"/>
           <w:szCs w:val="20"/>
@@ -2180,7 +2227,7 @@
       </w:pPr>
       <w:r>
         <w:rPr>
-          <w:rFonts w:ascii="Palatino Linotype" w:eastAsia="宋体" w:hAnsi="Palatino Linotype" w:hint="eastAsia"/>
+          <w:rFonts w:ascii="Palatino Linotype" w:eastAsia="SimSun" w:hAnsi="Palatino Linotype" w:hint="eastAsia"/>
           <w:b/>
           <w:i/>
           <w:iCs/>
@@ -2203,7 +2250,7 @@
       </w:r>
       <w:r>
         <w:rPr>
-          <w:rFonts w:ascii="Palatino Linotype" w:eastAsia="宋体" w:hAnsi="Palatino Linotype" w:hint="eastAsia"/>
+          <w:rFonts w:ascii="Palatino Linotype" w:eastAsia="SimSun" w:hAnsi="Palatino Linotype" w:hint="eastAsia"/>
           <w:b/>
           <w:i/>
           <w:iCs/>
@@ -2237,7 +2284,7 @@
       </w:pPr>
       <w:r>
         <w:rPr>
-          <w:rFonts w:ascii="Palatino Linotype" w:eastAsia="宋体" w:hAnsi="Palatino Linotype" w:hint="eastAsia"/>
+          <w:rFonts w:ascii="Palatino Linotype" w:eastAsia="SimSun" w:hAnsi="Palatino Linotype" w:hint="eastAsia"/>
           <w:bCs/>
           <w:i/>
           <w:iCs/>
@@ -2272,7 +2319,7 @@
         </w:tabs>
         <w:spacing w:after="40"/>
         <w:rPr>
-          <w:rFonts w:ascii="Palatino Linotype" w:eastAsia="宋体" w:hAnsi="Palatino Linotype"/>
+          <w:rFonts w:ascii="Palatino Linotype" w:eastAsia="SimSun" w:hAnsi="Palatino Linotype"/>
           <w:bCs/>
           <w:i/>
           <w:iCs/>
@@ -2293,7 +2340,7 @@
       </w:r>
       <w:r>
         <w:rPr>
-          <w:rFonts w:ascii="Palatino Linotype" w:eastAsia="宋体" w:hAnsi="Palatino Linotype"/>
+          <w:rFonts w:ascii="Palatino Linotype" w:eastAsia="SimSun" w:hAnsi="Palatino Linotype"/>
           <w:bCs/>
           <w:sz w:val="20"/>
           <w:szCs w:val="20"/>
@@ -2360,7 +2407,7 @@
         </w:tabs>
         <w:spacing w:after="40"/>
         <w:rPr>
-          <w:rFonts w:ascii="Palatino Linotype" w:eastAsia="宋体" w:hAnsi="Palatino Linotype"/>
+          <w:rFonts w:ascii="Palatino Linotype" w:eastAsia="SimSun" w:hAnsi="Palatino Linotype"/>
           <w:b/>
           <w:sz w:val="20"/>
           <w:szCs w:val="20"/>
@@ -2369,7 +2416,7 @@
       </w:pPr>
       <w:r>
         <w:rPr>
-          <w:rFonts w:ascii="Palatino Linotype" w:eastAsia="宋体" w:hAnsi="Palatino Linotype" w:hint="eastAsia"/>
+          <w:rFonts w:ascii="Palatino Linotype" w:eastAsia="SimSun" w:hAnsi="Palatino Linotype" w:hint="eastAsia"/>
           <w:b/>
           <w:sz w:val="20"/>
           <w:szCs w:val="20"/>
@@ -2431,7 +2478,7 @@
       </w:pPr>
       <w:r>
         <w:rPr>
-          <w:rFonts w:ascii="Palatino Linotype" w:eastAsia="宋体" w:hAnsi="Palatino Linotype" w:hint="eastAsia"/>
+          <w:rFonts w:ascii="Palatino Linotype" w:eastAsia="SimSun" w:hAnsi="Palatino Linotype" w:hint="eastAsia"/>
           <w:b/>
           <w:i/>
           <w:iCs/>
@@ -2455,7 +2502,7 @@
       </w:r>
       <w:r>
         <w:rPr>
-          <w:rFonts w:ascii="Palatino Linotype" w:eastAsia="宋体" w:hAnsi="Palatino Linotype" w:hint="eastAsia"/>
+          <w:rFonts w:ascii="Palatino Linotype" w:eastAsia="SimSun" w:hAnsi="Palatino Linotype" w:hint="eastAsia"/>
           <w:b/>
           <w:i/>
           <w:iCs/>
@@ -2478,7 +2525,7 @@
       </w:r>
       <w:r>
         <w:rPr>
-          <w:rFonts w:ascii="Palatino Linotype" w:eastAsia="宋体" w:hAnsi="Palatino Linotype" w:hint="eastAsia"/>
+          <w:rFonts w:ascii="Palatino Linotype" w:eastAsia="SimSun" w:hAnsi="Palatino Linotype" w:hint="eastAsia"/>
           <w:b/>
           <w:i/>
           <w:iCs/>
@@ -2502,7 +2549,7 @@
         <w:spacing w:after="40"/>
         <w:ind w:left="410"/>
         <w:rPr>
-          <w:rFonts w:ascii="宋体" w:eastAsia="宋体" w:hAnsi="宋体" w:cs="宋体"/>
+          <w:rFonts w:ascii="SimSun" w:eastAsia="SimSun" w:hAnsi="SimSun" w:cs="SimSun"/>
           <w:b/>
           <w:i/>
           <w:iCs/>
@@ -2573,7 +2620,7 @@
       </w:r>
       <w:r>
         <w:rPr>
-          <w:rFonts w:ascii="宋体" w:eastAsia="宋体" w:hAnsi="宋体" w:cs="宋体"/>
+          <w:rFonts w:ascii="SimSun" w:eastAsia="SimSun" w:hAnsi="SimSun" w:cs="SimSun"/>
           <w:b/>
           <w:i/>
           <w:iCs/>
@@ -2767,7 +2814,25 @@
           <w:sz w:val="20"/>
           <w:szCs w:val="20"/>
         </w:rPr>
-        <w:t>AI; Deep/Reinforcement Learning; Software Security; Code Optimization; Python; C++; Pytorch/Tensorflow;</w:t>
+        <w:t>AI; Deep/Reinforcement Learning; Software Security; Code Optimization; Python; C++; Py</w:t>
+      </w:r>
+      <w:r>
+        <w:rPr>
+          <w:rFonts w:ascii="Palatino Linotype" w:eastAsiaTheme="minorEastAsia" w:hAnsi="Palatino Linotype"/>
+          <w:iCs/>
+          <w:sz w:val="20"/>
+          <w:szCs w:val="20"/>
+        </w:rPr>
+        <w:t>Torch/TensorF</w:t>
+      </w:r>
+      <w:r>
+        <w:rPr>
+          <w:rFonts w:ascii="Palatino Linotype" w:eastAsiaTheme="minorEastAsia" w:hAnsi="Palatino Linotype" w:hint="eastAsia"/>
+          <w:iCs/>
+          <w:sz w:val="20"/>
+          <w:szCs w:val="20"/>
+        </w:rPr>
+        <w:t>low;</w:t>
       </w:r>
     </w:p>
     <w:p>
@@ -2882,6 +2947,7 @@
           <w:rFonts w:ascii="Palatino Linotype" w:hAnsi="Palatino Linotype" w:cs="Times New Roman"/>
           <w:sz w:val="20"/>
           <w:szCs w:val="20"/>
+          <w:lang w:val="en-US"/>
         </w:rPr>
       </w:pPr>
       <w:r>
@@ -2891,25 +2957,105 @@
           <w:szCs w:val="20"/>
           <w:lang w:val="en-US"/>
         </w:rPr>
-        <w:t>2025</w:t>
-      </w:r>
-      <w:r>
-        <w:rPr>
-          <w:rFonts w:ascii="Palatino Linotype" w:hAnsi="Palatino Linotype" w:cs="Times New Roman"/>
+        <w:t>CGO</w:t>
+      </w:r>
+      <w:r>
+        <w:rPr>
+          <w:rFonts w:ascii="Palatino Linotype" w:hAnsi="Palatino Linotype" w:cs="Times New Roman"/>
+          <w:sz w:val="20"/>
+          <w:szCs w:val="20"/>
+        </w:rPr>
+        <w:t xml:space="preserve"> </w:t>
+      </w:r>
+      <w:r>
+        <w:rPr>
+          <w:rFonts w:ascii="Palatino Linotype" w:hAnsi="Palatino Linotype" w:cs="Times New Roman"/>
+          <w:b/>
+          <w:bCs/>
+          <w:sz w:val="20"/>
+          <w:szCs w:val="20"/>
+        </w:rPr>
+        <w:t>Distinguished Paper Award</w:t>
+      </w:r>
+      <w:bookmarkStart w:id="6" w:name="OLE_LINK1"/>
+      <w:r>
+        <w:rPr>
+          <w:rFonts w:ascii="Palatino Linotype" w:hAnsi="Palatino Linotype" w:cs="Times New Roman"/>
+          <w:sz w:val="20"/>
+          <w:szCs w:val="20"/>
+        </w:rPr>
+        <w:t xml:space="preserve">; </w:t>
+      </w:r>
+      <w:bookmarkEnd w:id="6"/>
+      <w:r>
+        <w:rPr>
+          <w:rFonts w:ascii="Palatino Linotype" w:hAnsi="Palatino Linotype" w:cs="Times New Roman" w:hint="eastAsia"/>
+          <w:b/>
+          <w:bCs/>
+          <w:sz w:val="20"/>
+          <w:szCs w:val="20"/>
+        </w:rPr>
+        <w:t xml:space="preserve">ICURe Award </w:t>
+      </w:r>
+      <w:r>
+        <w:rPr>
+          <w:rFonts w:ascii="Palatino Linotype" w:hAnsi="Palatino Linotype" w:cs="Times New Roman"/>
+          <w:b/>
+          <w:bCs/>
+          <w:sz w:val="20"/>
+          <w:szCs w:val="20"/>
+        </w:rPr>
+        <w:t>(£</w:t>
+      </w:r>
+      <w:r>
+        <w:rPr>
+          <w:rFonts w:ascii="Palatino Linotype" w:hAnsi="Palatino Linotype" w:cs="Times New Roman" w:hint="eastAsia"/>
+          <w:b/>
+          <w:bCs/>
+          <w:sz w:val="20"/>
+          <w:szCs w:val="20"/>
+        </w:rPr>
+        <w:t>2.5K</w:t>
+      </w:r>
+      <w:r>
+        <w:rPr>
+          <w:rFonts w:ascii="Palatino Linotype" w:hAnsi="Palatino Linotype" w:cs="Times New Roman"/>
+          <w:b/>
+          <w:bCs/>
+          <w:sz w:val="20"/>
+          <w:szCs w:val="20"/>
+        </w:rPr>
+        <w:t>)</w:t>
+      </w:r>
+      <w:r>
+        <w:rPr>
+          <w:rFonts w:ascii="Palatino Linotype" w:hAnsi="Palatino Linotype" w:cs="Times New Roman" w:hint="eastAsia"/>
+          <w:b/>
+          <w:bCs/>
+          <w:sz w:val="20"/>
+          <w:szCs w:val="20"/>
+        </w:rPr>
+        <w:t xml:space="preserve">; </w:t>
+      </w:r>
+      <w:r>
+        <w:rPr>
+          <w:rFonts w:ascii="Palatino Linotype" w:hAnsi="Palatino Linotype" w:cs="Times New Roman" w:hint="eastAsia"/>
           <w:sz w:val="20"/>
           <w:szCs w:val="20"/>
           <w:lang w:val="en-US"/>
         </w:rPr>
-        <w:tab/>
-      </w:r>
-      <w:r>
-        <w:rPr>
-          <w:rFonts w:ascii="Palatino Linotype" w:hAnsi="Palatino Linotype" w:cs="Times New Roman"/>
+        <w:t xml:space="preserve">AI </w:t>
+      </w:r>
+      <w:r>
+        <w:rPr>
+          <w:rFonts w:ascii="Palatino Linotype" w:hAnsi="Palatino Linotype" w:cs="Times New Roman"/>
+          <w:b/>
+          <w:bCs/>
           <w:sz w:val="20"/>
           <w:szCs w:val="20"/>
           <w:lang w:val="en-US"/>
         </w:rPr>
-        <w:tab/>
+        <w:t>SuperConnector</w:t>
       </w:r>
       <w:r>
         <w:rPr>
@@ -2918,171 +3064,113 @@
           <w:szCs w:val="20"/>
           <w:lang w:val="en-US"/>
         </w:rPr>
-        <w:tab/>
+        <w:t xml:space="preserve"> </w:t>
+      </w:r>
+      <w:r>
+        <w:rPr>
+          <w:rFonts w:ascii="Palatino Linotype" w:hAnsi="Palatino Linotype" w:cs="Times New Roman"/>
+          <w:b/>
+          <w:bCs/>
+          <w:sz w:val="20"/>
+          <w:szCs w:val="20"/>
+          <w:lang w:val="en-US"/>
+        </w:rPr>
+        <w:t>Award</w:t>
       </w:r>
       <w:r>
         <w:rPr>
           <w:rFonts w:ascii="Palatino Linotype" w:hAnsi="Palatino Linotype" w:cs="Times New Roman" w:hint="eastAsia"/>
+          <w:b/>
+          <w:bCs/>
           <w:sz w:val="20"/>
           <w:szCs w:val="20"/>
           <w:lang w:val="en-US"/>
         </w:rPr>
-        <w:t>CGO</w:t>
-      </w:r>
-      <w:r>
-        <w:rPr>
-          <w:rFonts w:ascii="Palatino Linotype" w:hAnsi="Palatino Linotype" w:cs="Times New Roman"/>
-          <w:sz w:val="20"/>
-          <w:szCs w:val="20"/>
-        </w:rPr>
         <w:t xml:space="preserve"> </w:t>
       </w:r>
-      <w:r>
-        <w:rPr>
-          <w:rFonts w:ascii="Palatino Linotype" w:hAnsi="Palatino Linotype" w:cs="Times New Roman"/>
-          <w:b/>
-          <w:bCs/>
-          <w:sz w:val="20"/>
-          <w:szCs w:val="20"/>
-        </w:rPr>
-        <w:t>Distinguished Paper Award</w:t>
-      </w:r>
-      <w:r>
-        <w:rPr>
-          <w:rFonts w:ascii="Palatino Linotype" w:hAnsi="Palatino Linotype" w:cs="Times New Roman"/>
-          <w:sz w:val="20"/>
-          <w:szCs w:val="20"/>
-        </w:rPr>
-        <w:t xml:space="preserve">; CGO </w:t>
-      </w:r>
-      <w:r>
-        <w:rPr>
-          <w:rFonts w:ascii="Palatino Linotype" w:hAnsi="Palatino Linotype" w:cs="Times New Roman"/>
-          <w:b/>
-          <w:bCs/>
-          <w:sz w:val="20"/>
-          <w:szCs w:val="20"/>
-        </w:rPr>
-        <w:t>Travel Grant</w:t>
+      <w:bookmarkStart w:id="7" w:name="OLE_LINK5"/>
+      <w:r>
+        <w:rPr>
+          <w:rFonts w:ascii="Palatino Linotype" w:hAnsi="Palatino Linotype" w:cs="Times New Roman"/>
+          <w:b/>
+          <w:bCs/>
+          <w:sz w:val="20"/>
+          <w:szCs w:val="20"/>
+        </w:rPr>
+        <w:t>(£20K &amp; $25K)</w:t>
+      </w:r>
+      <w:bookmarkEnd w:id="7"/>
+      <w:r>
+        <w:rPr>
+          <w:rFonts w:ascii="Cambria" w:hAnsi="Cambria" w:cs="Times New Roman" w:hint="eastAsia"/>
+          <w:b/>
+          <w:bCs/>
+          <w:sz w:val="20"/>
+          <w:szCs w:val="20"/>
+        </w:rPr>
+        <w:t xml:space="preserve">; </w:t>
+      </w:r>
+      <w:r>
+        <w:rPr>
+          <w:rFonts w:ascii="Palatino Linotype" w:hAnsi="Palatino Linotype" w:cs="Times New Roman" w:hint="eastAsia"/>
+          <w:sz w:val="20"/>
+          <w:szCs w:val="20"/>
+          <w:lang w:val="en-US"/>
+        </w:rPr>
+        <w:t xml:space="preserve">MITACS Globalink </w:t>
+      </w:r>
+      <w:r>
+        <w:rPr>
+          <w:rFonts w:ascii="Palatino Linotype" w:hAnsi="Palatino Linotype" w:cs="Times New Roman" w:hint="eastAsia"/>
+          <w:b/>
+          <w:bCs/>
+          <w:sz w:val="20"/>
+          <w:szCs w:val="20"/>
+          <w:lang w:val="en-US"/>
+        </w:rPr>
+        <w:t>Research Award</w:t>
+      </w:r>
+      <w:r>
+        <w:rPr>
+          <w:rFonts w:ascii="Palatino Linotype" w:hAnsi="Palatino Linotype" w:cs="Times New Roman"/>
+          <w:b/>
+          <w:bCs/>
+          <w:sz w:val="20"/>
+          <w:szCs w:val="20"/>
+          <w:lang w:val="en-US"/>
+        </w:rPr>
+        <w:t xml:space="preserve"> ($60K)</w:t>
+      </w:r>
+      <w:r>
+        <w:rPr>
+          <w:rFonts w:ascii="Palatino Linotype" w:hAnsi="Palatino Linotype" w:cs="Times New Roman"/>
+          <w:sz w:val="20"/>
+          <w:szCs w:val="20"/>
+          <w:lang w:val="en-US"/>
+        </w:rPr>
+        <w:t>;</w:t>
+      </w:r>
+      <w:r>
+        <w:rPr>
+          <w:rFonts w:ascii="Palatino Linotype" w:hAnsi="Palatino Linotype" w:cs="Times New Roman"/>
+          <w:sz w:val="20"/>
+          <w:szCs w:val="20"/>
+          <w:lang w:val="en-US"/>
+        </w:rPr>
+        <w:t xml:space="preserve"> </w:t>
       </w:r>
     </w:p>
     <w:p>
       <w:pPr>
         <w:spacing w:before="120"/>
         <w:rPr>
-          <w:rFonts w:ascii="Palatino Linotype" w:hAnsi="Palatino Linotype" w:cs="Times New Roman"/>
-          <w:b/>
-          <w:bCs/>
-          <w:sz w:val="20"/>
-          <w:szCs w:val="20"/>
-        </w:rPr>
-      </w:pPr>
-      <w:r>
-        <w:rPr>
-          <w:rFonts w:ascii="Palatino Linotype" w:hAnsi="Palatino Linotype" w:cs="Times New Roman" w:hint="eastAsia"/>
-          <w:sz w:val="20"/>
-          <w:szCs w:val="20"/>
-          <w:lang w:val="en-US"/>
-        </w:rPr>
-        <w:t>202</w:t>
-      </w:r>
-      <w:r>
-        <w:rPr>
-          <w:rFonts w:ascii="Palatino Linotype" w:hAnsi="Palatino Linotype" w:cs="Times New Roman"/>
-          <w:sz w:val="20"/>
-          <w:szCs w:val="20"/>
-          <w:lang w:val="en-US"/>
-        </w:rPr>
-        <w:t>4</w:t>
-      </w:r>
-      <w:r>
-        <w:rPr>
-          <w:rFonts w:ascii="Palatino Linotype" w:hAnsi="Palatino Linotype" w:cs="Times New Roman" w:hint="eastAsia"/>
-          <w:sz w:val="20"/>
-          <w:szCs w:val="20"/>
-          <w:lang w:val="en-US"/>
-        </w:rPr>
-        <w:tab/>
-      </w:r>
-      <w:r>
-        <w:rPr>
-          <w:rFonts w:ascii="Palatino Linotype" w:hAnsi="Palatino Linotype" w:cs="Times New Roman" w:hint="eastAsia"/>
-          <w:sz w:val="20"/>
-          <w:szCs w:val="20"/>
-          <w:lang w:val="en-US"/>
-        </w:rPr>
-        <w:tab/>
-      </w:r>
-      <w:r>
-        <w:rPr>
-          <w:rFonts w:ascii="Palatino Linotype" w:hAnsi="Palatino Linotype" w:cs="Times New Roman" w:hint="eastAsia"/>
-          <w:sz w:val="20"/>
-          <w:szCs w:val="20"/>
-          <w:lang w:val="en-US"/>
-        </w:rPr>
-        <w:tab/>
-      </w:r>
-      <w:r>
-        <w:rPr>
-          <w:rFonts w:ascii="Palatino Linotype" w:hAnsi="Palatino Linotype" w:cs="Times New Roman" w:hint="eastAsia"/>
-          <w:sz w:val="20"/>
-          <w:szCs w:val="20"/>
-          <w:lang w:val="en-US"/>
-        </w:rPr>
-        <w:t xml:space="preserve">AI </w:t>
-      </w:r>
-      <w:r>
-        <w:rPr>
-          <w:rFonts w:ascii="Palatino Linotype" w:hAnsi="Palatino Linotype" w:cs="Times New Roman"/>
-          <w:b/>
-          <w:bCs/>
-          <w:sz w:val="20"/>
-          <w:szCs w:val="20"/>
-          <w:lang w:val="en-US"/>
-        </w:rPr>
-        <w:t>SuperConnector</w:t>
-      </w:r>
-      <w:r>
-        <w:rPr>
-          <w:rFonts w:ascii="Palatino Linotype" w:hAnsi="Palatino Linotype" w:cs="Times New Roman"/>
-          <w:sz w:val="20"/>
-          <w:szCs w:val="20"/>
-          <w:lang w:val="en-US"/>
-        </w:rPr>
-        <w:t xml:space="preserve"> </w:t>
-      </w:r>
-      <w:r>
-        <w:rPr>
-          <w:rFonts w:ascii="Palatino Linotype" w:hAnsi="Palatino Linotype" w:cs="Times New Roman"/>
-          <w:b/>
-          <w:bCs/>
-          <w:sz w:val="20"/>
-          <w:szCs w:val="20"/>
-          <w:lang w:val="en-US"/>
-        </w:rPr>
-        <w:t>Award</w:t>
-      </w:r>
-      <w:r>
-        <w:rPr>
-          <w:rFonts w:ascii="Palatino Linotype" w:hAnsi="Palatino Linotype" w:cs="Times New Roman" w:hint="eastAsia"/>
-          <w:b/>
-          <w:bCs/>
-          <w:sz w:val="20"/>
-          <w:szCs w:val="20"/>
-          <w:lang w:val="en-US"/>
-        </w:rPr>
-        <w:t xml:space="preserve"> </w:t>
-      </w:r>
-      <w:r>
-        <w:rPr>
-          <w:rFonts w:ascii="Palatino Linotype" w:hAnsi="Palatino Linotype" w:cs="Times New Roman"/>
-          <w:b/>
-          <w:bCs/>
-          <w:sz w:val="20"/>
-          <w:szCs w:val="20"/>
-        </w:rPr>
-        <w:t>(£20K &amp; $25K)</w:t>
-      </w:r>
+          <w:rFonts w:ascii="Cambria" w:hAnsi="Cambria" w:cs="Times New Roman" w:hint="eastAsia"/>
+          <w:b/>
+          <w:bCs/>
+          <w:sz w:val="20"/>
+          <w:szCs w:val="20"/>
+        </w:rPr>
+      </w:pPr>
     </w:p>
     <w:p>
       <w:pPr>
@@ -3094,140 +3182,78 @@
           <w:lang w:val="en-US"/>
         </w:rPr>
       </w:pPr>
-      <w:r>
-        <w:rPr>
-          <w:rFonts w:ascii="Palatino Linotype" w:hAnsi="Palatino Linotype" w:cs="Times New Roman" w:hint="eastAsia"/>
-          <w:sz w:val="20"/>
-          <w:szCs w:val="20"/>
-          <w:lang w:val="en-US"/>
-        </w:rPr>
-        <w:t>2023</w:t>
-      </w:r>
-      <w:r>
-        <w:rPr>
-          <w:rFonts w:ascii="Palatino Linotype" w:hAnsi="Palatino Linotype" w:cs="Times New Roman"/>
-          <w:b/>
-          <w:bCs/>
-          <w:sz w:val="20"/>
-          <w:szCs w:val="20"/>
-          <w:lang w:val="en-US"/>
-        </w:rPr>
-        <w:tab/>
-      </w:r>
-      <w:r>
-        <w:rPr>
-          <w:rFonts w:ascii="Palatino Linotype" w:hAnsi="Palatino Linotype" w:cs="Times New Roman"/>
-          <w:b/>
-          <w:bCs/>
-          <w:sz w:val="20"/>
-          <w:szCs w:val="20"/>
-          <w:lang w:val="en-US"/>
-        </w:rPr>
-        <w:tab/>
-      </w:r>
-      <w:r>
-        <w:rPr>
-          <w:rFonts w:ascii="Palatino Linotype" w:hAnsi="Palatino Linotype" w:cs="Times New Roman"/>
-          <w:b/>
-          <w:bCs/>
-          <w:sz w:val="20"/>
-          <w:szCs w:val="20"/>
-          <w:lang w:val="en-US"/>
-        </w:rPr>
-        <w:tab/>
-      </w:r>
-      <w:r>
-        <w:rPr>
-          <w:rFonts w:ascii="Palatino Linotype" w:hAnsi="Palatino Linotype" w:cs="Times New Roman" w:hint="eastAsia"/>
-          <w:sz w:val="20"/>
-          <w:szCs w:val="20"/>
-          <w:lang w:val="en-US"/>
-        </w:rPr>
-        <w:t xml:space="preserve">MITACS Globalink </w:t>
-      </w:r>
-      <w:r>
-        <w:rPr>
-          <w:rFonts w:ascii="Palatino Linotype" w:hAnsi="Palatino Linotype" w:cs="Times New Roman" w:hint="eastAsia"/>
-          <w:b/>
-          <w:bCs/>
-          <w:sz w:val="20"/>
-          <w:szCs w:val="20"/>
-          <w:lang w:val="en-US"/>
-        </w:rPr>
-        <w:t>Research Award</w:t>
-      </w:r>
-      <w:r>
-        <w:rPr>
-          <w:rFonts w:ascii="Palatino Linotype" w:hAnsi="Palatino Linotype" w:cs="Times New Roman"/>
-          <w:b/>
-          <w:bCs/>
-          <w:sz w:val="20"/>
-          <w:szCs w:val="20"/>
-          <w:lang w:val="en-US"/>
-        </w:rPr>
-        <w:t xml:space="preserve"> ($60K)</w:t>
-      </w:r>
-      <w:r>
-        <w:rPr>
-          <w:rFonts w:ascii="Palatino Linotype" w:hAnsi="Palatino Linotype" w:cs="Times New Roman"/>
-          <w:sz w:val="20"/>
-          <w:szCs w:val="20"/>
-          <w:lang w:val="en-US"/>
-        </w:rPr>
-        <w:t>;</w:t>
-      </w:r>
-      <w:r>
-        <w:rPr>
-          <w:rFonts w:ascii="Palatino Linotype" w:hAnsi="Palatino Linotype" w:cs="Times New Roman"/>
-          <w:sz w:val="20"/>
-          <w:szCs w:val="20"/>
-          <w:lang w:val="en-US"/>
-        </w:rPr>
-        <w:t xml:space="preserve"> </w:t>
+      <w:bookmarkStart w:id="8" w:name="OLE_LINK6"/>
+      <w:r>
+        <w:rPr>
+          <w:rFonts w:ascii="Palatino Linotype" w:hAnsi="Palatino Linotype" w:cs="Times New Roman"/>
+          <w:b/>
+          <w:bCs/>
+          <w:sz w:val="24"/>
+          <w:szCs w:val="24"/>
+        </w:rPr>
+        <w:lastRenderedPageBreak/>
+        <w:t>Research Experience</w:t>
+      </w:r>
+    </w:p>
+    <w:bookmarkEnd w:id="8"/>
+    <w:p>
+      <w:pPr>
+        <w:jc w:val="both"/>
+        <w:rPr>
+          <w:rFonts w:ascii="Palatino Linotype" w:hAnsi="Palatino Linotype"/>
+          <w:color w:val="000000"/>
+          <w:sz w:val="20"/>
+          <w:szCs w:val="20"/>
+        </w:rPr>
+      </w:pPr>
+      <w:r>
+        <w:rPr>
+          <w:rFonts w:ascii="Palatino Linotype" w:hAnsi="Palatino Linotype"/>
+          <w:color w:val="000000"/>
+          <w:sz w:val="20"/>
+          <w:szCs w:val="20"/>
+        </w:rPr>
+        <w:t>My research experience lies in the code analysis (Software Security) and code optimization using machine learning (ML) techniques. The following summarizes my projects, organized by research direction:</w:t>
       </w:r>
     </w:p>
     <w:p>
       <w:pPr>
-        <w:spacing w:before="120"/>
-        <w:rPr>
-          <w:rFonts w:ascii="Palatino Linotype" w:hAnsi="Palatino Linotype" w:cs="Times New Roman"/>
-          <w:b/>
-          <w:bCs/>
-          <w:sz w:val="24"/>
-          <w:szCs w:val="24"/>
+        <w:ind w:left="3"/>
+        <w:jc w:val="both"/>
+        <w:rPr>
+          <w:rFonts w:ascii="Palatino Linotype" w:hAnsi="Palatino Linotype" w:cs="Times New Roman"/>
+          <w:sz w:val="20"/>
+          <w:szCs w:val="20"/>
+          <w:lang w:val="en-US"/>
         </w:rPr>
       </w:pPr>
     </w:p>
     <w:p>
       <w:pPr>
-        <w:spacing w:before="120"/>
-        <w:rPr>
-          <w:rFonts w:ascii="Palatino Linotype" w:hAnsi="Palatino Linotype" w:cs="Times New Roman"/>
-          <w:sz w:val="20"/>
-          <w:szCs w:val="20"/>
-          <w:lang w:val="en-US"/>
-        </w:rPr>
-      </w:pPr>
-      <w:r>
-        <w:rPr>
-          <w:rFonts w:ascii="Palatino Linotype" w:hAnsi="Palatino Linotype" w:cs="Times New Roman"/>
-          <w:b/>
-          <w:bCs/>
-          <w:sz w:val="24"/>
-          <w:szCs w:val="24"/>
-        </w:rPr>
-        <w:lastRenderedPageBreak/>
-        <w:t>Research Experience</w:t>
+        <w:rPr>
+          <w:rFonts w:ascii="Palatino Linotype" w:hAnsi="Palatino Linotype"/>
+          <w:b/>
+          <w:color w:val="000000"/>
+          <w:sz w:val="20"/>
+        </w:rPr>
+      </w:pPr>
+      <w:bookmarkStart w:id="9" w:name="OLE_LINK7"/>
+      <w:r>
+        <w:rPr>
+          <w:rFonts w:ascii="Palatino Linotype" w:hAnsi="Palatino Linotype"/>
+          <w:b/>
+          <w:color w:val="000000"/>
+          <w:sz w:val="20"/>
+        </w:rPr>
+        <w:t xml:space="preserve">Large Language Models for Software Security </w:t>
       </w:r>
     </w:p>
     <w:p>
       <w:pPr>
-        <w:jc w:val="both"/>
         <w:rPr>
           <w:rFonts w:ascii="Palatino Linotype" w:hAnsi="Palatino Linotype"/>
           <w:color w:val="000000"/>
           <w:sz w:val="20"/>
-          <w:szCs w:val="20"/>
         </w:rPr>
       </w:pPr>
       <w:r>
@@ -3235,2018 +3261,236 @@
           <w:rFonts w:ascii="Palatino Linotype" w:hAnsi="Palatino Linotype"/>
           <w:color w:val="000000"/>
           <w:sz w:val="20"/>
-          <w:szCs w:val="20"/>
-        </w:rPr>
-        <w:t xml:space="preserve">My research experience lies in the </w:t>
-      </w:r>
-      <w:r>
-        <w:rPr>
-          <w:rFonts w:ascii="Palatino Linotype" w:hAnsi="Palatino Linotype"/>
-          <w:b/>
-          <w:bCs/>
-          <w:color w:val="000000"/>
-          <w:sz w:val="20"/>
-          <w:szCs w:val="20"/>
-        </w:rPr>
-        <w:t>code analysis</w:t>
-      </w:r>
-      <w:r>
-        <w:rPr>
-          <w:rFonts w:ascii="Palatino Linotype" w:hAnsi="Palatino Linotype"/>
-          <w:color w:val="000000"/>
-          <w:sz w:val="20"/>
-          <w:szCs w:val="20"/>
-        </w:rPr>
-        <w:t xml:space="preserve"> (</w:t>
-      </w:r>
-      <w:r>
-        <w:rPr>
-          <w:rFonts w:ascii="Palatino Linotype" w:hAnsi="Palatino Linotype"/>
-          <w:color w:val="000000"/>
-          <w:sz w:val="20"/>
-          <w:szCs w:val="20"/>
-        </w:rPr>
-        <w:t>Software Security</w:t>
-      </w:r>
-      <w:r>
-        <w:rPr>
-          <w:rFonts w:ascii="Palatino Linotype" w:hAnsi="Palatino Linotype"/>
-          <w:color w:val="000000"/>
-          <w:sz w:val="20"/>
-          <w:szCs w:val="20"/>
-        </w:rPr>
-        <w:t>)</w:t>
-      </w:r>
-      <w:r>
-        <w:rPr>
-          <w:rFonts w:ascii="Palatino Linotype" w:hAnsi="Palatino Linotype"/>
-          <w:color w:val="000000"/>
-          <w:sz w:val="20"/>
-          <w:szCs w:val="20"/>
-        </w:rPr>
-        <w:t xml:space="preserve"> and </w:t>
-      </w:r>
-      <w:r>
-        <w:rPr>
-          <w:rFonts w:ascii="Palatino Linotype" w:hAnsi="Palatino Linotype"/>
-          <w:b/>
-          <w:bCs/>
-          <w:color w:val="000000"/>
-          <w:sz w:val="20"/>
-          <w:szCs w:val="20"/>
-        </w:rPr>
-        <w:t>code optimization</w:t>
-      </w:r>
-      <w:r>
-        <w:rPr>
-          <w:rFonts w:ascii="Palatino Linotype" w:hAnsi="Palatino Linotype"/>
-          <w:color w:val="000000"/>
-          <w:sz w:val="20"/>
-          <w:szCs w:val="20"/>
-        </w:rPr>
-        <w:t xml:space="preserve"> using </w:t>
-      </w:r>
-      <w:r>
-        <w:rPr>
-          <w:rFonts w:ascii="Palatino Linotype" w:hAnsi="Palatino Linotype"/>
-          <w:b/>
-          <w:bCs/>
-          <w:color w:val="000000"/>
-          <w:sz w:val="20"/>
-          <w:szCs w:val="20"/>
-        </w:rPr>
-        <w:t xml:space="preserve">machine </w:t>
-      </w:r>
-      <w:r>
-        <w:rPr>
-          <w:rFonts w:ascii="Palatino Linotype" w:hAnsi="Palatino Linotype"/>
-          <w:b/>
-          <w:bCs/>
-          <w:color w:val="000000"/>
-          <w:sz w:val="20"/>
-          <w:szCs w:val="20"/>
-        </w:rPr>
-        <w:t>learning</w:t>
-      </w:r>
-      <w:r>
-        <w:rPr>
-          <w:rFonts w:ascii="Palatino Linotype" w:hAnsi="Palatino Linotype"/>
-          <w:b/>
-          <w:bCs/>
-          <w:color w:val="000000"/>
-          <w:sz w:val="20"/>
-          <w:szCs w:val="20"/>
-        </w:rPr>
-        <w:t xml:space="preserve"> (</w:t>
-      </w:r>
-      <w:r>
-        <w:rPr>
-          <w:rFonts w:ascii="Palatino Linotype" w:hAnsi="Palatino Linotype"/>
-          <w:b/>
-          <w:bCs/>
-          <w:color w:val="000000"/>
-          <w:sz w:val="20"/>
-          <w:szCs w:val="20"/>
-        </w:rPr>
-        <w:t>ML)</w:t>
-      </w:r>
-      <w:r>
-        <w:rPr>
-          <w:rFonts w:ascii="Palatino Linotype" w:hAnsi="Palatino Linotype"/>
-          <w:color w:val="000000"/>
-          <w:sz w:val="20"/>
-          <w:szCs w:val="20"/>
-        </w:rPr>
-        <w:t xml:space="preserve"> techniques. I have participated in the following projects during my MSc and PhD studies</w:t>
-      </w:r>
-      <w:r>
-        <w:rPr>
-          <w:rFonts w:ascii="Palatino Linotype" w:hAnsi="Palatino Linotype"/>
-          <w:color w:val="000000"/>
-          <w:sz w:val="20"/>
-          <w:szCs w:val="20"/>
-        </w:rPr>
-        <w:t>:</w:t>
+        </w:rPr>
+        <w:t>Large language models (LLMs) hold great promise for automating software vulnerability detection and repair, but ensuring their correctness remains a challenge. We introduce “SecureMind”, an open-source framework for evaluating LLMs in vulnerability detection and repair, with a focus on memory-related vulnerabilities. We evaluate 10 representative LLMs on 16,000 test samples covering 8 types of vulnerabilities.</w:t>
       </w:r>
     </w:p>
     <w:p>
       <w:pPr>
-        <w:jc w:val="both"/>
         <w:rPr>
           <w:rFonts w:ascii="Palatino Linotype" w:hAnsi="Palatino Linotype"/>
           <w:color w:val="000000"/>
           <w:sz w:val="20"/>
-          <w:szCs w:val="20"/>
         </w:rPr>
       </w:pPr>
     </w:p>
     <w:p>
       <w:pPr>
-        <w:numPr>
-          <w:ilvl w:val="0"/>
-          <w:numId w:val="2"/>
-        </w:numPr>
-        <w:rPr>
-          <w:rFonts w:ascii="Palatino Linotype" w:hAnsi="Palatino Linotype" w:cs="Times New Roman"/>
-          <w:sz w:val="20"/>
-          <w:szCs w:val="20"/>
-          <w:lang w:val="en-US"/>
-        </w:rPr>
-      </w:pPr>
-      <w:r>
-        <w:rPr>
-          <w:rFonts w:ascii="Palatino Linotype" w:hAnsi="Palatino Linotype" w:cs="Times New Roman" w:hint="eastAsia"/>
-          <w:b/>
-          <w:bCs/>
-          <w:sz w:val="20"/>
-          <w:szCs w:val="20"/>
-          <w:lang w:val="en-US"/>
-        </w:rPr>
-        <w:t>Large Language Model</w:t>
-      </w:r>
-      <w:r>
-        <w:rPr>
-          <w:rFonts w:ascii="Palatino Linotype" w:hAnsi="Palatino Linotype" w:cs="Times New Roman"/>
-          <w:b/>
-          <w:bCs/>
-          <w:sz w:val="20"/>
-          <w:szCs w:val="20"/>
-          <w:lang w:val="en-US"/>
-        </w:rPr>
-        <w:t xml:space="preserve"> for </w:t>
-      </w:r>
-      <w:r>
-        <w:rPr>
-          <w:rFonts w:ascii="Palatino Linotype" w:hAnsi="Palatino Linotype" w:cs="Times New Roman"/>
-          <w:b/>
-          <w:bCs/>
-          <w:sz w:val="20"/>
-          <w:szCs w:val="20"/>
-          <w:lang w:val="en-US"/>
-        </w:rPr>
-        <w:t>Software Security</w:t>
-      </w:r>
-      <w:r>
-        <w:rPr>
-          <w:rFonts w:ascii="Palatino Linotype" w:hAnsi="Palatino Linotype" w:cs="Times New Roman"/>
-          <w:b/>
-          <w:bCs/>
-          <w:sz w:val="20"/>
-          <w:szCs w:val="20"/>
-        </w:rPr>
-        <w:tab/>
-      </w:r>
-      <w:r>
-        <w:rPr>
-          <w:rFonts w:ascii="Palatino Linotype" w:hAnsi="Palatino Linotype" w:cs="Times New Roman"/>
-          <w:b/>
-          <w:bCs/>
-          <w:sz w:val="20"/>
-          <w:szCs w:val="20"/>
-        </w:rPr>
-        <w:tab/>
-      </w:r>
-      <w:r>
-        <w:rPr>
-          <w:rFonts w:ascii="Palatino Linotype" w:hAnsi="Palatino Linotype" w:cs="Times New Roman"/>
-          <w:b/>
-          <w:bCs/>
-          <w:sz w:val="20"/>
-          <w:szCs w:val="20"/>
-        </w:rPr>
-        <w:tab/>
-        <w:t xml:space="preserve">     </w:t>
-      </w:r>
-      <w:r>
-        <w:rPr>
-          <w:rFonts w:ascii="Palatino Linotype" w:hAnsi="Palatino Linotype" w:cs="Times New Roman"/>
-          <w:b/>
-          <w:bCs/>
-          <w:sz w:val="20"/>
-          <w:szCs w:val="20"/>
-        </w:rPr>
-        <w:t xml:space="preserve">       </w:t>
-      </w:r>
-      <w:r>
-        <w:rPr>
-          <w:rFonts w:ascii="Palatino Linotype" w:hAnsi="Palatino Linotype" w:cs="Times New Roman"/>
-          <w:b/>
-          <w:bCs/>
-          <w:sz w:val="20"/>
-          <w:szCs w:val="20"/>
-        </w:rPr>
-        <w:t xml:space="preserve">              </w:t>
-      </w:r>
-      <w:r>
-        <w:rPr>
-          <w:rFonts w:ascii="Palatino Linotype" w:hAnsi="Palatino Linotype" w:cs="Times New Roman"/>
-          <w:b/>
-          <w:bCs/>
-          <w:sz w:val="20"/>
-          <w:szCs w:val="20"/>
-        </w:rPr>
-        <w:t xml:space="preserve"> </w:t>
-      </w:r>
-      <w:r>
-        <w:rPr>
-          <w:rFonts w:ascii="Palatino Linotype" w:hAnsi="Palatino Linotype" w:cs="Times New Roman" w:hint="eastAsia"/>
-          <w:b/>
-          <w:bCs/>
-          <w:sz w:val="20"/>
-          <w:szCs w:val="20"/>
-          <w:lang w:val="en-US"/>
-        </w:rPr>
-        <w:t>January 2025</w:t>
-      </w:r>
-      <w:r>
-        <w:rPr>
-          <w:rFonts w:ascii="Palatino Linotype" w:hAnsi="Palatino Linotype" w:cs="Times New Roman"/>
-          <w:b/>
-          <w:bCs/>
-          <w:sz w:val="20"/>
-          <w:szCs w:val="20"/>
-        </w:rPr>
-        <w:t xml:space="preserve"> </w:t>
-      </w:r>
-      <w:bookmarkStart w:id="6" w:name="OLE_LINK2"/>
-      <w:r>
-        <w:rPr>
-          <w:rFonts w:ascii="Palatino Linotype" w:hAnsi="Palatino Linotype" w:cs="Times New Roman"/>
-          <w:b/>
-          <w:bCs/>
-          <w:sz w:val="20"/>
-          <w:szCs w:val="20"/>
-        </w:rPr>
-        <w:t>- now</w:t>
-      </w:r>
-    </w:p>
-    <w:bookmarkEnd w:id="6"/>
-    <w:p>
-      <w:pPr>
-        <w:jc w:val="both"/>
-        <w:rPr>
-          <w:rFonts w:ascii="Palatino Linotype" w:hAnsi="Palatino Linotype"/>
+        <w:rPr>
+          <w:rFonts w:ascii="Palatino Linotype" w:hAnsi="Palatino Linotype"/>
+          <w:b/>
           <w:color w:val="000000"/>
           <w:sz w:val="20"/>
-          <w:szCs w:val="20"/>
-        </w:rPr>
-      </w:pPr>
-      <w:r>
-        <w:rPr>
-          <w:rFonts w:ascii="Palatino Linotype" w:hAnsi="Palatino Linotype"/>
+        </w:rPr>
+      </w:pPr>
+      <w:r>
+        <w:rPr>
+          <w:rFonts w:ascii="Palatino Linotype" w:hAnsi="Palatino Linotype"/>
+          <w:b/>
           <w:color w:val="000000"/>
           <w:sz w:val="20"/>
-          <w:szCs w:val="20"/>
-        </w:rPr>
-        <w:t xml:space="preserve">Large language models (LLMs) hold great promise for automating software vulnerability detection and repair, but ensuring their correctness remains a challenge. We introduce </w:t>
-      </w:r>
-      <w:r>
-        <w:rPr>
-          <w:rFonts w:ascii="Palatino Linotype" w:hAnsi="Palatino Linotype"/>
-          <w:color w:val="000000"/>
-          <w:sz w:val="20"/>
-          <w:szCs w:val="20"/>
-        </w:rPr>
-        <w:t>“</w:t>
-      </w:r>
-      <w:r>
-        <w:rPr>
-          <w:rFonts w:ascii="Palatino Linotype" w:hAnsi="Palatino Linotype"/>
-          <w:color w:val="000000"/>
-          <w:sz w:val="20"/>
-          <w:szCs w:val="20"/>
-        </w:rPr>
-        <w:t>SecureMind</w:t>
-      </w:r>
-      <w:r>
-        <w:rPr>
-          <w:rFonts w:ascii="Palatino Linotype" w:hAnsi="Palatino Linotype"/>
-          <w:color w:val="000000"/>
-          <w:sz w:val="20"/>
-          <w:szCs w:val="20"/>
-        </w:rPr>
-        <w:t>”</w:t>
-      </w:r>
-      <w:r>
-        <w:rPr>
-          <w:rFonts w:ascii="Palatino Linotype" w:hAnsi="Palatino Linotype"/>
-          <w:color w:val="000000"/>
-          <w:sz w:val="20"/>
-          <w:szCs w:val="20"/>
-        </w:rPr>
-        <w:t xml:space="preserve">, an open-source framework for evaluating LLMs in vulnerability detection and repair, with a focus on memory-related vulnerabilities. </w:t>
-      </w:r>
-      <w:r>
-        <w:rPr>
-          <w:rFonts w:ascii="Palatino Linotype" w:hAnsi="Palatino Linotype"/>
-          <w:color w:val="000000"/>
-          <w:sz w:val="20"/>
-          <w:szCs w:val="20"/>
-        </w:rPr>
-        <w:t xml:space="preserve">We </w:t>
-      </w:r>
-      <w:r>
-        <w:rPr>
-          <w:rFonts w:ascii="Palatino Linotype" w:hAnsi="Palatino Linotype"/>
-          <w:color w:val="000000"/>
-          <w:sz w:val="20"/>
-          <w:szCs w:val="20"/>
-        </w:rPr>
-        <w:t>evaluate 10 representative LLMs</w:t>
-      </w:r>
-      <w:r>
-        <w:rPr>
-          <w:rFonts w:ascii="Palatino Linotype" w:hAnsi="Palatino Linotype"/>
-          <w:color w:val="000000"/>
-          <w:sz w:val="20"/>
-          <w:szCs w:val="20"/>
-        </w:rPr>
-        <w:t xml:space="preserve"> </w:t>
-      </w:r>
-      <w:r>
-        <w:rPr>
-          <w:rFonts w:ascii="Palatino Linotype" w:hAnsi="Palatino Linotype"/>
-          <w:color w:val="000000"/>
-          <w:sz w:val="20"/>
-          <w:szCs w:val="20"/>
-        </w:rPr>
-        <w:t>on 16,000 test samples covering 8 types of vulnerabilities.</w:t>
+        </w:rPr>
+        <w:t>Hybrid Learning-based Software Vulnerability Prediction</w:t>
       </w:r>
     </w:p>
     <w:p>
       <w:pPr>
-        <w:spacing w:line="120" w:lineRule="auto"/>
-        <w:rPr>
-          <w:rFonts w:ascii="Palatino Linotype" w:hAnsi="Palatino Linotype" w:cs="Times New Roman"/>
-          <w:sz w:val="20"/>
-          <w:szCs w:val="20"/>
-        </w:rPr>
-      </w:pPr>
-      <w:bookmarkStart w:id="7" w:name="OLE_LINK7"/>
+        <w:rPr>
+          <w:rFonts w:ascii="Palatino Linotype" w:hAnsi="Palatino Linotype"/>
+          <w:color w:val="000000"/>
+          <w:sz w:val="20"/>
+        </w:rPr>
+      </w:pPr>
+      <w:r>
+        <w:rPr>
+          <w:rFonts w:ascii="Palatino Linotype" w:hAnsi="Palatino Linotype"/>
+          <w:color w:val="000000"/>
+          <w:sz w:val="20"/>
+        </w:rPr>
+        <w:t>Deep Learning (DL) is increasingly employed for software bug and vulnerability detection, extracting program representations from static code sources such as code texts. DL may face challenges from complex code structures, redundant statements, and extensive execution paths, potentially reducing the performance. We proposed using DL to learn program representations by combining static source code information and dynamic program execution traces. We have successfully uncovered more than 100 unique vulnerabilities and yielded 36 new, unique CVE IDs and outperformed 14 prior methods by providing higher accuracy.</w:t>
+      </w:r>
     </w:p>
     <w:p>
       <w:pPr>
-        <w:ind w:left="3"/>
-        <w:rPr>
-          <w:rFonts w:ascii="Palatino Linotype" w:hAnsi="Palatino Linotype" w:cs="Times New Roman"/>
-          <w:i/>
-          <w:iCs/>
-          <w:sz w:val="20"/>
-          <w:szCs w:val="20"/>
-        </w:rPr>
-      </w:pPr>
-      <w:r>
-        <w:rPr>
-          <w:rFonts w:ascii="Palatino Linotype" w:hAnsi="Palatino Linotype" w:cs="Times New Roman" w:hint="eastAsia"/>
-          <w:i/>
-          <w:iCs/>
-          <w:sz w:val="20"/>
-          <w:szCs w:val="20"/>
-        </w:rPr>
-        <w:t>T</w:t>
-      </w:r>
-      <w:r>
-        <w:rPr>
-          <w:rFonts w:ascii="Palatino Linotype" w:hAnsi="Palatino Linotype" w:cs="Times New Roman"/>
-          <w:i/>
-          <w:iCs/>
-          <w:sz w:val="20"/>
-          <w:szCs w:val="20"/>
-        </w:rPr>
-        <w:t xml:space="preserve">his work </w:t>
-      </w:r>
-      <w:r>
-        <w:rPr>
-          <w:rFonts w:ascii="Palatino Linotype" w:hAnsi="Palatino Linotype" w:cs="Times New Roman" w:hint="eastAsia"/>
-          <w:i/>
-          <w:iCs/>
-          <w:sz w:val="20"/>
-          <w:szCs w:val="20"/>
-          <w:lang w:val="en-US"/>
-        </w:rPr>
-        <w:t xml:space="preserve">has led </w:t>
-      </w:r>
-      <w:r>
-        <w:rPr>
-          <w:rFonts w:ascii="Palatino Linotype" w:hAnsi="Palatino Linotype" w:cs="Times New Roman"/>
-          <w:i/>
-          <w:iCs/>
-          <w:sz w:val="20"/>
-          <w:szCs w:val="20"/>
-        </w:rPr>
-        <w:t xml:space="preserve">to one paper </w:t>
-      </w:r>
-      <w:r>
-        <w:rPr>
-          <w:rFonts w:ascii="Palatino Linotype" w:hAnsi="Palatino Linotype" w:cs="Times New Roman" w:hint="eastAsia"/>
-          <w:i/>
-          <w:iCs/>
-          <w:sz w:val="20"/>
-          <w:szCs w:val="20"/>
-        </w:rPr>
-        <w:t>published</w:t>
-      </w:r>
-      <w:r>
-        <w:rPr>
-          <w:rFonts w:ascii="Palatino Linotype" w:hAnsi="Palatino Linotype" w:cs="Times New Roman"/>
-          <w:i/>
-          <w:iCs/>
-          <w:sz w:val="20"/>
-          <w:szCs w:val="20"/>
-        </w:rPr>
-        <w:t xml:space="preserve"> </w:t>
-      </w:r>
-      <w:r>
-        <w:rPr>
-          <w:rFonts w:ascii="Palatino Linotype" w:hAnsi="Palatino Linotype" w:cs="Times New Roman" w:hint="eastAsia"/>
-          <w:i/>
-          <w:iCs/>
-          <w:sz w:val="20"/>
-          <w:szCs w:val="20"/>
-          <w:lang w:val="en-US"/>
-        </w:rPr>
-        <w:t xml:space="preserve">in </w:t>
-      </w:r>
-      <w:r>
-        <w:rPr>
-          <w:rFonts w:ascii="Palatino Linotype" w:hAnsi="Palatino Linotype" w:cs="Times New Roman"/>
-          <w:b/>
-          <w:bCs/>
-          <w:i/>
-          <w:iCs/>
-          <w:sz w:val="20"/>
-          <w:szCs w:val="20"/>
-          <w:lang w:val="en-US"/>
-        </w:rPr>
-        <w:t>ISMM 2025</w:t>
-      </w:r>
-      <w:r>
-        <w:rPr>
-          <w:rFonts w:ascii="Palatino Linotype" w:hAnsi="Palatino Linotype" w:cs="Times New Roman" w:hint="eastAsia"/>
-          <w:b/>
-          <w:bCs/>
-          <w:i/>
-          <w:iCs/>
-          <w:sz w:val="20"/>
-          <w:szCs w:val="20"/>
-          <w:lang w:val="en-US"/>
-        </w:rPr>
-        <w:t xml:space="preserve"> [</w:t>
-      </w:r>
-      <w:r>
-        <w:rPr>
-          <w:rFonts w:ascii="Palatino Linotype" w:hAnsi="Palatino Linotype" w:cs="Times New Roman"/>
-          <w:b/>
-          <w:bCs/>
-          <w:i/>
-          <w:iCs/>
-          <w:sz w:val="20"/>
-          <w:szCs w:val="20"/>
-          <w:lang w:val="en-US"/>
-        </w:rPr>
-        <w:t>1</w:t>
-      </w:r>
-      <w:r>
-        <w:rPr>
-          <w:rFonts w:ascii="Palatino Linotype" w:hAnsi="Palatino Linotype" w:cs="Times New Roman" w:hint="eastAsia"/>
-          <w:b/>
-          <w:bCs/>
-          <w:i/>
-          <w:iCs/>
-          <w:sz w:val="20"/>
-          <w:szCs w:val="20"/>
-          <w:lang w:val="en-US"/>
-        </w:rPr>
-        <w:t>]</w:t>
-      </w:r>
-      <w:r>
-        <w:rPr>
-          <w:rFonts w:ascii="Palatino Linotype" w:hAnsi="Palatino Linotype" w:cs="Times New Roman"/>
-          <w:i/>
-          <w:iCs/>
-          <w:sz w:val="20"/>
-          <w:szCs w:val="20"/>
-        </w:rPr>
-        <w:t>.</w:t>
-      </w:r>
+        <w:rPr>
+          <w:rFonts w:ascii="Palatino Linotype" w:hAnsi="Palatino Linotype"/>
+          <w:color w:val="000000"/>
+          <w:sz w:val="20"/>
+        </w:rPr>
+      </w:pPr>
     </w:p>
     <w:p>
       <w:pPr>
-        <w:ind w:left="3"/>
-        <w:rPr>
-          <w:rFonts w:ascii="Palatino Linotype" w:hAnsi="Palatino Linotype" w:cs="Times New Roman"/>
-          <w:i/>
-          <w:iCs/>
-          <w:sz w:val="20"/>
-          <w:szCs w:val="20"/>
-        </w:rPr>
-      </w:pPr>
-    </w:p>
-    <w:bookmarkEnd w:id="7"/>
-    <w:p>
-      <w:pPr>
-        <w:pStyle w:val="a"/>
-        <w:numPr>
-          <w:ilvl w:val="0"/>
-          <w:numId w:val="5"/>
-        </w:numPr>
-      </w:pPr>
-      <w:r>
-        <w:t>Robust</w:t>
-      </w:r>
-      <w:r>
-        <w:rPr>
-          <w:rFonts w:hint="eastAsia"/>
-        </w:rPr>
-        <w:t xml:space="preserve"> Machine Learning </w:t>
-      </w:r>
-      <w:r>
-        <w:t>during Deployment Time</w:t>
-      </w:r>
-      <w:r>
-        <w:tab/>
-      </w:r>
-      <w:r>
-        <w:tab/>
-        <w:t xml:space="preserve">        </w:t>
-      </w:r>
-      <w:r>
-        <w:tab/>
-      </w:r>
-      <w:r>
-        <w:t xml:space="preserve">        </w:t>
-      </w:r>
-      <w:r>
-        <w:t>April 202</w:t>
-      </w:r>
-      <w:r>
-        <w:rPr>
-          <w:rFonts w:hint="eastAsia"/>
-        </w:rPr>
-        <w:t>2</w:t>
-      </w:r>
-      <w:r>
-        <w:t xml:space="preserve"> </w:t>
-      </w:r>
-      <w:r>
-        <w:rPr>
-          <w:rFonts w:hint="eastAsia"/>
-        </w:rPr>
-        <w:t>to</w:t>
-      </w:r>
-      <w:r>
-        <w:t xml:space="preserve"> </w:t>
-      </w:r>
-      <w:r>
-        <w:rPr>
-          <w:rFonts w:hint="eastAsia"/>
-        </w:rPr>
-        <w:t>Jan 2025</w:t>
+        <w:rPr>
+          <w:rFonts w:ascii="Palatino Linotype" w:hAnsi="Palatino Linotype"/>
+          <w:b/>
+          <w:color w:val="000000"/>
+          <w:sz w:val="20"/>
+        </w:rPr>
+      </w:pPr>
+      <w:r>
+        <w:rPr>
+          <w:rFonts w:ascii="Palatino Linotype" w:hAnsi="Palatino Linotype"/>
+          <w:b/>
+          <w:color w:val="000000"/>
+          <w:sz w:val="20"/>
+        </w:rPr>
+        <w:t>Deep Program Structure Modeling using Graph Neural Networks</w:t>
       </w:r>
     </w:p>
     <w:p>
       <w:pPr>
-        <w:widowControl w:val="0"/>
-        <w:rPr>
-          <w:rFonts w:ascii="Palatino Linotype" w:hAnsi="Palatino Linotype" w:cs="Times New Roman"/>
-          <w:sz w:val="20"/>
-          <w:szCs w:val="20"/>
-          <w:lang w:val="en-US"/>
-        </w:rPr>
-      </w:pPr>
-      <w:r>
-        <w:rPr>
-          <w:rFonts w:ascii="Palatino Linotype" w:hAnsi="Palatino Linotype" w:cs="Times New Roman"/>
-          <w:sz w:val="20"/>
-          <w:szCs w:val="20"/>
-          <w:lang w:val="en-US"/>
-        </w:rPr>
-        <w:t xml:space="preserve">In recent years, </w:t>
-      </w:r>
-      <w:r>
-        <w:rPr>
-          <w:rFonts w:ascii="Palatino Linotype" w:hAnsi="Palatino Linotype" w:cs="Times New Roman"/>
-          <w:sz w:val="20"/>
-          <w:szCs w:val="20"/>
-          <w:lang w:val="en-US"/>
-        </w:rPr>
-        <w:t>ML</w:t>
-      </w:r>
-      <w:r>
-        <w:rPr>
-          <w:rFonts w:ascii="Palatino Linotype" w:hAnsi="Palatino Linotype" w:cs="Times New Roman"/>
-          <w:sz w:val="20"/>
-          <w:szCs w:val="20"/>
-          <w:lang w:val="en-US"/>
-        </w:rPr>
-        <w:t xml:space="preserve"> has emerged as a powerful</w:t>
-      </w:r>
-      <w:r>
-        <w:rPr>
-          <w:rFonts w:ascii="Palatino Linotype" w:hAnsi="Palatino Linotype" w:cs="Times New Roman" w:hint="eastAsia"/>
-          <w:sz w:val="20"/>
-          <w:szCs w:val="20"/>
-          <w:lang w:val="en-US"/>
-        </w:rPr>
-        <w:t xml:space="preserve"> </w:t>
-      </w:r>
-      <w:r>
-        <w:rPr>
-          <w:rFonts w:ascii="Palatino Linotype" w:hAnsi="Palatino Linotype" w:cs="Times New Roman"/>
-          <w:sz w:val="20"/>
-          <w:szCs w:val="20"/>
-          <w:lang w:val="en-US"/>
-        </w:rPr>
-        <w:t xml:space="preserve">tool for assisting code analysis and optimization tasks.  </w:t>
-      </w:r>
-      <w:r>
-        <w:rPr>
-          <w:rFonts w:ascii="Palatino Linotype" w:hAnsi="Palatino Linotype" w:cs="Times New Roman"/>
-          <w:sz w:val="20"/>
-          <w:szCs w:val="20"/>
-          <w:lang w:val="en-US"/>
-        </w:rPr>
-        <w:t xml:space="preserve">ML </w:t>
-      </w:r>
-      <w:r>
-        <w:rPr>
-          <w:rFonts w:ascii="Palatino Linotype" w:hAnsi="Palatino Linotype" w:cs="Times New Roman"/>
-          <w:sz w:val="20"/>
-          <w:szCs w:val="20"/>
-          <w:lang w:val="en-US"/>
-        </w:rPr>
-        <w:t xml:space="preserve">models can be vulnerable to changes in the deployment environment. Even slight alterations in hardware or application workloads can severely impact their accuracy. </w:t>
+        <w:rPr>
+          <w:rFonts w:ascii="Palatino Linotype" w:hAnsi="Palatino Linotype"/>
+          <w:color w:val="000000"/>
+          <w:sz w:val="20"/>
+        </w:rPr>
+      </w:pPr>
+      <w:r>
+        <w:rPr>
+          <w:rFonts w:ascii="Palatino Linotype" w:hAnsi="Palatino Linotype"/>
+          <w:color w:val="000000"/>
+          <w:sz w:val="20"/>
+        </w:rPr>
+        <w:t>DL is promising for code-related tasks like compiler optimization. An important factor is having the right representation to characterize the model input for the given task. Existing approaches in the area typically treat the program structure as a sequential sequence but fail to capitalize on the rich semantics of data and control flow information, for which graphs are a proven representation structure. We introduce a novel Graph Neural Network (GNN) approach to learn rich code representations from program graphs, effectively capturing diverse code relationships—including data flow and control flow—that are critical for downstream tasks. We apply our method to four classification tasks, and experimental results consistently demonstrate its superiority over competing approaches.</w:t>
       </w:r>
     </w:p>
     <w:p>
       <w:pPr>
-        <w:widowControl w:val="0"/>
-        <w:spacing w:line="120" w:lineRule="auto"/>
-        <w:rPr>
-          <w:rFonts w:ascii="Palatino Linotype" w:hAnsi="Palatino Linotype" w:cs="Times New Roman"/>
-          <w:sz w:val="20"/>
-          <w:szCs w:val="20"/>
-          <w:lang w:val="en-US"/>
+        <w:rPr>
+          <w:rFonts w:ascii="Palatino Linotype" w:hAnsi="Palatino Linotype"/>
+          <w:color w:val="000000"/>
+          <w:sz w:val="20"/>
         </w:rPr>
       </w:pPr>
     </w:p>
     <w:p>
       <w:pPr>
-        <w:ind w:left="3"/>
-        <w:rPr>
-          <w:rFonts w:ascii="Palatino Linotype" w:hAnsi="Palatino Linotype" w:cs="Times New Roman"/>
-          <w:sz w:val="20"/>
-          <w:szCs w:val="20"/>
-        </w:rPr>
-      </w:pPr>
-      <w:r>
-        <w:rPr>
-          <w:rFonts w:ascii="Palatino Linotype" w:hAnsi="Palatino Linotype" w:cs="Times New Roman" w:hint="eastAsia"/>
-          <w:sz w:val="20"/>
-          <w:szCs w:val="20"/>
-        </w:rPr>
-        <w:t xml:space="preserve">We introduce </w:t>
-      </w:r>
-      <w:r>
-        <w:rPr>
-          <w:rFonts w:ascii="Palatino Linotype" w:hAnsi="Palatino Linotype" w:cs="Times New Roman"/>
-          <w:sz w:val="20"/>
-          <w:szCs w:val="20"/>
-        </w:rPr>
-        <w:t>“</w:t>
-      </w:r>
-      <w:r>
-        <w:rPr>
-          <w:rFonts w:ascii="Palatino Linotype" w:hAnsi="Palatino Linotype" w:cs="Times New Roman"/>
-          <w:sz w:val="20"/>
-          <w:szCs w:val="20"/>
-        </w:rPr>
-        <w:t>Prom</w:t>
-      </w:r>
-      <w:r>
-        <w:rPr>
-          <w:rFonts w:ascii="Palatino Linotype" w:hAnsi="Palatino Linotype" w:cs="Times New Roman"/>
-          <w:sz w:val="20"/>
-          <w:szCs w:val="20"/>
-        </w:rPr>
-        <w:t>”</w:t>
-      </w:r>
-      <w:r>
-        <w:rPr>
-          <w:rFonts w:ascii="Palatino Linotype" w:hAnsi="Palatino Linotype" w:cs="Times New Roman" w:hint="eastAsia"/>
-          <w:sz w:val="20"/>
-          <w:szCs w:val="20"/>
-        </w:rPr>
-        <w:t xml:space="preserve"> to enhance the robustness and performance of predictive models against such changes during deployment</w:t>
-      </w:r>
-      <w:r>
-        <w:rPr>
-          <w:rFonts w:ascii="Palatino Linotype" w:hAnsi="Palatino Linotype" w:cs="Times New Roman" w:hint="eastAsia"/>
-          <w:sz w:val="20"/>
-          <w:szCs w:val="20"/>
-          <w:lang w:val="en-US"/>
-        </w:rPr>
-        <w:t xml:space="preserve">. </w:t>
-      </w:r>
-      <w:r>
-        <w:rPr>
-          <w:rFonts w:ascii="Palatino Linotype" w:hAnsi="Palatino Linotype" w:cs="Times New Roman"/>
-          <w:sz w:val="20"/>
-          <w:szCs w:val="20"/>
-        </w:rPr>
-        <w:t xml:space="preserve">We applied </w:t>
-      </w:r>
-      <w:r>
-        <w:rPr>
-          <w:rFonts w:ascii="Palatino Linotype" w:hAnsi="Palatino Linotype" w:cs="Times New Roman"/>
-          <w:sz w:val="20"/>
-          <w:szCs w:val="20"/>
-        </w:rPr>
-        <w:t>Prom to</w:t>
-      </w:r>
-      <w:r>
-        <w:rPr>
-          <w:rFonts w:ascii="Palatino Linotype" w:hAnsi="Palatino Linotype" w:cs="Times New Roman"/>
-          <w:sz w:val="20"/>
-          <w:szCs w:val="20"/>
-        </w:rPr>
-        <w:t xml:space="preserve"> </w:t>
-      </w:r>
-      <w:r>
-        <w:rPr>
-          <w:rFonts w:ascii="Palatino Linotype" w:hAnsi="Palatino Linotype" w:cs="Times New Roman" w:hint="eastAsia"/>
-          <w:sz w:val="20"/>
-          <w:szCs w:val="20"/>
-          <w:lang w:val="en-US"/>
-        </w:rPr>
-        <w:t xml:space="preserve">12 </w:t>
-      </w:r>
-      <w:r>
-        <w:rPr>
-          <w:rFonts w:ascii="Palatino Linotype" w:hAnsi="Palatino Linotype" w:cs="Times New Roman"/>
-          <w:sz w:val="20"/>
-          <w:szCs w:val="20"/>
-        </w:rPr>
-        <w:t xml:space="preserve">representative </w:t>
-      </w:r>
-      <w:r>
-        <w:rPr>
-          <w:rFonts w:ascii="Palatino Linotype" w:hAnsi="Palatino Linotype" w:cs="Times New Roman"/>
-          <w:sz w:val="20"/>
-          <w:szCs w:val="20"/>
-        </w:rPr>
-        <w:t>ML</w:t>
-      </w:r>
-      <w:r>
-        <w:rPr>
-          <w:rFonts w:ascii="Palatino Linotype" w:hAnsi="Palatino Linotype" w:cs="Times New Roman"/>
-          <w:sz w:val="20"/>
-          <w:szCs w:val="20"/>
-        </w:rPr>
-        <w:t xml:space="preserve"> models, covering heterogeneous device mapping, GPU thread coarsening, loop vectorization, source-code level bug detection</w:t>
-      </w:r>
-      <w:r>
-        <w:rPr>
-          <w:rFonts w:ascii="Palatino Linotype" w:hAnsi="Palatino Linotype" w:cs="Times New Roman" w:hint="eastAsia"/>
-          <w:sz w:val="20"/>
-          <w:szCs w:val="20"/>
-          <w:lang w:val="en-US"/>
-        </w:rPr>
-        <w:t xml:space="preserve"> and Tensor tuning</w:t>
-      </w:r>
-      <w:r>
-        <w:rPr>
-          <w:rFonts w:ascii="Palatino Linotype" w:hAnsi="Palatino Linotype" w:cs="Times New Roman"/>
-          <w:sz w:val="20"/>
-          <w:szCs w:val="20"/>
-        </w:rPr>
-        <w:t>.</w:t>
-      </w:r>
-      <w:r>
-        <w:rPr>
-          <w:rFonts w:ascii="Palatino Linotype" w:hAnsi="Palatino Linotype" w:cs="Times New Roman" w:hint="eastAsia"/>
-          <w:sz w:val="20"/>
-          <w:szCs w:val="20"/>
-          <w:lang w:val="en-US"/>
-        </w:rPr>
-        <w:t xml:space="preserve"> </w:t>
-      </w:r>
-      <w:r>
-        <w:rPr>
-          <w:rFonts w:ascii="Palatino Linotype" w:hAnsi="Palatino Linotype" w:cs="Times New Roman"/>
-          <w:sz w:val="20"/>
-          <w:szCs w:val="20"/>
-          <w:lang w:val="en-US"/>
-        </w:rPr>
-        <w:t>Prom</w:t>
-      </w:r>
-      <w:r>
-        <w:rPr>
-          <w:rFonts w:ascii="Palatino Linotype" w:hAnsi="Palatino Linotype" w:cs="Times New Roman" w:hint="eastAsia"/>
-          <w:sz w:val="20"/>
-          <w:szCs w:val="20"/>
-        </w:rPr>
-        <w:t xml:space="preserve"> successfully identifies 90% (up to 100%) of mispredictions</w:t>
-      </w:r>
-      <w:r>
-        <w:rPr>
-          <w:rFonts w:ascii="Palatino Linotype" w:hAnsi="Palatino Linotype" w:cs="Times New Roman" w:hint="eastAsia"/>
-          <w:sz w:val="20"/>
-          <w:szCs w:val="20"/>
-          <w:lang w:val="en-US"/>
-        </w:rPr>
-        <w:t xml:space="preserve"> </w:t>
-      </w:r>
-      <w:r>
-        <w:rPr>
-          <w:rFonts w:ascii="Palatino Linotype" w:hAnsi="Palatino Linotype" w:cs="Times New Roman" w:hint="eastAsia"/>
-          <w:sz w:val="20"/>
-          <w:szCs w:val="20"/>
-        </w:rPr>
-        <w:t>and enhances prediction performance in operational environments through incremental learning.</w:t>
+        <w:rPr>
+          <w:rFonts w:ascii="Palatino Linotype" w:hAnsi="Palatino Linotype"/>
+          <w:color w:val="000000"/>
+          <w:sz w:val="20"/>
+        </w:rPr>
+      </w:pPr>
+      <w:r>
+        <w:rPr>
+          <w:rFonts w:ascii="Palatino Linotype" w:hAnsi="Palatino Linotype"/>
+          <w:color w:val="000000"/>
+          <w:sz w:val="20"/>
+        </w:rPr>
+        <w:t>I also collaborate on related systems-security research, including RFID-based user-device authentication for IoT devices (SCENARIO, IEEE TDSC, 2025), input testing for quantum programming libraries (UPBEAT, ISSTA, 2024), and interpreter memory-safety testing on CHERI-enabled hardware (ISMM, 2026).</w:t>
       </w:r>
     </w:p>
     <w:p>
       <w:pPr>
-        <w:spacing w:line="120" w:lineRule="auto"/>
-        <w:ind w:left="6"/>
-        <w:rPr>
-          <w:rFonts w:ascii="Palatino Linotype" w:hAnsi="Palatino Linotype" w:cs="Times New Roman"/>
-          <w:sz w:val="20"/>
-          <w:szCs w:val="20"/>
+        <w:rPr>
+          <w:rFonts w:ascii="Palatino Linotype" w:hAnsi="Palatino Linotype"/>
+          <w:color w:val="000000"/>
+          <w:sz w:val="20"/>
         </w:rPr>
       </w:pPr>
     </w:p>
     <w:p>
       <w:pPr>
-        <w:ind w:left="3"/>
-        <w:rPr>
-          <w:rFonts w:ascii="Palatino Linotype" w:hAnsi="Palatino Linotype" w:cs="Times New Roman"/>
-          <w:i/>
-          <w:iCs/>
-          <w:sz w:val="20"/>
-          <w:szCs w:val="20"/>
-        </w:rPr>
-      </w:pPr>
-      <w:bookmarkStart w:id="8" w:name="OLE_LINK6"/>
-      <w:r>
-        <w:rPr>
-          <w:rFonts w:ascii="Palatino Linotype" w:hAnsi="Palatino Linotype" w:cs="Times New Roman" w:hint="eastAsia"/>
-          <w:i/>
-          <w:iCs/>
-          <w:sz w:val="20"/>
-          <w:szCs w:val="20"/>
-        </w:rPr>
-        <w:t>T</w:t>
-      </w:r>
-      <w:r>
-        <w:rPr>
-          <w:rFonts w:ascii="Palatino Linotype" w:hAnsi="Palatino Linotype" w:cs="Times New Roman"/>
-          <w:i/>
-          <w:iCs/>
-          <w:sz w:val="20"/>
-          <w:szCs w:val="20"/>
-        </w:rPr>
-        <w:t xml:space="preserve">his work </w:t>
-      </w:r>
-      <w:r>
-        <w:rPr>
-          <w:rFonts w:ascii="Palatino Linotype" w:hAnsi="Palatino Linotype" w:cs="Times New Roman" w:hint="eastAsia"/>
-          <w:i/>
-          <w:iCs/>
-          <w:sz w:val="20"/>
-          <w:szCs w:val="20"/>
-          <w:lang w:val="en-US"/>
-        </w:rPr>
-        <w:t xml:space="preserve">has led </w:t>
-      </w:r>
-      <w:r>
-        <w:rPr>
-          <w:rFonts w:ascii="Palatino Linotype" w:hAnsi="Palatino Linotype" w:cs="Times New Roman"/>
-          <w:i/>
-          <w:iCs/>
-          <w:sz w:val="20"/>
-          <w:szCs w:val="20"/>
-        </w:rPr>
-        <w:t xml:space="preserve">to one paper </w:t>
-      </w:r>
-      <w:r>
-        <w:rPr>
-          <w:rFonts w:ascii="Palatino Linotype" w:hAnsi="Palatino Linotype" w:cs="Times New Roman" w:hint="eastAsia"/>
-          <w:i/>
-          <w:iCs/>
-          <w:sz w:val="20"/>
-          <w:szCs w:val="20"/>
-        </w:rPr>
-        <w:t>published</w:t>
-      </w:r>
-      <w:r>
-        <w:rPr>
-          <w:rFonts w:ascii="Palatino Linotype" w:hAnsi="Palatino Linotype" w:cs="Times New Roman"/>
-          <w:i/>
-          <w:iCs/>
-          <w:sz w:val="20"/>
-          <w:szCs w:val="20"/>
-        </w:rPr>
-        <w:t xml:space="preserve"> </w:t>
-      </w:r>
-      <w:r>
-        <w:rPr>
-          <w:rFonts w:ascii="Palatino Linotype" w:hAnsi="Palatino Linotype" w:cs="Times New Roman" w:hint="eastAsia"/>
-          <w:i/>
-          <w:iCs/>
-          <w:sz w:val="20"/>
-          <w:szCs w:val="20"/>
-          <w:lang w:val="en-US"/>
-        </w:rPr>
-        <w:t xml:space="preserve">in </w:t>
-      </w:r>
-      <w:r>
-        <w:rPr>
-          <w:rFonts w:ascii="Palatino Linotype" w:hAnsi="Palatino Linotype" w:cs="Times New Roman"/>
-          <w:b/>
-          <w:bCs/>
-          <w:i/>
-          <w:iCs/>
-          <w:sz w:val="20"/>
-          <w:szCs w:val="20"/>
-          <w:lang w:val="en-US"/>
-        </w:rPr>
-        <w:t>CGO 2025</w:t>
-      </w:r>
-      <w:r>
-        <w:rPr>
-          <w:rFonts w:ascii="Palatino Linotype" w:hAnsi="Palatino Linotype" w:cs="Times New Roman" w:hint="eastAsia"/>
-          <w:b/>
-          <w:bCs/>
-          <w:i/>
-          <w:iCs/>
-          <w:sz w:val="20"/>
-          <w:szCs w:val="20"/>
-          <w:lang w:val="en-US"/>
-        </w:rPr>
-        <w:t xml:space="preserve"> [</w:t>
-      </w:r>
-      <w:r>
-        <w:rPr>
-          <w:rFonts w:ascii="Palatino Linotype" w:hAnsi="Palatino Linotype" w:cs="Times New Roman"/>
-          <w:b/>
-          <w:bCs/>
-          <w:i/>
-          <w:iCs/>
-          <w:sz w:val="20"/>
-          <w:szCs w:val="20"/>
-          <w:lang w:val="en-US"/>
-        </w:rPr>
-        <w:t>2</w:t>
-      </w:r>
-      <w:r>
-        <w:rPr>
-          <w:rFonts w:ascii="Palatino Linotype" w:hAnsi="Palatino Linotype" w:cs="Times New Roman" w:hint="eastAsia"/>
-          <w:b/>
-          <w:bCs/>
-          <w:i/>
-          <w:iCs/>
-          <w:sz w:val="20"/>
-          <w:szCs w:val="20"/>
-          <w:lang w:val="en-US"/>
-        </w:rPr>
-        <w:t>]</w:t>
-      </w:r>
-      <w:r>
-        <w:rPr>
-          <w:rFonts w:ascii="Palatino Linotype" w:hAnsi="Palatino Linotype" w:cs="Times New Roman"/>
-          <w:i/>
-          <w:iCs/>
-          <w:sz w:val="20"/>
-          <w:szCs w:val="20"/>
-        </w:rPr>
-        <w:t>.</w:t>
-      </w:r>
-      <w:bookmarkEnd w:id="8"/>
+        <w:rPr>
+          <w:rFonts w:ascii="Palatino Linotype" w:hAnsi="Palatino Linotype"/>
+          <w:b/>
+          <w:color w:val="000000"/>
+          <w:sz w:val="20"/>
+        </w:rPr>
+      </w:pPr>
+      <w:r>
+        <w:rPr>
+          <w:rFonts w:ascii="Palatino Linotype" w:hAnsi="Palatino Linotype"/>
+          <w:b/>
+          <w:color w:val="000000"/>
+          <w:sz w:val="20"/>
+        </w:rPr>
+        <w:t xml:space="preserve">Robust Machine Learning during Deployment Time </w:t>
+      </w:r>
     </w:p>
     <w:p>
       <w:pPr>
-        <w:ind w:left="3"/>
-        <w:rPr>
-          <w:rFonts w:ascii="Palatino Linotype" w:hAnsi="Palatino Linotype" w:cs="Times New Roman"/>
-          <w:i/>
-          <w:iCs/>
-          <w:sz w:val="20"/>
-          <w:szCs w:val="20"/>
-        </w:rPr>
-      </w:pPr>
+        <w:rPr>
+          <w:rFonts w:ascii="Palatino Linotype" w:hAnsi="Palatino Linotype"/>
+          <w:color w:val="000000"/>
+          <w:sz w:val="20"/>
+        </w:rPr>
+      </w:pPr>
+      <w:r>
+        <w:rPr>
+          <w:rFonts w:ascii="Palatino Linotype" w:hAnsi="Palatino Linotype"/>
+          <w:color w:val="000000"/>
+          <w:sz w:val="20"/>
+        </w:rPr>
+        <w:t>In recent years, ML has emerged as a powerful tool for assisting code analysis and optimization tasks. ML models can be vulnerable to changes in the deployment environment. Even slight alterations in hardware or application workloads can severely impact their accuracy. We introduce “Prom” to enhance the robustness and performance of predictive models against such changes during deployment. We applied Prom to 12 representative ML models, covering heterogeneous device mapping, GPU thread coarsening, loop vectorization, source-code level bug detection and Tensor tuning. Prom successfully identifies 90% (up to 100%) of mispredictions and enhances prediction performance in operational environments through incremental learning.</w:t>
+      </w:r>
     </w:p>
     <w:p>
       <w:pPr>
-        <w:pStyle w:val="a"/>
-        <w:numPr>
-          <w:ilvl w:val="0"/>
-          <w:numId w:val="4"/>
-        </w:numPr>
-      </w:pPr>
-      <w:r>
-        <w:t>Hybrid Learning-based Software Vulnerability Prediction</w:t>
-      </w:r>
-      <w:r>
-        <w:tab/>
-        <w:t xml:space="preserve">           </w:t>
-      </w:r>
-      <w:r>
-        <w:tab/>
-        <w:t xml:space="preserve">           December 2021 </w:t>
-      </w:r>
-      <w:r>
-        <w:rPr>
-          <w:rFonts w:hint="eastAsia"/>
-        </w:rPr>
-        <w:t>to</w:t>
-      </w:r>
-      <w:r>
-        <w:t xml:space="preserve"> </w:t>
-      </w:r>
-      <w:r>
-        <w:rPr>
-          <w:rFonts w:hint="eastAsia"/>
-        </w:rPr>
-        <w:t>Aug 202</w:t>
-      </w:r>
-      <w:r>
-        <w:t>3</w:t>
-      </w:r>
+        <w:rPr>
+          <w:rFonts w:ascii="Palatino Linotype" w:hAnsi="Palatino Linotype"/>
+          <w:color w:val="000000"/>
+          <w:sz w:val="20"/>
+        </w:rPr>
+      </w:pPr>
     </w:p>
     <w:p>
       <w:pPr>
         <w:rPr>
-          <w:rFonts w:ascii="Palatino Linotype" w:hAnsi="Palatino Linotype" w:cs="Times New Roman"/>
-          <w:sz w:val="20"/>
-          <w:szCs w:val="20"/>
-        </w:rPr>
-      </w:pPr>
-      <w:r>
-        <w:rPr>
-          <w:rFonts w:ascii="Palatino Linotype" w:hAnsi="Palatino Linotype" w:cs="Times New Roman"/>
-          <w:sz w:val="20"/>
-          <w:szCs w:val="20"/>
-        </w:rPr>
-        <w:t xml:space="preserve">Deep Learning (DL) is increasingly employed for software bug and vulnerability detection, extracting program representations from static code sources such as code texts. DL may face challenges from complex code structures, redundant statements, and extensive execution paths, potentially reducing the </w:t>
-      </w:r>
-      <w:r>
-        <w:rPr>
-          <w:rFonts w:ascii="Palatino Linotype" w:hAnsi="Palatino Linotype" w:cs="Times New Roman" w:hint="eastAsia"/>
-          <w:sz w:val="20"/>
-          <w:szCs w:val="20"/>
-          <w:lang w:val="en-US"/>
-        </w:rPr>
-        <w:t>performance</w:t>
-      </w:r>
-      <w:r>
-        <w:rPr>
-          <w:rFonts w:ascii="Palatino Linotype" w:hAnsi="Palatino Linotype" w:cs="Times New Roman"/>
-          <w:sz w:val="20"/>
-          <w:szCs w:val="20"/>
-        </w:rPr>
-        <w:t>.</w:t>
+          <w:rFonts w:ascii="Palatino Linotype" w:hAnsi="Palatino Linotype"/>
+          <w:b/>
+          <w:color w:val="000000"/>
+          <w:sz w:val="20"/>
+        </w:rPr>
+      </w:pPr>
+      <w:r>
+        <w:rPr>
+          <w:rFonts w:ascii="Palatino Linotype" w:hAnsi="Palatino Linotype"/>
+          <w:b/>
+          <w:color w:val="000000"/>
+          <w:sz w:val="20"/>
+        </w:rPr>
+        <w:t>Automatic Reinforcement Learning Model Architecture Design</w:t>
       </w:r>
     </w:p>
     <w:p>
       <w:pPr>
-        <w:spacing w:line="120" w:lineRule="auto"/>
-        <w:rPr>
-          <w:rFonts w:ascii="Segoe UI" w:eastAsia="Segoe UI" w:hAnsi="Segoe UI" w:cs="Segoe UI"/>
-          <w:color w:val="D1D5DB"/>
-          <w:sz w:val="24"/>
-          <w:szCs w:val="24"/>
-          <w:shd w:val="clear" w:color="auto" w:fill="444654"/>
-        </w:rPr>
-      </w:pPr>
+        <w:rPr>
+          <w:rFonts w:ascii="Palatino Linotype" w:hAnsi="Palatino Linotype"/>
+          <w:color w:val="000000"/>
+          <w:sz w:val="20"/>
+        </w:rPr>
+      </w:pPr>
+      <w:r>
+        <w:rPr>
+          <w:rFonts w:ascii="Palatino Linotype" w:hAnsi="Palatino Linotype"/>
+          <w:color w:val="000000"/>
+          <w:sz w:val="20"/>
+        </w:rPr>
+        <w:t>While programmers apply reinforcement learning (RL) to their domain, the first step is to design the RL architecture for their tasks. However, expertise creates a barrier between programmers and RL. We proposed an open-source framework for automating RL architecture search, simplifying RL integration into compilers. We applied it to four optimization problems: image pipelines, neural network code generation, code size reduction, and superoptimization. Experimental results demonstrate its superiority, improving performance and accelerating deployment-stage search by an average of 1.75x (up to 100x).</w:t>
+      </w:r>
     </w:p>
-    <w:p>
-      <w:pPr>
-        <w:rPr>
-          <w:rFonts w:ascii="Palatino Linotype" w:hAnsi="Palatino Linotype" w:cs="Times New Roman"/>
-          <w:sz w:val="20"/>
-          <w:szCs w:val="20"/>
-        </w:rPr>
-      </w:pPr>
-      <w:r>
-        <w:rPr>
-          <w:rFonts w:ascii="Palatino Linotype" w:hAnsi="Palatino Linotype" w:cs="Times New Roman"/>
-          <w:sz w:val="20"/>
-          <w:szCs w:val="20"/>
-        </w:rPr>
-        <w:t xml:space="preserve">We proposed </w:t>
-      </w:r>
-      <w:r>
-        <w:rPr>
-          <w:rFonts w:ascii="Palatino Linotype" w:hAnsi="Palatino Linotype" w:cs="Times New Roman" w:hint="eastAsia"/>
-          <w:sz w:val="20"/>
-          <w:szCs w:val="20"/>
-          <w:lang w:val="en-US"/>
-        </w:rPr>
-        <w:t>using DL</w:t>
-      </w:r>
-      <w:r>
-        <w:rPr>
-          <w:rFonts w:ascii="Palatino Linotype" w:hAnsi="Palatino Linotype" w:cs="Times New Roman"/>
-          <w:sz w:val="20"/>
-          <w:szCs w:val="20"/>
-        </w:rPr>
-        <w:t xml:space="preserve"> to learn program presentations by combining static source code information and dynamic program execution traces. We </w:t>
-      </w:r>
-      <w:r>
-        <w:rPr>
-          <w:rFonts w:ascii="Palatino Linotype" w:hAnsi="Palatino Linotype" w:cs="Times New Roman" w:hint="eastAsia"/>
-          <w:sz w:val="20"/>
-          <w:szCs w:val="20"/>
-        </w:rPr>
-        <w:t xml:space="preserve">have </w:t>
-      </w:r>
-      <w:r>
-        <w:rPr>
-          <w:rFonts w:ascii="Palatino Linotype" w:hAnsi="Palatino Linotype" w:cs="Times New Roman"/>
-          <w:sz w:val="20"/>
-          <w:szCs w:val="20"/>
-        </w:rPr>
-        <w:t xml:space="preserve">successfully uncovered </w:t>
-      </w:r>
-      <w:r>
-        <w:rPr>
-          <w:rFonts w:ascii="Palatino Linotype" w:hAnsi="Palatino Linotype" w:cs="Times New Roman" w:hint="eastAsia"/>
-          <w:sz w:val="20"/>
-          <w:szCs w:val="20"/>
-          <w:lang w:val="en-US"/>
-        </w:rPr>
-        <w:t>more than 100</w:t>
-      </w:r>
-      <w:r>
-        <w:rPr>
-          <w:rFonts w:ascii="Palatino Linotype" w:hAnsi="Palatino Linotype" w:cs="Times New Roman"/>
-          <w:sz w:val="20"/>
-          <w:szCs w:val="20"/>
-        </w:rPr>
-        <w:t xml:space="preserve"> unique vulnerabilities and </w:t>
-      </w:r>
-      <w:r>
-        <w:rPr>
-          <w:rFonts w:ascii="Palatino Linotype" w:hAnsi="Palatino Linotype" w:cs="Times New Roman" w:hint="eastAsia"/>
-          <w:sz w:val="20"/>
-          <w:szCs w:val="20"/>
-        </w:rPr>
-        <w:t xml:space="preserve">yielded </w:t>
-      </w:r>
-      <w:r>
-        <w:rPr>
-          <w:rFonts w:ascii="Palatino Linotype" w:hAnsi="Palatino Linotype" w:cs="Times New Roman"/>
-          <w:sz w:val="20"/>
-          <w:szCs w:val="20"/>
-        </w:rPr>
-        <w:t xml:space="preserve">36 new, unique CVE IDs </w:t>
-      </w:r>
-      <w:r>
-        <w:rPr>
-          <w:rFonts w:ascii="Palatino Linotype" w:hAnsi="Palatino Linotype" w:cs="Times New Roman"/>
-          <w:sz w:val="20"/>
-          <w:szCs w:val="20"/>
-        </w:rPr>
-        <w:t>and</w:t>
-      </w:r>
-      <w:r>
-        <w:rPr>
-          <w:rFonts w:ascii="Palatino Linotype" w:hAnsi="Palatino Linotype" w:cs="Times New Roman"/>
-          <w:sz w:val="20"/>
-          <w:szCs w:val="20"/>
-        </w:rPr>
-        <w:t xml:space="preserve"> outperform 14 prior methods by providing higher</w:t>
-      </w:r>
-      <w:r>
-        <w:rPr>
-          <w:rFonts w:ascii="Palatino Linotype" w:hAnsi="Palatino Linotype" w:cs="Times New Roman"/>
-          <w:sz w:val="20"/>
-          <w:szCs w:val="20"/>
-        </w:rPr>
-        <w:t xml:space="preserve"> accuracy</w:t>
-      </w:r>
-      <w:r>
-        <w:rPr>
-          <w:rFonts w:ascii="Palatino Linotype" w:hAnsi="Palatino Linotype" w:cs="Times New Roman"/>
-          <w:sz w:val="20"/>
-          <w:szCs w:val="20"/>
-        </w:rPr>
-        <w:t>.</w:t>
-      </w:r>
-    </w:p>
-    <w:p>
-      <w:pPr>
-        <w:spacing w:line="120" w:lineRule="auto"/>
-        <w:rPr>
-          <w:rFonts w:ascii="Palatino Linotype" w:hAnsi="Palatino Linotype" w:cs="Times New Roman"/>
-          <w:i/>
-          <w:iCs/>
-          <w:sz w:val="20"/>
-          <w:szCs w:val="20"/>
-        </w:rPr>
-      </w:pPr>
-    </w:p>
-    <w:p>
-      <w:pPr>
-        <w:ind w:left="3"/>
-        <w:rPr>
-          <w:rFonts w:ascii="Palatino Linotype" w:hAnsi="Palatino Linotype" w:cs="Times New Roman"/>
-          <w:i/>
-          <w:iCs/>
-          <w:sz w:val="20"/>
-          <w:szCs w:val="20"/>
-        </w:rPr>
-      </w:pPr>
-      <w:r>
-        <w:rPr>
-          <w:rFonts w:ascii="Palatino Linotype" w:hAnsi="Palatino Linotype" w:cs="Times New Roman" w:hint="eastAsia"/>
-          <w:i/>
-          <w:iCs/>
-          <w:sz w:val="20"/>
-          <w:szCs w:val="20"/>
-        </w:rPr>
-        <w:t>T</w:t>
-      </w:r>
-      <w:r>
-        <w:rPr>
-          <w:rFonts w:ascii="Palatino Linotype" w:hAnsi="Palatino Linotype" w:cs="Times New Roman"/>
-          <w:i/>
-          <w:iCs/>
-          <w:sz w:val="20"/>
-          <w:szCs w:val="20"/>
-        </w:rPr>
-        <w:t xml:space="preserve">his work has led to one paper published in </w:t>
-      </w:r>
-      <w:r>
-        <w:rPr>
-          <w:rFonts w:ascii="Palatino Linotype" w:hAnsi="Palatino Linotype" w:cs="Times New Roman" w:hint="eastAsia"/>
-          <w:b/>
-          <w:bCs/>
-          <w:i/>
-          <w:iCs/>
-          <w:sz w:val="20"/>
-          <w:szCs w:val="20"/>
-          <w:lang w:val="en-US"/>
-        </w:rPr>
-        <w:t xml:space="preserve">ICSE </w:t>
-      </w:r>
-      <w:r>
-        <w:rPr>
-          <w:rFonts w:ascii="Palatino Linotype" w:hAnsi="Palatino Linotype" w:cs="Times New Roman"/>
-          <w:b/>
-          <w:bCs/>
-          <w:i/>
-          <w:iCs/>
-          <w:sz w:val="20"/>
-          <w:szCs w:val="20"/>
-        </w:rPr>
-        <w:t>202</w:t>
-      </w:r>
-      <w:r>
-        <w:rPr>
-          <w:rFonts w:ascii="Palatino Linotype" w:hAnsi="Palatino Linotype" w:cs="Times New Roman" w:hint="eastAsia"/>
-          <w:b/>
-          <w:bCs/>
-          <w:i/>
-          <w:iCs/>
-          <w:sz w:val="20"/>
-          <w:szCs w:val="20"/>
-          <w:lang w:val="en-US"/>
-        </w:rPr>
-        <w:t>4</w:t>
-      </w:r>
-      <w:r>
-        <w:rPr>
-          <w:rFonts w:ascii="Palatino Linotype" w:hAnsi="Palatino Linotype" w:cs="Times New Roman"/>
-          <w:b/>
-          <w:bCs/>
-          <w:i/>
-          <w:iCs/>
-          <w:sz w:val="20"/>
-          <w:szCs w:val="20"/>
-        </w:rPr>
-        <w:t xml:space="preserve"> [</w:t>
-      </w:r>
-      <w:r>
-        <w:rPr>
-          <w:rFonts w:ascii="Palatino Linotype" w:hAnsi="Palatino Linotype" w:cs="Times New Roman"/>
-          <w:b/>
-          <w:bCs/>
-          <w:i/>
-          <w:iCs/>
-          <w:sz w:val="20"/>
-          <w:szCs w:val="20"/>
-          <w:lang w:val="en-US"/>
-        </w:rPr>
-        <w:t>3</w:t>
-      </w:r>
-      <w:r>
-        <w:rPr>
-          <w:rFonts w:ascii="Palatino Linotype" w:hAnsi="Palatino Linotype" w:cs="Times New Roman"/>
-          <w:b/>
-          <w:bCs/>
-          <w:i/>
-          <w:iCs/>
-          <w:sz w:val="20"/>
-          <w:szCs w:val="20"/>
-        </w:rPr>
-        <w:t>]</w:t>
-      </w:r>
-      <w:r>
-        <w:rPr>
-          <w:rFonts w:ascii="Palatino Linotype" w:hAnsi="Palatino Linotype" w:cs="Times New Roman"/>
-          <w:i/>
-          <w:iCs/>
-          <w:sz w:val="20"/>
-          <w:szCs w:val="20"/>
-        </w:rPr>
-        <w:t>.</w:t>
-      </w:r>
-    </w:p>
-    <w:p>
-      <w:pPr>
-        <w:ind w:left="3"/>
-        <w:rPr>
-          <w:rFonts w:ascii="Palatino Linotype" w:hAnsi="Palatino Linotype" w:cs="Times New Roman"/>
-          <w:i/>
-          <w:iCs/>
-          <w:sz w:val="20"/>
-          <w:szCs w:val="20"/>
-          <w:lang w:val="en-US"/>
-        </w:rPr>
-      </w:pPr>
-    </w:p>
-    <w:p>
-      <w:pPr>
-        <w:pStyle w:val="a"/>
-        <w:numPr>
-          <w:ilvl w:val="0"/>
-          <w:numId w:val="4"/>
-        </w:numPr>
-      </w:pPr>
-      <w:r>
-        <w:rPr>
-          <w:rFonts w:hint="eastAsia"/>
-        </w:rPr>
-        <w:t>Automatic Reinforcement Learning Model Architecture Design</w:t>
-      </w:r>
-      <w:r>
-        <w:t xml:space="preserve"> </w:t>
-      </w:r>
-      <w:r>
-        <w:tab/>
-        <w:t xml:space="preserve">  </w:t>
-      </w:r>
-      <w:r>
-        <w:tab/>
-        <w:t xml:space="preserve">         July 2020 to </w:t>
-      </w:r>
-      <w:r>
-        <w:rPr>
-          <w:rFonts w:hint="eastAsia"/>
-        </w:rPr>
-        <w:t>Apr 2022</w:t>
-      </w:r>
-    </w:p>
+    <w:bookmarkEnd w:id="9"/>
     <w:p>
       <w:pPr>
         <w:ind w:left="3"/>
         <w:jc w:val="both"/>
         <w:rPr>
-          <w:rFonts w:ascii="Palatino Linotype" w:hAnsi="Palatino Linotype" w:cs="Times New Roman"/>
-          <w:sz w:val="20"/>
-          <w:szCs w:val="20"/>
-        </w:rPr>
-      </w:pPr>
-      <w:r>
-        <w:rPr>
           <w:rFonts w:ascii="Palatino Linotype" w:hAnsi="Palatino Linotype" w:cs="Times New Roman" w:hint="eastAsia"/>
           <w:sz w:val="20"/>
           <w:szCs w:val="20"/>
-        </w:rPr>
-        <w:t xml:space="preserve">While programmers apply </w:t>
-      </w:r>
-      <w:r>
-        <w:rPr>
-          <w:rFonts w:ascii="Palatino Linotype" w:hAnsi="Palatino Linotype" w:cs="Times New Roman" w:hint="eastAsia"/>
-          <w:sz w:val="20"/>
-          <w:szCs w:val="20"/>
           <w:lang w:val="en-US"/>
         </w:rPr>
-        <w:t xml:space="preserve">reinforcement </w:t>
-      </w:r>
-      <w:r>
-        <w:rPr>
-          <w:rFonts w:ascii="Palatino Linotype" w:hAnsi="Palatino Linotype" w:cs="Times New Roman" w:hint="eastAsia"/>
-          <w:sz w:val="20"/>
-          <w:szCs w:val="20"/>
-        </w:rPr>
-        <w:t>learning</w:t>
-      </w:r>
-      <w:r>
-        <w:rPr>
-          <w:rFonts w:ascii="Palatino Linotype" w:hAnsi="Palatino Linotype" w:cs="Times New Roman" w:hint="eastAsia"/>
-          <w:sz w:val="20"/>
-          <w:szCs w:val="20"/>
-          <w:lang w:val="en-US"/>
-        </w:rPr>
-        <w:t xml:space="preserve"> (RL)</w:t>
-      </w:r>
-      <w:r>
-        <w:rPr>
-          <w:rFonts w:ascii="Palatino Linotype" w:hAnsi="Palatino Linotype" w:cs="Times New Roman" w:hint="eastAsia"/>
-          <w:sz w:val="20"/>
-          <w:szCs w:val="20"/>
-        </w:rPr>
-        <w:t xml:space="preserve"> to their domain, the first step is to design the </w:t>
-      </w:r>
-      <w:r>
-        <w:rPr>
-          <w:rFonts w:ascii="Palatino Linotype" w:hAnsi="Palatino Linotype" w:cs="Times New Roman" w:hint="eastAsia"/>
-          <w:sz w:val="20"/>
-          <w:szCs w:val="20"/>
-          <w:lang w:val="en-US"/>
-        </w:rPr>
-        <w:t>RL</w:t>
-      </w:r>
-      <w:r>
-        <w:rPr>
-          <w:rFonts w:ascii="Palatino Linotype" w:hAnsi="Palatino Linotype" w:cs="Times New Roman" w:hint="eastAsia"/>
-          <w:sz w:val="20"/>
-          <w:szCs w:val="20"/>
-        </w:rPr>
-        <w:t xml:space="preserve"> architecture for their tasks. </w:t>
-      </w:r>
-      <w:r>
-        <w:rPr>
-          <w:rFonts w:ascii="Palatino Linotype" w:hAnsi="Palatino Linotype" w:cs="Times New Roman" w:hint="eastAsia"/>
-          <w:sz w:val="20"/>
-          <w:szCs w:val="20"/>
-          <w:lang w:val="en-US"/>
-        </w:rPr>
-        <w:t>However, e</w:t>
-      </w:r>
-      <w:r>
-        <w:rPr>
-          <w:rFonts w:ascii="Palatino Linotype" w:hAnsi="Palatino Linotype" w:cs="Times New Roman" w:hint="eastAsia"/>
-          <w:sz w:val="20"/>
-          <w:szCs w:val="20"/>
-        </w:rPr>
-        <w:t xml:space="preserve">xpertise creates a barrier between programmers and </w:t>
-      </w:r>
-      <w:r>
-        <w:rPr>
-          <w:rFonts w:ascii="Palatino Linotype" w:hAnsi="Palatino Linotype" w:cs="Times New Roman" w:hint="eastAsia"/>
-          <w:sz w:val="20"/>
-          <w:szCs w:val="20"/>
-          <w:lang w:val="en-US"/>
-        </w:rPr>
-        <w:t>RL</w:t>
-      </w:r>
-      <w:r>
-        <w:rPr>
-          <w:rFonts w:ascii="Palatino Linotype" w:hAnsi="Palatino Linotype" w:cs="Times New Roman" w:hint="eastAsia"/>
-          <w:sz w:val="20"/>
-          <w:szCs w:val="20"/>
-        </w:rPr>
-        <w:t>.</w:t>
-      </w:r>
-    </w:p>
-    <w:p>
-      <w:pPr>
-        <w:spacing w:line="120" w:lineRule="auto"/>
-        <w:rPr>
-          <w:rFonts w:ascii="Palatino Linotype" w:hAnsi="Palatino Linotype" w:cs="Times New Roman"/>
-          <w:sz w:val="20"/>
-          <w:szCs w:val="20"/>
-        </w:rPr>
-      </w:pPr>
-    </w:p>
-    <w:p>
-      <w:pPr>
-        <w:ind w:left="3"/>
-        <w:jc w:val="both"/>
-        <w:rPr>
-          <w:rFonts w:ascii="Palatino Linotype" w:hAnsi="Palatino Linotype" w:cs="Times New Roman"/>
-          <w:sz w:val="20"/>
-          <w:szCs w:val="20"/>
-        </w:rPr>
-      </w:pPr>
-      <w:r>
-        <w:rPr>
-          <w:rFonts w:ascii="Palatino Linotype" w:hAnsi="Palatino Linotype" w:cs="Times New Roman" w:hint="eastAsia"/>
-          <w:sz w:val="20"/>
-          <w:szCs w:val="20"/>
-        </w:rPr>
-        <w:t>We proposed an open-source framework for automating RL architecture search, simplifying RL integration into compilers. We applied it to four optimization problems: image pipelines, neural network code generation, code size reduction, and superoptimization. Experimental results demonstrate its superiority, improving performance and accelerating deployment-stage search by an average of 1.75x (up to 100x).</w:t>
-      </w:r>
-    </w:p>
-    <w:p>
-      <w:pPr>
-        <w:spacing w:line="120" w:lineRule="auto"/>
-        <w:rPr>
-          <w:rFonts w:ascii="Palatino Linotype" w:hAnsi="Palatino Linotype" w:cs="Times New Roman"/>
-          <w:sz w:val="20"/>
-          <w:szCs w:val="20"/>
-        </w:rPr>
-      </w:pPr>
-    </w:p>
-    <w:p>
-      <w:pPr>
-        <w:ind w:left="3"/>
-        <w:rPr>
-          <w:rFonts w:ascii="Palatino Linotype" w:hAnsi="Palatino Linotype" w:cs="Times New Roman"/>
-          <w:i/>
-          <w:iCs/>
-          <w:sz w:val="20"/>
-          <w:szCs w:val="20"/>
-          <w:lang w:val="en-US"/>
-        </w:rPr>
-      </w:pPr>
-      <w:r>
-        <w:rPr>
-          <w:rFonts w:ascii="Palatino Linotype" w:hAnsi="Palatino Linotype" w:cs="Times New Roman" w:hint="eastAsia"/>
-          <w:i/>
-          <w:iCs/>
-          <w:sz w:val="20"/>
-          <w:szCs w:val="20"/>
-        </w:rPr>
-        <w:t>T</w:t>
-      </w:r>
-      <w:r>
-        <w:rPr>
-          <w:rFonts w:ascii="Palatino Linotype" w:hAnsi="Palatino Linotype" w:cs="Times New Roman"/>
-          <w:i/>
-          <w:iCs/>
-          <w:sz w:val="20"/>
-          <w:szCs w:val="20"/>
-        </w:rPr>
-        <w:t xml:space="preserve">his work has led to one paper published in </w:t>
-      </w:r>
-      <w:r>
-        <w:rPr>
-          <w:rFonts w:ascii="Palatino Linotype" w:hAnsi="Palatino Linotype" w:cs="Times New Roman"/>
-          <w:b/>
-          <w:bCs/>
-          <w:i/>
-          <w:iCs/>
-          <w:sz w:val="20"/>
-          <w:szCs w:val="20"/>
-        </w:rPr>
-        <w:t>CC 2022 [</w:t>
-      </w:r>
-      <w:r>
-        <w:rPr>
-          <w:rFonts w:ascii="Palatino Linotype" w:hAnsi="Palatino Linotype" w:cs="Times New Roman"/>
-          <w:b/>
-          <w:bCs/>
-          <w:i/>
-          <w:iCs/>
-          <w:sz w:val="20"/>
-          <w:szCs w:val="20"/>
-          <w:lang w:val="en-US"/>
-        </w:rPr>
-        <w:t>4</w:t>
-      </w:r>
-      <w:r>
-        <w:rPr>
-          <w:rFonts w:ascii="Palatino Linotype" w:hAnsi="Palatino Linotype" w:cs="Times New Roman"/>
-          <w:b/>
-          <w:bCs/>
-          <w:i/>
-          <w:iCs/>
-          <w:sz w:val="20"/>
-          <w:szCs w:val="20"/>
-        </w:rPr>
-        <w:t>]</w:t>
-      </w:r>
-      <w:r>
-        <w:rPr>
-          <w:rFonts w:ascii="Palatino Linotype" w:hAnsi="Palatino Linotype" w:cs="Times New Roman"/>
-          <w:i/>
-          <w:iCs/>
-          <w:sz w:val="20"/>
-          <w:szCs w:val="20"/>
-        </w:rPr>
-        <w:t>.</w:t>
-      </w:r>
-      <w:r>
-        <w:rPr>
-          <w:rFonts w:ascii="Palatino Linotype" w:hAnsi="Palatino Linotype" w:cs="Times New Roman" w:hint="eastAsia"/>
-          <w:i/>
-          <w:iCs/>
-          <w:sz w:val="20"/>
-          <w:szCs w:val="20"/>
-          <w:lang w:val="en-US"/>
-        </w:rPr>
-        <w:t xml:space="preserve"> Collaboration with </w:t>
-      </w:r>
-      <w:r>
-        <w:rPr>
-          <w:rFonts w:ascii="Palatino Linotype" w:hAnsi="Palatino Linotype" w:cs="Times New Roman" w:hint="eastAsia"/>
-          <w:b/>
-          <w:bCs/>
-          <w:i/>
-          <w:iCs/>
-          <w:sz w:val="20"/>
-          <w:szCs w:val="20"/>
-          <w:lang w:val="en-US"/>
-        </w:rPr>
-        <w:t>Meta AI research lab</w:t>
-      </w:r>
-      <w:r>
-        <w:rPr>
-          <w:rFonts w:ascii="Palatino Linotype" w:hAnsi="Palatino Linotype" w:cs="Times New Roman" w:hint="eastAsia"/>
-          <w:i/>
-          <w:iCs/>
-          <w:sz w:val="20"/>
-          <w:szCs w:val="20"/>
-          <w:lang w:val="en-US"/>
-        </w:rPr>
-        <w:t>.</w:t>
-      </w:r>
-    </w:p>
-    <w:p>
-      <w:pPr>
-        <w:ind w:left="3"/>
-        <w:rPr>
-          <w:rFonts w:ascii="Palatino Linotype" w:hAnsi="Palatino Linotype" w:cs="Times New Roman"/>
-          <w:i/>
-          <w:iCs/>
-          <w:sz w:val="20"/>
-          <w:szCs w:val="20"/>
-          <w:lang w:val="en-US"/>
-        </w:rPr>
-      </w:pPr>
-    </w:p>
-    <w:p>
-      <w:pPr>
-        <w:pStyle w:val="a"/>
-        <w:numPr>
-          <w:ilvl w:val="0"/>
-          <w:numId w:val="4"/>
-        </w:numPr>
-      </w:pPr>
-      <w:r>
-        <w:t>Deep Program Structure Modeling using Graph Neural Networks</w:t>
-      </w:r>
-      <w:r>
-        <w:rPr>
-          <w:rFonts w:hint="eastAsia"/>
-        </w:rPr>
-        <w:tab/>
-        <w:t xml:space="preserve">          </w:t>
-      </w:r>
-      <w:r>
-        <w:tab/>
-        <w:t xml:space="preserve"> June</w:t>
-      </w:r>
-      <w:r>
-        <w:t xml:space="preserve"> 2019 </w:t>
-      </w:r>
-      <w:r>
-        <w:rPr>
-          <w:rFonts w:hint="eastAsia"/>
-        </w:rPr>
-        <w:t>to</w:t>
-      </w:r>
-      <w:r>
-        <w:t xml:space="preserve"> </w:t>
-      </w:r>
-      <w:r>
-        <w:rPr>
-          <w:rFonts w:hint="eastAsia"/>
-        </w:rPr>
-        <w:t>January 2021</w:t>
-      </w:r>
-    </w:p>
-    <w:p>
-      <w:pPr>
-        <w:ind w:left="3"/>
-        <w:jc w:val="both"/>
-        <w:rPr>
-          <w:rFonts w:ascii="Palatino Linotype" w:hAnsi="Palatino Linotype" w:cs="Times New Roman"/>
-          <w:sz w:val="20"/>
-          <w:szCs w:val="20"/>
-        </w:rPr>
-      </w:pPr>
-      <w:r>
-        <w:rPr>
-          <w:rFonts w:ascii="Palatino Linotype" w:hAnsi="Palatino Linotype" w:cs="Times New Roman"/>
-          <w:sz w:val="20"/>
-          <w:szCs w:val="20"/>
-        </w:rPr>
-        <w:t>DL</w:t>
-      </w:r>
-      <w:r>
-        <w:rPr>
-          <w:rFonts w:ascii="Palatino Linotype" w:hAnsi="Palatino Linotype" w:cs="Times New Roman" w:hint="eastAsia"/>
-          <w:sz w:val="20"/>
-          <w:szCs w:val="20"/>
-        </w:rPr>
-        <w:t xml:space="preserve"> is promising for code-related tasks like compiler optimization. An important factor</w:t>
-      </w:r>
-      <w:r>
-        <w:rPr>
-          <w:rFonts w:ascii="Palatino Linotype" w:hAnsi="Palatino Linotype" w:cs="Times New Roman" w:hint="eastAsia"/>
-          <w:sz w:val="20"/>
-          <w:szCs w:val="20"/>
-          <w:lang w:val="en-US"/>
-        </w:rPr>
-        <w:t xml:space="preserve"> </w:t>
-      </w:r>
-      <w:r>
-        <w:rPr>
-          <w:rFonts w:ascii="Palatino Linotype" w:hAnsi="Palatino Linotype" w:cs="Times New Roman"/>
-          <w:sz w:val="20"/>
-          <w:szCs w:val="20"/>
-        </w:rPr>
-        <w:t>is having the right representation to characterize the model input for the given task. Existing approaches in the area typically treat the program structure as a sequential sequence but fail to capitalize on the rich semantics of data and control flow information, for which graphs are a proven representation structure.</w:t>
-      </w:r>
-    </w:p>
-    <w:p>
-      <w:pPr>
-        <w:spacing w:line="120" w:lineRule="auto"/>
-        <w:rPr>
-          <w:rFonts w:ascii="Palatino Linotype" w:hAnsi="Palatino Linotype" w:cs="Times New Roman"/>
-          <w:sz w:val="20"/>
-          <w:szCs w:val="20"/>
-        </w:rPr>
-      </w:pPr>
-    </w:p>
-    <w:p>
-      <w:pPr>
-        <w:ind w:left="3"/>
-        <w:jc w:val="both"/>
-        <w:rPr>
-          <w:rFonts w:ascii="Palatino Linotype" w:hAnsi="Palatino Linotype" w:cs="Times New Roman"/>
-          <w:sz w:val="20"/>
-          <w:szCs w:val="20"/>
-          <w:lang w:val="en-US"/>
-        </w:rPr>
-      </w:pPr>
-      <w:bookmarkStart w:id="9" w:name="OLE_LINK8"/>
-      <w:r>
-        <w:rPr>
-          <w:rFonts w:ascii="Palatino Linotype" w:hAnsi="Palatino Linotype" w:cs="Times New Roman"/>
-          <w:sz w:val="20"/>
-          <w:szCs w:val="20"/>
-          <w:lang w:val="en-US"/>
-        </w:rPr>
-        <w:t>We introduce a novel Graph Neural Network (GNN) approach to learn rich code representations from program graphs, effectively capturing diverse code relationships—including data flow and control flow—that are critical for downstream tasks. We apply our method to four classification tasks, and experimental results consistently demonstrate its superiority over competing approaches.</w:t>
-      </w:r>
-      <w:bookmarkEnd w:id="9"/>
-      <w:r>
-        <w:rPr>
-          <w:rFonts w:ascii="Palatino Linotype" w:hAnsi="Palatino Linotype" w:cs="Times New Roman" w:hint="eastAsia"/>
-          <w:sz w:val="20"/>
-          <w:szCs w:val="20"/>
-          <w:lang w:val="en-US"/>
-        </w:rPr>
-        <w:t xml:space="preserve"> </w:t>
-      </w:r>
-    </w:p>
-    <w:p>
-      <w:pPr>
-        <w:ind w:left="3"/>
-        <w:jc w:val="both"/>
-        <w:rPr>
-          <w:rFonts w:ascii="Palatino Linotype" w:hAnsi="Palatino Linotype" w:cs="Times New Roman"/>
-          <w:i/>
-          <w:iCs/>
-          <w:sz w:val="20"/>
-          <w:szCs w:val="20"/>
-        </w:rPr>
-      </w:pPr>
-    </w:p>
-    <w:p>
-      <w:pPr>
-        <w:ind w:left="3"/>
-        <w:jc w:val="both"/>
-        <w:rPr>
-          <w:rFonts w:ascii="Palatino Linotype" w:hAnsi="Palatino Linotype" w:cs="Times New Roman"/>
-          <w:sz w:val="20"/>
-          <w:szCs w:val="20"/>
-          <w:lang w:val="en-US"/>
-        </w:rPr>
-      </w:pPr>
-      <w:r>
-        <w:rPr>
-          <w:rFonts w:ascii="Palatino Linotype" w:hAnsi="Palatino Linotype" w:cs="Times New Roman"/>
-          <w:i/>
-          <w:iCs/>
-          <w:sz w:val="20"/>
-          <w:szCs w:val="20"/>
-        </w:rPr>
-        <w:t xml:space="preserve">This work has led to </w:t>
-      </w:r>
-      <w:r>
-        <w:rPr>
-          <w:rFonts w:ascii="Palatino Linotype" w:hAnsi="Palatino Linotype" w:cs="Times New Roman" w:hint="eastAsia"/>
-          <w:i/>
-          <w:iCs/>
-          <w:sz w:val="20"/>
-          <w:szCs w:val="20"/>
-          <w:lang w:val="en-US"/>
-        </w:rPr>
-        <w:t xml:space="preserve">3 </w:t>
-      </w:r>
-      <w:r>
-        <w:rPr>
-          <w:rFonts w:ascii="Palatino Linotype" w:hAnsi="Palatino Linotype" w:cs="Times New Roman"/>
-          <w:i/>
-          <w:iCs/>
-          <w:sz w:val="20"/>
-          <w:szCs w:val="20"/>
-        </w:rPr>
-        <w:t>paper</w:t>
-      </w:r>
-      <w:r>
-        <w:rPr>
-          <w:rFonts w:ascii="Palatino Linotype" w:hAnsi="Palatino Linotype" w:cs="Times New Roman" w:hint="eastAsia"/>
-          <w:i/>
-          <w:iCs/>
-          <w:sz w:val="20"/>
-          <w:szCs w:val="20"/>
-          <w:lang w:val="en-US"/>
-        </w:rPr>
-        <w:t>s</w:t>
-      </w:r>
-      <w:r>
-        <w:rPr>
-          <w:rFonts w:ascii="Palatino Linotype" w:hAnsi="Palatino Linotype" w:cs="Times New Roman"/>
-          <w:i/>
-          <w:iCs/>
-          <w:sz w:val="20"/>
-          <w:szCs w:val="20"/>
-        </w:rPr>
-        <w:t xml:space="preserve"> published </w:t>
-      </w:r>
-      <w:r>
-        <w:rPr>
-          <w:rFonts w:ascii="Palatino Linotype" w:hAnsi="Palatino Linotype" w:cs="Times New Roman" w:hint="eastAsia"/>
-          <w:i/>
-          <w:iCs/>
-          <w:sz w:val="20"/>
-          <w:szCs w:val="20"/>
-          <w:lang w:val="en-US"/>
-        </w:rPr>
-        <w:t xml:space="preserve">in </w:t>
-      </w:r>
-      <w:r>
-        <w:rPr>
-          <w:rFonts w:ascii="Palatino Linotype" w:hAnsi="Palatino Linotype" w:cs="Times New Roman"/>
-          <w:b/>
-          <w:bCs/>
-          <w:i/>
-          <w:iCs/>
-          <w:sz w:val="20"/>
-          <w:szCs w:val="20"/>
-        </w:rPr>
-        <w:t>IEEE TIFS[</w:t>
-      </w:r>
-      <w:r>
-        <w:rPr>
-          <w:rFonts w:ascii="Palatino Linotype" w:hAnsi="Palatino Linotype" w:cs="Times New Roman"/>
-          <w:b/>
-          <w:bCs/>
-          <w:i/>
-          <w:iCs/>
-          <w:sz w:val="20"/>
-          <w:szCs w:val="20"/>
-          <w:lang w:val="en-US"/>
-        </w:rPr>
-        <w:t>5</w:t>
-      </w:r>
-      <w:r>
-        <w:rPr>
-          <w:rFonts w:ascii="Palatino Linotype" w:hAnsi="Palatino Linotype" w:cs="Times New Roman"/>
-          <w:b/>
-          <w:bCs/>
-          <w:i/>
-          <w:iCs/>
-          <w:sz w:val="20"/>
-          <w:szCs w:val="20"/>
-        </w:rPr>
-        <w:t>]</w:t>
-      </w:r>
-      <w:r>
-        <w:rPr>
-          <w:rFonts w:ascii="Palatino Linotype" w:hAnsi="Palatino Linotype" w:cs="Times New Roman"/>
-          <w:b/>
-          <w:bCs/>
-          <w:i/>
-          <w:iCs/>
-          <w:sz w:val="20"/>
-          <w:szCs w:val="20"/>
-          <w:lang w:val="en-US"/>
-        </w:rPr>
-        <w:t xml:space="preserve">, </w:t>
-      </w:r>
-      <w:r>
-        <w:rPr>
-          <w:rFonts w:ascii="Palatino Linotype" w:hAnsi="Palatino Linotype" w:cs="Times New Roman"/>
-          <w:b/>
-          <w:bCs/>
-          <w:i/>
-          <w:iCs/>
-          <w:sz w:val="20"/>
-          <w:szCs w:val="20"/>
-        </w:rPr>
-        <w:t>PACT 2020</w:t>
-      </w:r>
-      <w:r>
-        <w:rPr>
-          <w:rFonts w:ascii="Palatino Linotype" w:hAnsi="Palatino Linotype" w:cs="Times New Roman"/>
-          <w:b/>
-          <w:bCs/>
-          <w:i/>
-          <w:iCs/>
-          <w:sz w:val="20"/>
-          <w:szCs w:val="20"/>
-        </w:rPr>
-        <w:t xml:space="preserve"> and</w:t>
-      </w:r>
-      <w:r>
-        <w:rPr>
-          <w:rFonts w:ascii="Palatino Linotype" w:hAnsi="Palatino Linotype" w:cs="Times New Roman"/>
-          <w:b/>
-          <w:bCs/>
-          <w:sz w:val="20"/>
-          <w:szCs w:val="20"/>
-        </w:rPr>
-        <w:t xml:space="preserve"> </w:t>
-      </w:r>
-      <w:r>
-        <w:rPr>
-          <w:rFonts w:ascii="Palatino Linotype" w:hAnsi="Palatino Linotype" w:cs="Times New Roman"/>
-          <w:b/>
-          <w:bCs/>
-          <w:i/>
-          <w:iCs/>
-          <w:sz w:val="20"/>
-          <w:szCs w:val="20"/>
-        </w:rPr>
-        <w:t>JISA</w:t>
-      </w:r>
-      <w:r>
-        <w:rPr>
-          <w:rFonts w:ascii="Palatino Linotype" w:hAnsi="Palatino Linotype" w:cs="Times New Roman" w:hint="eastAsia"/>
-          <w:i/>
-          <w:iCs/>
-          <w:sz w:val="20"/>
-          <w:szCs w:val="20"/>
-          <w:lang w:val="en-US"/>
-        </w:rPr>
-        <w:t xml:space="preserve">. </w:t>
-      </w:r>
+      </w:pPr>
     </w:p>
     <w:sectPr>
       <w:headerReference w:type="even" r:id="rId8"/>
       <w:headerReference w:type="default" r:id="rId9"/>
-      <w:headerReference w:type="first" r:id="rId10"/>
+      <w:footerReference w:type="even" r:id="rId10"/>
+      <w:footerReference w:type="default" r:id="rId11"/>
+      <w:headerReference w:type="first" r:id="rId12"/>
+      <w:footerReference w:type="first" r:id="rId13"/>
       <w:pgSz w:w="11906" w:h="16838"/>
       <w:pgMar w:top="907" w:right="1134" w:bottom="907" w:left="1134" w:header="709" w:footer="709" w:gutter="0"/>
       <w:cols w:space="708"/>
@@ -5257,7 +3501,7 @@
 </file>
 
 <file path=word/endnotes.xml><?xml version="1.0" encoding="utf-8"?>
-<w:endnotes xmlns:wpc="http://schemas.microsoft.com/office/word/2010/wordprocessingCanvas" xmlns:cx="http://schemas.microsoft.com/office/drawing/2014/chartex" xmlns:cx1="http://schemas.microsoft.com/office/drawing/2015/9/8/chartex" xmlns:cx2="http://schemas.microsoft.com/office/drawing/2015/10/21/chartex" xmlns:cx3="http://schemas.microsoft.com/office/drawing/2016/5/9/chartex" xmlns:cx4="http://schemas.microsoft.com/office/drawing/2016/5/10/chartex" xmlns:cx5="http://schemas.microsoft.com/office/drawing/2016/5/11/chartex" xmlns:cx6="http://schemas.microsoft.com/office/drawing/2016/5/12/chartex" xmlns:cx7="http://schemas.microsoft.com/office/drawing/2016/5/13/chartex" xmlns:cx8="http://schemas.microsoft.com/office/drawing/2016/5/14/chartex" xmlns:mc="http://schemas.openxmlformats.org/markup-compatibility/2006" xmlns:aink="http://schemas.microsoft.com/office/drawing/2016/ink" xmlns:am3d="http://schemas.microsoft.com/office/drawing/2017/model3d" xmlns:o="urn:schemas-microsoft-com:office:office" xmlns:oel="http://schemas.microsoft.com/office/2019/extlst" xmlns:r="http://schemas.openxmlformats.org/officeDocument/2006/relationships" xmlns:m="http://schemas.openxmlformats.org/officeDocument/2006/math" xmlns:v="urn:schemas-microsoft-com:vml" xmlns:wp14="http://schemas.microsoft.com/office/word/2010/wordprocessingDrawing" xmlns:wp="http://schemas.openxmlformats.org/drawingml/2006/wordprocessingDrawing" xmlns:w10="urn:schemas-microsoft-com:office:word" xmlns:w="http://schemas.openxmlformats.org/wordprocessingml/2006/main" xmlns:w14="http://schemas.microsoft.com/office/word/2010/wordml" xmlns:w15="http://schemas.microsoft.com/office/word/2012/wordml" xmlns:w16cex="http://schemas.microsoft.com/office/word/2018/wordml/cex" xmlns:w16cid="http://schemas.microsoft.com/office/word/2016/wordml/cid" xmlns:w16="http://schemas.microsoft.com/office/word/2018/wordml" xmlns:w16du="http://schemas.microsoft.com/office/word/2023/wordml/word16du" xmlns:w16sdtdh="http://schemas.microsoft.com/office/word/2020/wordml/sdtdatahash" xmlns:w16sdtfl="http://schemas.microsoft.com/office/word/2024/wordml/sdtformatlock" xmlns:w16se="http://schemas.microsoft.com/office/word/2015/wordml/symex" xmlns:wpg="http://schemas.microsoft.com/office/word/2010/wordprocessingGroup" xmlns:wpi="http://schemas.microsoft.com/office/word/2010/wordprocessingInk" xmlns:wne="http://schemas.microsoft.com/office/word/2006/wordml" xmlns:wps="http://schemas.microsoft.com/office/word/2010/wordprocessingShape" mc:Ignorable="w14 w15 w16se w16cid w16 w16cex w16sdtdh w16sdtfl w16du wp14">
+<w:endnotes xmlns:wpc="http://schemas.microsoft.com/office/word/2010/wordprocessingCanvas" xmlns:cx="http://schemas.microsoft.com/office/drawing/2014/chartex" xmlns:cx1="http://schemas.microsoft.com/office/drawing/2015/9/8/chartex" xmlns:cx2="http://schemas.microsoft.com/office/drawing/2015/10/21/chartex" xmlns:cx3="http://schemas.microsoft.com/office/drawing/2016/5/9/chartex" xmlns:cx4="http://schemas.microsoft.com/office/drawing/2016/5/10/chartex" xmlns:cx5="http://schemas.microsoft.com/office/drawing/2016/5/11/chartex" xmlns:cx6="http://schemas.microsoft.com/office/drawing/2016/5/12/chartex" xmlns:cx7="http://schemas.microsoft.com/office/drawing/2016/5/13/chartex" xmlns:cx8="http://schemas.microsoft.com/office/drawing/2016/5/14/chartex" xmlns:mc="http://schemas.openxmlformats.org/markup-compatibility/2006" xmlns:m="http://schemas.openxmlformats.org/officeDocument/2006/math" xmlns:aink="http://schemas.microsoft.com/office/drawing/2016/ink" xmlns:am3d="http://schemas.microsoft.com/office/drawing/2017/model3d" xmlns:oel="http://schemas.microsoft.com/office/2019/extlst" xmlns:r="http://schemas.openxmlformats.org/officeDocument/2006/relationships" xmlns:wp14="http://schemas.microsoft.com/office/word/2010/wordprocessingDrawing" xmlns:wp="http://schemas.openxmlformats.org/drawingml/2006/wordprocessingDrawing" xmlns:wpg="http://schemas.microsoft.com/office/word/2010/wordprocessingGroup" xmlns:wpi="http://schemas.microsoft.com/office/word/2010/wordprocessingInk" xmlns:wps="http://schemas.microsoft.com/office/word/2010/wordprocessingShape" xmlns:o="urn:schemas-microsoft-com:office:office" xmlns:v="urn:schemas-microsoft-com:vml" xmlns:w10="urn:schemas-microsoft-com:office:word" xmlns:w="http://schemas.openxmlformats.org/wordprocessingml/2006/main" xmlns:w14="http://schemas.microsoft.com/office/word/2010/wordml" xmlns:w15="http://schemas.microsoft.com/office/word/2012/wordml" xmlns:w16cei="http://schemas.microsoft.com/office/word/2026/wordml/cei" xmlns:w16cex="http://schemas.microsoft.com/office/word/2018/wordml/cex" xmlns:w16cid="http://schemas.microsoft.com/office/word/2016/wordml/cid" xmlns:w16="http://schemas.microsoft.com/office/word/2018/wordml" xmlns:w16sdtdh="http://schemas.microsoft.com/office/word/2020/wordml/sdtdatahash" xmlns:w16sdtfl="http://schemas.microsoft.com/office/word/2024/wordml/sdtformatlock" xmlns:w16se="http://schemas.microsoft.com/office/word/2015/wordml/symex" xmlns:w16du="http://schemas.microsoft.com/office/word/2023/wordml/word16du" xmlns:wne="http://schemas.microsoft.com/office/word/2006/wordml" mc:Ignorable="w14 w15 w16se w16cid w16 w16cex w16sdtdh w16sdtfl w16du wp14">
   <w:endnote w:type="separator" w:id="-1">
     <w:p>
       <w:r>
@@ -5275,8 +3519,38 @@
 </w:endnotes>
 </file>
 
+<file path=word/footer1.xml><?xml version="1.0" encoding="utf-8"?>
+<w:ftr xmlns:wpc="http://schemas.microsoft.com/office/word/2010/wordprocessingCanvas" xmlns:cx="http://schemas.microsoft.com/office/drawing/2014/chartex" xmlns:cx1="http://schemas.microsoft.com/office/drawing/2015/9/8/chartex" xmlns:cx2="http://schemas.microsoft.com/office/drawing/2015/10/21/chartex" xmlns:cx3="http://schemas.microsoft.com/office/drawing/2016/5/9/chartex" xmlns:cx4="http://schemas.microsoft.com/office/drawing/2016/5/10/chartex" xmlns:cx5="http://schemas.microsoft.com/office/drawing/2016/5/11/chartex" xmlns:cx6="http://schemas.microsoft.com/office/drawing/2016/5/12/chartex" xmlns:cx7="http://schemas.microsoft.com/office/drawing/2016/5/13/chartex" xmlns:cx8="http://schemas.microsoft.com/office/drawing/2016/5/14/chartex" xmlns:mc="http://schemas.openxmlformats.org/markup-compatibility/2006" xmlns:m="http://schemas.openxmlformats.org/officeDocument/2006/math" xmlns:aink="http://schemas.microsoft.com/office/drawing/2016/ink" xmlns:am3d="http://schemas.microsoft.com/office/drawing/2017/model3d" xmlns:oel="http://schemas.microsoft.com/office/2019/extlst" xmlns:r="http://schemas.openxmlformats.org/officeDocument/2006/relationships" xmlns:wp14="http://schemas.microsoft.com/office/word/2010/wordprocessingDrawing" xmlns:wp="http://schemas.openxmlformats.org/drawingml/2006/wordprocessingDrawing" xmlns:wpg="http://schemas.microsoft.com/office/word/2010/wordprocessingGroup" xmlns:wpi="http://schemas.microsoft.com/office/word/2010/wordprocessingInk" xmlns:wps="http://schemas.microsoft.com/office/word/2010/wordprocessingShape" xmlns:o="urn:schemas-microsoft-com:office:office" xmlns:v="urn:schemas-microsoft-com:vml" xmlns:w10="urn:schemas-microsoft-com:office:word" xmlns:w="http://schemas.openxmlformats.org/wordprocessingml/2006/main" xmlns:w14="http://schemas.microsoft.com/office/word/2010/wordml" xmlns:w15="http://schemas.microsoft.com/office/word/2012/wordml" xmlns:w16cei="http://schemas.microsoft.com/office/word/2026/wordml/cei" xmlns:w16cex="http://schemas.microsoft.com/office/word/2018/wordml/cex" xmlns:w16cid="http://schemas.microsoft.com/office/word/2016/wordml/cid" xmlns:w16="http://schemas.microsoft.com/office/word/2018/wordml" xmlns:w16sdtdh="http://schemas.microsoft.com/office/word/2020/wordml/sdtdatahash" xmlns:w16sdtfl="http://schemas.microsoft.com/office/word/2024/wordml/sdtformatlock" xmlns:w16se="http://schemas.microsoft.com/office/word/2015/wordml/symex" xmlns:w16du="http://schemas.microsoft.com/office/word/2023/wordml/word16du" xmlns:wne="http://schemas.microsoft.com/office/word/2006/wordml" mc:Ignorable="w14 w15 w16se w16cid w16 w16cex w16sdtdh w16sdtfl w16du wp14">
+  <w:p>
+    <w:pPr>
+      <w:pStyle w:val="Footer"/>
+    </w:pPr>
+  </w:p>
+</w:ftr>
+</file>
+
+<file path=word/footer2.xml><?xml version="1.0" encoding="utf-8"?>
+<w:ftr xmlns:wpc="http://schemas.microsoft.com/office/word/2010/wordprocessingCanvas" xmlns:cx="http://schemas.microsoft.com/office/drawing/2014/chartex" xmlns:cx1="http://schemas.microsoft.com/office/drawing/2015/9/8/chartex" xmlns:cx2="http://schemas.microsoft.com/office/drawing/2015/10/21/chartex" xmlns:cx3="http://schemas.microsoft.com/office/drawing/2016/5/9/chartex" xmlns:cx4="http://schemas.microsoft.com/office/drawing/2016/5/10/chartex" xmlns:cx5="http://schemas.microsoft.com/office/drawing/2016/5/11/chartex" xmlns:cx6="http://schemas.microsoft.com/office/drawing/2016/5/12/chartex" xmlns:cx7="http://schemas.microsoft.com/office/drawing/2016/5/13/chartex" xmlns:cx8="http://schemas.microsoft.com/office/drawing/2016/5/14/chartex" xmlns:mc="http://schemas.openxmlformats.org/markup-compatibility/2006" xmlns:m="http://schemas.openxmlformats.org/officeDocument/2006/math" xmlns:aink="http://schemas.microsoft.com/office/drawing/2016/ink" xmlns:am3d="http://schemas.microsoft.com/office/drawing/2017/model3d" xmlns:oel="http://schemas.microsoft.com/office/2019/extlst" xmlns:r="http://schemas.openxmlformats.org/officeDocument/2006/relationships" xmlns:wp14="http://schemas.microsoft.com/office/word/2010/wordprocessingDrawing" xmlns:wp="http://schemas.openxmlformats.org/drawingml/2006/wordprocessingDrawing" xmlns:wpg="http://schemas.microsoft.com/office/word/2010/wordprocessingGroup" xmlns:wpi="http://schemas.microsoft.com/office/word/2010/wordprocessingInk" xmlns:wps="http://schemas.microsoft.com/office/word/2010/wordprocessingShape" xmlns:o="urn:schemas-microsoft-com:office:office" xmlns:v="urn:schemas-microsoft-com:vml" xmlns:w10="urn:schemas-microsoft-com:office:word" xmlns:w="http://schemas.openxmlformats.org/wordprocessingml/2006/main" xmlns:w14="http://schemas.microsoft.com/office/word/2010/wordml" xmlns:w15="http://schemas.microsoft.com/office/word/2012/wordml" xmlns:w16cei="http://schemas.microsoft.com/office/word/2026/wordml/cei" xmlns:w16cex="http://schemas.microsoft.com/office/word/2018/wordml/cex" xmlns:w16cid="http://schemas.microsoft.com/office/word/2016/wordml/cid" xmlns:w16="http://schemas.microsoft.com/office/word/2018/wordml" xmlns:w16sdtdh="http://schemas.microsoft.com/office/word/2020/wordml/sdtdatahash" xmlns:w16sdtfl="http://schemas.microsoft.com/office/word/2024/wordml/sdtformatlock" xmlns:w16se="http://schemas.microsoft.com/office/word/2015/wordml/symex" xmlns:w16du="http://schemas.microsoft.com/office/word/2023/wordml/word16du" xmlns:wne="http://schemas.microsoft.com/office/word/2006/wordml" mc:Ignorable="w14 w15 w16se w16cid w16 w16cex w16sdtdh w16sdtfl w16du wp14">
+  <w:p>
+    <w:pPr>
+      <w:pStyle w:val="Footer"/>
+    </w:pPr>
+  </w:p>
+</w:ftr>
+</file>
+
+<file path=word/footer3.xml><?xml version="1.0" encoding="utf-8"?>
+<w:ftr xmlns:wpc="http://schemas.microsoft.com/office/word/2010/wordprocessingCanvas" xmlns:cx="http://schemas.microsoft.com/office/drawing/2014/chartex" xmlns:cx1="http://schemas.microsoft.com/office/drawing/2015/9/8/chartex" xmlns:cx2="http://schemas.microsoft.com/office/drawing/2015/10/21/chartex" xmlns:cx3="http://schemas.microsoft.com/office/drawing/2016/5/9/chartex" xmlns:cx4="http://schemas.microsoft.com/office/drawing/2016/5/10/chartex" xmlns:cx5="http://schemas.microsoft.com/office/drawing/2016/5/11/chartex" xmlns:cx6="http://schemas.microsoft.com/office/drawing/2016/5/12/chartex" xmlns:cx7="http://schemas.microsoft.com/office/drawing/2016/5/13/chartex" xmlns:cx8="http://schemas.microsoft.com/office/drawing/2016/5/14/chartex" xmlns:mc="http://schemas.openxmlformats.org/markup-compatibility/2006" xmlns:m="http://schemas.openxmlformats.org/officeDocument/2006/math" xmlns:aink="http://schemas.microsoft.com/office/drawing/2016/ink" xmlns:am3d="http://schemas.microsoft.com/office/drawing/2017/model3d" xmlns:oel="http://schemas.microsoft.com/office/2019/extlst" xmlns:r="http://schemas.openxmlformats.org/officeDocument/2006/relationships" xmlns:wp14="http://schemas.microsoft.com/office/word/2010/wordprocessingDrawing" xmlns:wp="http://schemas.openxmlformats.org/drawingml/2006/wordprocessingDrawing" xmlns:wpg="http://schemas.microsoft.com/office/word/2010/wordprocessingGroup" xmlns:wpi="http://schemas.microsoft.com/office/word/2010/wordprocessingInk" xmlns:wps="http://schemas.microsoft.com/office/word/2010/wordprocessingShape" xmlns:o="urn:schemas-microsoft-com:office:office" xmlns:v="urn:schemas-microsoft-com:vml" xmlns:w10="urn:schemas-microsoft-com:office:word" xmlns:w="http://schemas.openxmlformats.org/wordprocessingml/2006/main" xmlns:w14="http://schemas.microsoft.com/office/word/2010/wordml" xmlns:w15="http://schemas.microsoft.com/office/word/2012/wordml" xmlns:w16cei="http://schemas.microsoft.com/office/word/2026/wordml/cei" xmlns:w16cex="http://schemas.microsoft.com/office/word/2018/wordml/cex" xmlns:w16cid="http://schemas.microsoft.com/office/word/2016/wordml/cid" xmlns:w16="http://schemas.microsoft.com/office/word/2018/wordml" xmlns:w16sdtdh="http://schemas.microsoft.com/office/word/2020/wordml/sdtdatahash" xmlns:w16sdtfl="http://schemas.microsoft.com/office/word/2024/wordml/sdtformatlock" xmlns:w16se="http://schemas.microsoft.com/office/word/2015/wordml/symex" xmlns:w16du="http://schemas.microsoft.com/office/word/2023/wordml/word16du" xmlns:wne="http://schemas.microsoft.com/office/word/2006/wordml" mc:Ignorable="w14 w15 w16se w16cid w16 w16cex w16sdtdh w16sdtfl w16du wp14">
+  <w:p>
+    <w:pPr>
+      <w:pStyle w:val="Footer"/>
+    </w:pPr>
+  </w:p>
+</w:ftr>
+</file>
+
 <file path=word/footnotes.xml><?xml version="1.0" encoding="utf-8"?>
-<w:footnotes xmlns:wpc="http://schemas.microsoft.com/office/word/2010/wordprocessingCanvas" xmlns:cx="http://schemas.microsoft.com/office/drawing/2014/chartex" xmlns:cx1="http://schemas.microsoft.com/office/drawing/2015/9/8/chartex" xmlns:cx2="http://schemas.microsoft.com/office/drawing/2015/10/21/chartex" xmlns:cx3="http://schemas.microsoft.com/office/drawing/2016/5/9/chartex" xmlns:cx4="http://schemas.microsoft.com/office/drawing/2016/5/10/chartex" xmlns:cx5="http://schemas.microsoft.com/office/drawing/2016/5/11/chartex" xmlns:cx6="http://schemas.microsoft.com/office/drawing/2016/5/12/chartex" xmlns:cx7="http://schemas.microsoft.com/office/drawing/2016/5/13/chartex" xmlns:cx8="http://schemas.microsoft.com/office/drawing/2016/5/14/chartex" xmlns:mc="http://schemas.openxmlformats.org/markup-compatibility/2006" xmlns:aink="http://schemas.microsoft.com/office/drawing/2016/ink" xmlns:am3d="http://schemas.microsoft.com/office/drawing/2017/model3d" xmlns:o="urn:schemas-microsoft-com:office:office" xmlns:oel="http://schemas.microsoft.com/office/2019/extlst" xmlns:r="http://schemas.openxmlformats.org/officeDocument/2006/relationships" xmlns:m="http://schemas.openxmlformats.org/officeDocument/2006/math" xmlns:v="urn:schemas-microsoft-com:vml" xmlns:wp14="http://schemas.microsoft.com/office/word/2010/wordprocessingDrawing" xmlns:wp="http://schemas.openxmlformats.org/drawingml/2006/wordprocessingDrawing" xmlns:w10="urn:schemas-microsoft-com:office:word" xmlns:w="http://schemas.openxmlformats.org/wordprocessingml/2006/main" xmlns:w14="http://schemas.microsoft.com/office/word/2010/wordml" xmlns:w15="http://schemas.microsoft.com/office/word/2012/wordml" xmlns:w16cex="http://schemas.microsoft.com/office/word/2018/wordml/cex" xmlns:w16cid="http://schemas.microsoft.com/office/word/2016/wordml/cid" xmlns:w16="http://schemas.microsoft.com/office/word/2018/wordml" xmlns:w16du="http://schemas.microsoft.com/office/word/2023/wordml/word16du" xmlns:w16sdtdh="http://schemas.microsoft.com/office/word/2020/wordml/sdtdatahash" xmlns:w16sdtfl="http://schemas.microsoft.com/office/word/2024/wordml/sdtformatlock" xmlns:w16se="http://schemas.microsoft.com/office/word/2015/wordml/symex" xmlns:wpg="http://schemas.microsoft.com/office/word/2010/wordprocessingGroup" xmlns:wpi="http://schemas.microsoft.com/office/word/2010/wordprocessingInk" xmlns:wne="http://schemas.microsoft.com/office/word/2006/wordml" xmlns:wps="http://schemas.microsoft.com/office/word/2010/wordprocessingShape" mc:Ignorable="w14 w15 w16se w16cid w16 w16cex w16sdtdh w16sdtfl w16du wp14">
+<w:footnotes xmlns:wpc="http://schemas.microsoft.com/office/word/2010/wordprocessingCanvas" xmlns:cx="http://schemas.microsoft.com/office/drawing/2014/chartex" xmlns:cx1="http://schemas.microsoft.com/office/drawing/2015/9/8/chartex" xmlns:cx2="http://schemas.microsoft.com/office/drawing/2015/10/21/chartex" xmlns:cx3="http://schemas.microsoft.com/office/drawing/2016/5/9/chartex" xmlns:cx4="http://schemas.microsoft.com/office/drawing/2016/5/10/chartex" xmlns:cx5="http://schemas.microsoft.com/office/drawing/2016/5/11/chartex" xmlns:cx6="http://schemas.microsoft.com/office/drawing/2016/5/12/chartex" xmlns:cx7="http://schemas.microsoft.com/office/drawing/2016/5/13/chartex" xmlns:cx8="http://schemas.microsoft.com/office/drawing/2016/5/14/chartex" xmlns:mc="http://schemas.openxmlformats.org/markup-compatibility/2006" xmlns:m="http://schemas.openxmlformats.org/officeDocument/2006/math" xmlns:aink="http://schemas.microsoft.com/office/drawing/2016/ink" xmlns:am3d="http://schemas.microsoft.com/office/drawing/2017/model3d" xmlns:oel="http://schemas.microsoft.com/office/2019/extlst" xmlns:r="http://schemas.openxmlformats.org/officeDocument/2006/relationships" xmlns:wp14="http://schemas.microsoft.com/office/word/2010/wordprocessingDrawing" xmlns:wp="http://schemas.openxmlformats.org/drawingml/2006/wordprocessingDrawing" xmlns:wpg="http://schemas.microsoft.com/office/word/2010/wordprocessingGroup" xmlns:wpi="http://schemas.microsoft.com/office/word/2010/wordprocessingInk" xmlns:wps="http://schemas.microsoft.com/office/word/2010/wordprocessingShape" xmlns:o="urn:schemas-microsoft-com:office:office" xmlns:v="urn:schemas-microsoft-com:vml" xmlns:w10="urn:schemas-microsoft-com:office:word" xmlns:w="http://schemas.openxmlformats.org/wordprocessingml/2006/main" xmlns:w14="http://schemas.microsoft.com/office/word/2010/wordml" xmlns:w15="http://schemas.microsoft.com/office/word/2012/wordml" xmlns:w16cei="http://schemas.microsoft.com/office/word/2026/wordml/cei" xmlns:w16cex="http://schemas.microsoft.com/office/word/2018/wordml/cex" xmlns:w16cid="http://schemas.microsoft.com/office/word/2016/wordml/cid" xmlns:w16="http://schemas.microsoft.com/office/word/2018/wordml" xmlns:w16sdtdh="http://schemas.microsoft.com/office/word/2020/wordml/sdtdatahash" xmlns:w16sdtfl="http://schemas.microsoft.com/office/word/2024/wordml/sdtformatlock" xmlns:w16se="http://schemas.microsoft.com/office/word/2015/wordml/symex" xmlns:w16du="http://schemas.microsoft.com/office/word/2023/wordml/word16du" xmlns:wne="http://schemas.microsoft.com/office/word/2006/wordml" mc:Ignorable="w14 w15 w16se w16cid w16 w16cex w16sdtdh w16sdtfl w16du wp14">
   <w:footnote w:type="separator" w:id="-1">
     <w:p>
       <w:r>
@@ -5295,17 +3569,17 @@
 </file>
 
 <file path=word/header1.xml><?xml version="1.0" encoding="utf-8"?>
-<w:hdr xmlns:wpc="http://schemas.microsoft.com/office/word/2010/wordprocessingCanvas" xmlns:cx="http://schemas.microsoft.com/office/drawing/2014/chartex" xmlns:cx1="http://schemas.microsoft.com/office/drawing/2015/9/8/chartex" xmlns:cx2="http://schemas.microsoft.com/office/drawing/2015/10/21/chartex" xmlns:cx3="http://schemas.microsoft.com/office/drawing/2016/5/9/chartex" xmlns:cx4="http://schemas.microsoft.com/office/drawing/2016/5/10/chartex" xmlns:cx5="http://schemas.microsoft.com/office/drawing/2016/5/11/chartex" xmlns:cx6="http://schemas.microsoft.com/office/drawing/2016/5/12/chartex" xmlns:cx7="http://schemas.microsoft.com/office/drawing/2016/5/13/chartex" xmlns:cx8="http://schemas.microsoft.com/office/drawing/2016/5/14/chartex" xmlns:mc="http://schemas.openxmlformats.org/markup-compatibility/2006" xmlns:aink="http://schemas.microsoft.com/office/drawing/2016/ink" xmlns:am3d="http://schemas.microsoft.com/office/drawing/2017/model3d" xmlns:o="urn:schemas-microsoft-com:office:office" xmlns:oel="http://schemas.microsoft.com/office/2019/extlst" xmlns:r="http://schemas.openxmlformats.org/officeDocument/2006/relationships" xmlns:m="http://schemas.openxmlformats.org/officeDocument/2006/math" xmlns:v="urn:schemas-microsoft-com:vml" xmlns:wp14="http://schemas.microsoft.com/office/word/2010/wordprocessingDrawing" xmlns:wp="http://schemas.openxmlformats.org/drawingml/2006/wordprocessingDrawing" xmlns:w10="urn:schemas-microsoft-com:office:word" xmlns:w="http://schemas.openxmlformats.org/wordprocessingml/2006/main" xmlns:w14="http://schemas.microsoft.com/office/word/2010/wordml" xmlns:w15="http://schemas.microsoft.com/office/word/2012/wordml" xmlns:w16cex="http://schemas.microsoft.com/office/word/2018/wordml/cex" xmlns:w16cid="http://schemas.microsoft.com/office/word/2016/wordml/cid" xmlns:w16="http://schemas.microsoft.com/office/word/2018/wordml" xmlns:w16du="http://schemas.microsoft.com/office/word/2023/wordml/word16du" xmlns:w16sdtdh="http://schemas.microsoft.com/office/word/2020/wordml/sdtdatahash" xmlns:w16sdtfl="http://schemas.microsoft.com/office/word/2024/wordml/sdtformatlock" xmlns:w16se="http://schemas.microsoft.com/office/word/2015/wordml/symex" xmlns:wpg="http://schemas.microsoft.com/office/word/2010/wordprocessingGroup" xmlns:wpi="http://schemas.microsoft.com/office/word/2010/wordprocessingInk" xmlns:wne="http://schemas.microsoft.com/office/word/2006/wordml" xmlns:wps="http://schemas.microsoft.com/office/word/2010/wordprocessingShape" mc:Ignorable="w14 w15 w16se w16cid w16 w16cex w16sdtdh w16sdtfl w16du wp14">
+<w:hdr xmlns:wpc="http://schemas.microsoft.com/office/word/2010/wordprocessingCanvas" xmlns:cx="http://schemas.microsoft.com/office/drawing/2014/chartex" xmlns:cx1="http://schemas.microsoft.com/office/drawing/2015/9/8/chartex" xmlns:cx2="http://schemas.microsoft.com/office/drawing/2015/10/21/chartex" xmlns:cx3="http://schemas.microsoft.com/office/drawing/2016/5/9/chartex" xmlns:cx4="http://schemas.microsoft.com/office/drawing/2016/5/10/chartex" xmlns:cx5="http://schemas.microsoft.com/office/drawing/2016/5/11/chartex" xmlns:cx6="http://schemas.microsoft.com/office/drawing/2016/5/12/chartex" xmlns:cx7="http://schemas.microsoft.com/office/drawing/2016/5/13/chartex" xmlns:cx8="http://schemas.microsoft.com/office/drawing/2016/5/14/chartex" xmlns:mc="http://schemas.openxmlformats.org/markup-compatibility/2006" xmlns:m="http://schemas.openxmlformats.org/officeDocument/2006/math" xmlns:aink="http://schemas.microsoft.com/office/drawing/2016/ink" xmlns:am3d="http://schemas.microsoft.com/office/drawing/2017/model3d" xmlns:oel="http://schemas.microsoft.com/office/2019/extlst" xmlns:r="http://schemas.openxmlformats.org/officeDocument/2006/relationships" xmlns:wp14="http://schemas.microsoft.com/office/word/2010/wordprocessingDrawing" xmlns:wp="http://schemas.openxmlformats.org/drawingml/2006/wordprocessingDrawing" xmlns:wpg="http://schemas.microsoft.com/office/word/2010/wordprocessingGroup" xmlns:wpi="http://schemas.microsoft.com/office/word/2010/wordprocessingInk" xmlns:wps="http://schemas.microsoft.com/office/word/2010/wordprocessingShape" xmlns:o="urn:schemas-microsoft-com:office:office" xmlns:v="urn:schemas-microsoft-com:vml" xmlns:w10="urn:schemas-microsoft-com:office:word" xmlns:w="http://schemas.openxmlformats.org/wordprocessingml/2006/main" xmlns:w14="http://schemas.microsoft.com/office/word/2010/wordml" xmlns:w15="http://schemas.microsoft.com/office/word/2012/wordml" xmlns:w16cei="http://schemas.microsoft.com/office/word/2026/wordml/cei" xmlns:w16cex="http://schemas.microsoft.com/office/word/2018/wordml/cex" xmlns:w16cid="http://schemas.microsoft.com/office/word/2016/wordml/cid" xmlns:w16="http://schemas.microsoft.com/office/word/2018/wordml" xmlns:w16sdtdh="http://schemas.microsoft.com/office/word/2020/wordml/sdtdatahash" xmlns:w16sdtfl="http://schemas.microsoft.com/office/word/2024/wordml/sdtformatlock" xmlns:w16se="http://schemas.microsoft.com/office/word/2015/wordml/symex" xmlns:w16du="http://schemas.microsoft.com/office/word/2023/wordml/word16du" xmlns:wne="http://schemas.microsoft.com/office/word/2006/wordml" mc:Ignorable="w14 w15 w16se w16cid w16 w16cex w16sdtdh w16sdtfl w16du wp14">
   <w:p>
     <w:pPr>
-      <w:pStyle w:val="a9"/>
+      <w:pStyle w:val="Header"/>
     </w:pPr>
   </w:p>
 </w:hdr>
 </file>
 
 <file path=word/header2.xml><?xml version="1.0" encoding="utf-8"?>
-<w:hdr xmlns:wpc="http://schemas.microsoft.com/office/word/2010/wordprocessingCanvas" xmlns:cx="http://schemas.microsoft.com/office/drawing/2014/chartex" xmlns:cx1="http://schemas.microsoft.com/office/drawing/2015/9/8/chartex" xmlns:cx2="http://schemas.microsoft.com/office/drawing/2015/10/21/chartex" xmlns:cx3="http://schemas.microsoft.com/office/drawing/2016/5/9/chartex" xmlns:cx4="http://schemas.microsoft.com/office/drawing/2016/5/10/chartex" xmlns:cx5="http://schemas.microsoft.com/office/drawing/2016/5/11/chartex" xmlns:cx6="http://schemas.microsoft.com/office/drawing/2016/5/12/chartex" xmlns:cx7="http://schemas.microsoft.com/office/drawing/2016/5/13/chartex" xmlns:cx8="http://schemas.microsoft.com/office/drawing/2016/5/14/chartex" xmlns:mc="http://schemas.openxmlformats.org/markup-compatibility/2006" xmlns:aink="http://schemas.microsoft.com/office/drawing/2016/ink" xmlns:am3d="http://schemas.microsoft.com/office/drawing/2017/model3d" xmlns:o="urn:schemas-microsoft-com:office:office" xmlns:oel="http://schemas.microsoft.com/office/2019/extlst" xmlns:r="http://schemas.openxmlformats.org/officeDocument/2006/relationships" xmlns:m="http://schemas.openxmlformats.org/officeDocument/2006/math" xmlns:v="urn:schemas-microsoft-com:vml" xmlns:wp14="http://schemas.microsoft.com/office/word/2010/wordprocessingDrawing" xmlns:wp="http://schemas.openxmlformats.org/drawingml/2006/wordprocessingDrawing" xmlns:w10="urn:schemas-microsoft-com:office:word" xmlns:w="http://schemas.openxmlformats.org/wordprocessingml/2006/main" xmlns:w14="http://schemas.microsoft.com/office/word/2010/wordml" xmlns:w15="http://schemas.microsoft.com/office/word/2012/wordml" xmlns:w16cex="http://schemas.microsoft.com/office/word/2018/wordml/cex" xmlns:w16cid="http://schemas.microsoft.com/office/word/2016/wordml/cid" xmlns:w16="http://schemas.microsoft.com/office/word/2018/wordml" xmlns:w16du="http://schemas.microsoft.com/office/word/2023/wordml/word16du" xmlns:w16sdtdh="http://schemas.microsoft.com/office/word/2020/wordml/sdtdatahash" xmlns:w16sdtfl="http://schemas.microsoft.com/office/word/2024/wordml/sdtformatlock" xmlns:w16se="http://schemas.microsoft.com/office/word/2015/wordml/symex" xmlns:wpg="http://schemas.microsoft.com/office/word/2010/wordprocessingGroup" xmlns:wpi="http://schemas.microsoft.com/office/word/2010/wordprocessingInk" xmlns:wne="http://schemas.microsoft.com/office/word/2006/wordml" xmlns:wps="http://schemas.microsoft.com/office/word/2010/wordprocessingShape" mc:Ignorable="w14 w15 w16se w16cid w16 w16cex w16sdtdh w16sdtfl w16du wp14">
+<w:hdr xmlns:wpc="http://schemas.microsoft.com/office/word/2010/wordprocessingCanvas" xmlns:cx="http://schemas.microsoft.com/office/drawing/2014/chartex" xmlns:cx1="http://schemas.microsoft.com/office/drawing/2015/9/8/chartex" xmlns:cx2="http://schemas.microsoft.com/office/drawing/2015/10/21/chartex" xmlns:cx3="http://schemas.microsoft.com/office/drawing/2016/5/9/chartex" xmlns:cx4="http://schemas.microsoft.com/office/drawing/2016/5/10/chartex" xmlns:cx5="http://schemas.microsoft.com/office/drawing/2016/5/11/chartex" xmlns:cx6="http://schemas.microsoft.com/office/drawing/2016/5/12/chartex" xmlns:cx7="http://schemas.microsoft.com/office/drawing/2016/5/13/chartex" xmlns:cx8="http://schemas.microsoft.com/office/drawing/2016/5/14/chartex" xmlns:mc="http://schemas.openxmlformats.org/markup-compatibility/2006" xmlns:m="http://schemas.openxmlformats.org/officeDocument/2006/math" xmlns:aink="http://schemas.microsoft.com/office/drawing/2016/ink" xmlns:am3d="http://schemas.microsoft.com/office/drawing/2017/model3d" xmlns:oel="http://schemas.microsoft.com/office/2019/extlst" xmlns:r="http://schemas.openxmlformats.org/officeDocument/2006/relationships" xmlns:wp14="http://schemas.microsoft.com/office/word/2010/wordprocessingDrawing" xmlns:wp="http://schemas.openxmlformats.org/drawingml/2006/wordprocessingDrawing" xmlns:wpg="http://schemas.microsoft.com/office/word/2010/wordprocessingGroup" xmlns:wpi="http://schemas.microsoft.com/office/word/2010/wordprocessingInk" xmlns:wps="http://schemas.microsoft.com/office/word/2010/wordprocessingShape" xmlns:o="urn:schemas-microsoft-com:office:office" xmlns:v="urn:schemas-microsoft-com:vml" xmlns:w10="urn:schemas-microsoft-com:office:word" xmlns:w="http://schemas.openxmlformats.org/wordprocessingml/2006/main" xmlns:w14="http://schemas.microsoft.com/office/word/2010/wordml" xmlns:w15="http://schemas.microsoft.com/office/word/2012/wordml" xmlns:w16cei="http://schemas.microsoft.com/office/word/2026/wordml/cei" xmlns:w16cex="http://schemas.microsoft.com/office/word/2018/wordml/cex" xmlns:w16cid="http://schemas.microsoft.com/office/word/2016/wordml/cid" xmlns:w16="http://schemas.microsoft.com/office/word/2018/wordml" xmlns:w16sdtdh="http://schemas.microsoft.com/office/word/2020/wordml/sdtdatahash" xmlns:w16sdtfl="http://schemas.microsoft.com/office/word/2024/wordml/sdtformatlock" xmlns:w16se="http://schemas.microsoft.com/office/word/2015/wordml/symex" xmlns:w16du="http://schemas.microsoft.com/office/word/2023/wordml/word16du" xmlns:wne="http://schemas.microsoft.com/office/word/2006/wordml" mc:Ignorable="w14 w15 w16se w16cid w16 w16cex w16sdtdh w16sdtfl w16du wp14">
   <w:p>
     <w:pPr>
       <w:tabs>
@@ -5315,7 +3589,7 @@
     </w:pPr>
     <w:r>
       <w:rPr>
-        <w:rFonts w:ascii="Times New Roman" w:eastAsia="宋体" w:hAnsi="Times New Roman" w:cs="Times New Roman"/>
+        <w:rFonts w:ascii="Times New Roman" w:eastAsia="SimSun" w:hAnsi="Times New Roman" w:cs="Times New Roman"/>
         <w:sz w:val="20"/>
         <w:szCs w:val="20"/>
       </w:rPr>
@@ -5323,7 +3597,7 @@
     </w:r>
     <w:r>
       <w:rPr>
-        <w:rFonts w:ascii="Times New Roman" w:eastAsia="宋体" w:hAnsi="Times New Roman" w:cs="Times New Roman"/>
+        <w:rFonts w:ascii="Times New Roman" w:eastAsia="SimSun" w:hAnsi="Times New Roman" w:cs="Times New Roman"/>
         <w:sz w:val="20"/>
         <w:szCs w:val="20"/>
       </w:rPr>
@@ -5334,17 +3608,17 @@
 </file>
 
 <file path=word/header3.xml><?xml version="1.0" encoding="utf-8"?>
-<w:hdr xmlns:wpc="http://schemas.microsoft.com/office/word/2010/wordprocessingCanvas" xmlns:cx="http://schemas.microsoft.com/office/drawing/2014/chartex" xmlns:cx1="http://schemas.microsoft.com/office/drawing/2015/9/8/chartex" xmlns:cx2="http://schemas.microsoft.com/office/drawing/2015/10/21/chartex" xmlns:cx3="http://schemas.microsoft.com/office/drawing/2016/5/9/chartex" xmlns:cx4="http://schemas.microsoft.com/office/drawing/2016/5/10/chartex" xmlns:cx5="http://schemas.microsoft.com/office/drawing/2016/5/11/chartex" xmlns:cx6="http://schemas.microsoft.com/office/drawing/2016/5/12/chartex" xmlns:cx7="http://schemas.microsoft.com/office/drawing/2016/5/13/chartex" xmlns:cx8="http://schemas.microsoft.com/office/drawing/2016/5/14/chartex" xmlns:mc="http://schemas.openxmlformats.org/markup-compatibility/2006" xmlns:aink="http://schemas.microsoft.com/office/drawing/2016/ink" xmlns:am3d="http://schemas.microsoft.com/office/drawing/2017/model3d" xmlns:o="urn:schemas-microsoft-com:office:office" xmlns:oel="http://schemas.microsoft.com/office/2019/extlst" xmlns:r="http://schemas.openxmlformats.org/officeDocument/2006/relationships" xmlns:m="http://schemas.openxmlformats.org/officeDocument/2006/math" xmlns:v="urn:schemas-microsoft-com:vml" xmlns:wp14="http://schemas.microsoft.com/office/word/2010/wordprocessingDrawing" xmlns:wp="http://schemas.openxmlformats.org/drawingml/2006/wordprocessingDrawing" xmlns:w10="urn:schemas-microsoft-com:office:word" xmlns:w="http://schemas.openxmlformats.org/wordprocessingml/2006/main" xmlns:w14="http://schemas.microsoft.com/office/word/2010/wordml" xmlns:w15="http://schemas.microsoft.com/office/word/2012/wordml" xmlns:w16cex="http://schemas.microsoft.com/office/word/2018/wordml/cex" xmlns:w16cid="http://schemas.microsoft.com/office/word/2016/wordml/cid" xmlns:w16="http://schemas.microsoft.com/office/word/2018/wordml" xmlns:w16du="http://schemas.microsoft.com/office/word/2023/wordml/word16du" xmlns:w16sdtdh="http://schemas.microsoft.com/office/word/2020/wordml/sdtdatahash" xmlns:w16sdtfl="http://schemas.microsoft.com/office/word/2024/wordml/sdtformatlock" xmlns:w16se="http://schemas.microsoft.com/office/word/2015/wordml/symex" xmlns:wpg="http://schemas.microsoft.com/office/word/2010/wordprocessingGroup" xmlns:wpi="http://schemas.microsoft.com/office/word/2010/wordprocessingInk" xmlns:wne="http://schemas.microsoft.com/office/word/2006/wordml" xmlns:wps="http://schemas.microsoft.com/office/word/2010/wordprocessingShape" mc:Ignorable="w14 w15 w16se w16cid w16 w16cex w16sdtdh w16sdtfl w16du wp14">
+<w:hdr xmlns:wpc="http://schemas.microsoft.com/office/word/2010/wordprocessingCanvas" xmlns:cx="http://schemas.microsoft.com/office/drawing/2014/chartex" xmlns:cx1="http://schemas.microsoft.com/office/drawing/2015/9/8/chartex" xmlns:cx2="http://schemas.microsoft.com/office/drawing/2015/10/21/chartex" xmlns:cx3="http://schemas.microsoft.com/office/drawing/2016/5/9/chartex" xmlns:cx4="http://schemas.microsoft.com/office/drawing/2016/5/10/chartex" xmlns:cx5="http://schemas.microsoft.com/office/drawing/2016/5/11/chartex" xmlns:cx6="http://schemas.microsoft.com/office/drawing/2016/5/12/chartex" xmlns:cx7="http://schemas.microsoft.com/office/drawing/2016/5/13/chartex" xmlns:cx8="http://schemas.microsoft.com/office/drawing/2016/5/14/chartex" xmlns:mc="http://schemas.openxmlformats.org/markup-compatibility/2006" xmlns:m="http://schemas.openxmlformats.org/officeDocument/2006/math" xmlns:aink="http://schemas.microsoft.com/office/drawing/2016/ink" xmlns:am3d="http://schemas.microsoft.com/office/drawing/2017/model3d" xmlns:oel="http://schemas.microsoft.com/office/2019/extlst" xmlns:r="http://schemas.openxmlformats.org/officeDocument/2006/relationships" xmlns:wp14="http://schemas.microsoft.com/office/word/2010/wordprocessingDrawing" xmlns:wp="http://schemas.openxmlformats.org/drawingml/2006/wordprocessingDrawing" xmlns:wpg="http://schemas.microsoft.com/office/word/2010/wordprocessingGroup" xmlns:wpi="http://schemas.microsoft.com/office/word/2010/wordprocessingInk" xmlns:wps="http://schemas.microsoft.com/office/word/2010/wordprocessingShape" xmlns:o="urn:schemas-microsoft-com:office:office" xmlns:v="urn:schemas-microsoft-com:vml" xmlns:w10="urn:schemas-microsoft-com:office:word" xmlns:w="http://schemas.openxmlformats.org/wordprocessingml/2006/main" xmlns:w14="http://schemas.microsoft.com/office/word/2010/wordml" xmlns:w15="http://schemas.microsoft.com/office/word/2012/wordml" xmlns:w16cei="http://schemas.microsoft.com/office/word/2026/wordml/cei" xmlns:w16cex="http://schemas.microsoft.com/office/word/2018/wordml/cex" xmlns:w16cid="http://schemas.microsoft.com/office/word/2016/wordml/cid" xmlns:w16="http://schemas.microsoft.com/office/word/2018/wordml" xmlns:w16sdtdh="http://schemas.microsoft.com/office/word/2020/wordml/sdtdatahash" xmlns:w16sdtfl="http://schemas.microsoft.com/office/word/2024/wordml/sdtformatlock" xmlns:w16se="http://schemas.microsoft.com/office/word/2015/wordml/symex" xmlns:w16du="http://schemas.microsoft.com/office/word/2023/wordml/word16du" xmlns:wne="http://schemas.microsoft.com/office/word/2006/wordml" mc:Ignorable="w14 w15 w16se w16cid w16 w16cex w16sdtdh w16sdtfl w16du wp14">
   <w:p>
     <w:pPr>
-      <w:pStyle w:val="a9"/>
+      <w:pStyle w:val="Header"/>
     </w:pPr>
   </w:p>
 </w:hdr>
 </file>
 
 <file path=word/numbering.xml><?xml version="1.0" encoding="utf-8"?>
-<w:numbering xmlns:wpc="http://schemas.microsoft.com/office/word/2010/wordprocessingCanvas" xmlns:cx="http://schemas.microsoft.com/office/drawing/2014/chartex" xmlns:cx1="http://schemas.microsoft.com/office/drawing/2015/9/8/chartex" xmlns:cx2="http://schemas.microsoft.com/office/drawing/2015/10/21/chartex" xmlns:cx3="http://schemas.microsoft.com/office/drawing/2016/5/9/chartex" xmlns:cx4="http://schemas.microsoft.com/office/drawing/2016/5/10/chartex" xmlns:cx5="http://schemas.microsoft.com/office/drawing/2016/5/11/chartex" xmlns:cx6="http://schemas.microsoft.com/office/drawing/2016/5/12/chartex" xmlns:cx7="http://schemas.microsoft.com/office/drawing/2016/5/13/chartex" xmlns:cx8="http://schemas.microsoft.com/office/drawing/2016/5/14/chartex" xmlns:mc="http://schemas.openxmlformats.org/markup-compatibility/2006" xmlns:aink="http://schemas.microsoft.com/office/drawing/2016/ink" xmlns:am3d="http://schemas.microsoft.com/office/drawing/2017/model3d" xmlns:o="urn:schemas-microsoft-com:office:office" xmlns:oel="http://schemas.microsoft.com/office/2019/extlst" xmlns:r="http://schemas.openxmlformats.org/officeDocument/2006/relationships" xmlns:m="http://schemas.openxmlformats.org/officeDocument/2006/math" xmlns:v="urn:schemas-microsoft-com:vml" xmlns:wp14="http://schemas.microsoft.com/office/word/2010/wordprocessingDrawing" xmlns:wp="http://schemas.openxmlformats.org/drawingml/2006/wordprocessingDrawing" xmlns:w10="urn:schemas-microsoft-com:office:word" xmlns:w="http://schemas.openxmlformats.org/wordprocessingml/2006/main" xmlns:w14="http://schemas.microsoft.com/office/word/2010/wordml" xmlns:w15="http://schemas.microsoft.com/office/word/2012/wordml" xmlns:w16cex="http://schemas.microsoft.com/office/word/2018/wordml/cex" xmlns:w16cid="http://schemas.microsoft.com/office/word/2016/wordml/cid" xmlns:w16="http://schemas.microsoft.com/office/word/2018/wordml" xmlns:w16du="http://schemas.microsoft.com/office/word/2023/wordml/word16du" xmlns:w16sdtdh="http://schemas.microsoft.com/office/word/2020/wordml/sdtdatahash" xmlns:w16sdtfl="http://schemas.microsoft.com/office/word/2024/wordml/sdtformatlock" xmlns:w16se="http://schemas.microsoft.com/office/word/2015/wordml/symex" xmlns:wpg="http://schemas.microsoft.com/office/word/2010/wordprocessingGroup" xmlns:wpi="http://schemas.microsoft.com/office/word/2010/wordprocessingInk" xmlns:wne="http://schemas.microsoft.com/office/word/2006/wordml" xmlns:wps="http://schemas.microsoft.com/office/word/2010/wordprocessingShape" mc:Ignorable="w14 w15 w16se w16cid w16 w16cex w16sdtdh w16sdtfl w16du wp14">
+<w:numbering xmlns:wpc="http://schemas.microsoft.com/office/word/2010/wordprocessingCanvas" xmlns:cx="http://schemas.microsoft.com/office/drawing/2014/chartex" xmlns:cx1="http://schemas.microsoft.com/office/drawing/2015/9/8/chartex" xmlns:cx2="http://schemas.microsoft.com/office/drawing/2015/10/21/chartex" xmlns:cx3="http://schemas.microsoft.com/office/drawing/2016/5/9/chartex" xmlns:cx4="http://schemas.microsoft.com/office/drawing/2016/5/10/chartex" xmlns:cx5="http://schemas.microsoft.com/office/drawing/2016/5/11/chartex" xmlns:cx6="http://schemas.microsoft.com/office/drawing/2016/5/12/chartex" xmlns:cx7="http://schemas.microsoft.com/office/drawing/2016/5/13/chartex" xmlns:cx8="http://schemas.microsoft.com/office/drawing/2016/5/14/chartex" xmlns:mc="http://schemas.openxmlformats.org/markup-compatibility/2006" xmlns:m="http://schemas.openxmlformats.org/officeDocument/2006/math" xmlns:aink="http://schemas.microsoft.com/office/drawing/2016/ink" xmlns:am3d="http://schemas.microsoft.com/office/drawing/2017/model3d" xmlns:oel="http://schemas.microsoft.com/office/2019/extlst" xmlns:r="http://schemas.openxmlformats.org/officeDocument/2006/relationships" xmlns:wp14="http://schemas.microsoft.com/office/word/2010/wordprocessingDrawing" xmlns:wp="http://schemas.openxmlformats.org/drawingml/2006/wordprocessingDrawing" xmlns:wpg="http://schemas.microsoft.com/office/word/2010/wordprocessingGroup" xmlns:wpi="http://schemas.microsoft.com/office/word/2010/wordprocessingInk" xmlns:wps="http://schemas.microsoft.com/office/word/2010/wordprocessingShape" xmlns:o="urn:schemas-microsoft-com:office:office" xmlns:v="urn:schemas-microsoft-com:vml" xmlns:w10="urn:schemas-microsoft-com:office:word" xmlns:w="http://schemas.openxmlformats.org/wordprocessingml/2006/main" xmlns:w14="http://schemas.microsoft.com/office/word/2010/wordml" xmlns:w15="http://schemas.microsoft.com/office/word/2012/wordml" xmlns:w16cei="http://schemas.microsoft.com/office/word/2026/wordml/cei" xmlns:w16cex="http://schemas.microsoft.com/office/word/2018/wordml/cex" xmlns:w16cid="http://schemas.microsoft.com/office/word/2016/wordml/cid" xmlns:w16="http://schemas.microsoft.com/office/word/2018/wordml" xmlns:w16sdtdh="http://schemas.microsoft.com/office/word/2020/wordml/sdtdatahash" xmlns:w16sdtfl="http://schemas.microsoft.com/office/word/2024/wordml/sdtformatlock" xmlns:w16se="http://schemas.microsoft.com/office/word/2015/wordml/symex" xmlns:w16du="http://schemas.microsoft.com/office/word/2023/wordml/word16du" xmlns:wne="http://schemas.microsoft.com/office/word/2006/wordml" mc:Ignorable="w14 w15 w16se w16cid w16 w16cex w16sdtdh w16sdtfl w16du wp14">
   <w:abstractNum w:abstractNumId="0" w15:restartNumberingAfterBreak="0">
     <w:nsid w:val="073F9764"/>
     <w:multiLevelType w:val="singleLevel"/>
@@ -5369,7 +3643,7 @@
     <w:lvl w:ilvl="0">
       <w:start w:val="1"/>
       <w:numFmt w:val="bullet"/>
-      <w:pStyle w:val="a"/>
+      <w:pStyle w:val="ListParagraph"/>
       <w:lvlText w:val=""/>
       <w:lvlJc w:val="left"/>
       <w:pPr>
@@ -5738,11 +4012,11 @@
 </file>
 
 <file path=word/styles.xml><?xml version="1.0" encoding="utf-8"?>
-<w:styles xmlns:mc="http://schemas.openxmlformats.org/markup-compatibility/2006" xmlns:r="http://schemas.openxmlformats.org/officeDocument/2006/relationships" xmlns:w="http://schemas.openxmlformats.org/wordprocessingml/2006/main" xmlns:w14="http://schemas.microsoft.com/office/word/2010/wordml" xmlns:w15="http://schemas.microsoft.com/office/word/2012/wordml" xmlns:w16cex="http://schemas.microsoft.com/office/word/2018/wordml/cex" xmlns:w16cid="http://schemas.microsoft.com/office/word/2016/wordml/cid" xmlns:w16="http://schemas.microsoft.com/office/word/2018/wordml" xmlns:w16du="http://schemas.microsoft.com/office/word/2023/wordml/word16du" xmlns:w16sdtdh="http://schemas.microsoft.com/office/word/2020/wordml/sdtdatahash" xmlns:w16sdtfl="http://schemas.microsoft.com/office/word/2024/wordml/sdtformatlock" xmlns:w16se="http://schemas.microsoft.com/office/word/2015/wordml/symex" mc:Ignorable="w14 w15 w16se w16cid w16 w16cex w16sdtdh w16sdtfl w16du">
+<w:styles xmlns:mc="http://schemas.openxmlformats.org/markup-compatibility/2006" xmlns:r="http://schemas.openxmlformats.org/officeDocument/2006/relationships" xmlns:w="http://schemas.openxmlformats.org/wordprocessingml/2006/main" xmlns:w14="http://schemas.microsoft.com/office/word/2010/wordml" xmlns:w15="http://schemas.microsoft.com/office/word/2012/wordml" xmlns:w16cex="http://schemas.microsoft.com/office/word/2018/wordml/cex" xmlns:w16cid="http://schemas.microsoft.com/office/word/2016/wordml/cid" xmlns:w16="http://schemas.microsoft.com/office/word/2018/wordml" xmlns:w16sdtdh="http://schemas.microsoft.com/office/word/2020/wordml/sdtdatahash" xmlns:w16sdtfl="http://schemas.microsoft.com/office/word/2024/wordml/sdtformatlock" xmlns:w16se="http://schemas.microsoft.com/office/word/2015/wordml/symex" xmlns:w16du="http://schemas.microsoft.com/office/word/2023/wordml/word16du" mc:Ignorable="w14 w15 w16se w16cid w16 w16cex w16sdtdh w16sdtfl w16du">
   <w:docDefaults>
     <w:rPrDefault>
       <w:rPr>
-        <w:rFonts w:ascii="Times New Roman" w:eastAsia="宋体" w:hAnsi="Times New Roman" w:cs="Times New Roman"/>
+        <w:rFonts w:ascii="Times New Roman" w:eastAsia="SimSun" w:hAnsi="Times New Roman" w:cs="Times New Roman"/>
         <w:lang w:val="en-GB" w:eastAsia="zh-CN" w:bidi="ar-SA"/>
       </w:rPr>
     </w:rPrDefault>
@@ -6126,7 +4400,7 @@
     <w:lsdException w:name="Unresolved Mention" w:semiHidden="1" w:unhideWhenUsed="1"/>
     <w:lsdException w:name="Smart Link" w:semiHidden="1" w:unhideWhenUsed="1"/>
   </w:latentStyles>
-  <w:style w:type="paragraph" w:default="1" w:styleId="a0">
+  <w:style w:type="paragraph" w:default="1" w:styleId="Normal">
     <w:name w:val="Normal"/>
     <w:autoRedefine/>
     <w:qFormat/>
@@ -6136,11 +4410,11 @@
       <w:szCs w:val="22"/>
     </w:rPr>
   </w:style>
-  <w:style w:type="paragraph" w:styleId="1">
+  <w:style w:type="paragraph" w:styleId="Heading1">
     <w:name w:val="heading 1"/>
-    <w:basedOn w:val="a0"/>
-    <w:next w:val="a0"/>
-    <w:link w:val="10"/>
+    <w:basedOn w:val="Normal"/>
+    <w:next w:val="Normal"/>
+    <w:link w:val="Heading1Char"/>
     <w:autoRedefine/>
     <w:uiPriority w:val="9"/>
     <w:qFormat/>
@@ -6157,11 +4431,11 @@
       <w:szCs w:val="32"/>
     </w:rPr>
   </w:style>
-  <w:style w:type="paragraph" w:styleId="3">
+  <w:style w:type="paragraph" w:styleId="Heading3">
     <w:name w:val="heading 3"/>
-    <w:basedOn w:val="a0"/>
-    <w:next w:val="a0"/>
-    <w:link w:val="30"/>
+    <w:basedOn w:val="Normal"/>
+    <w:next w:val="Normal"/>
+    <w:link w:val="Heading3Char"/>
     <w:autoRedefine/>
     <w:uiPriority w:val="9"/>
     <w:semiHidden/>
@@ -6180,11 +4454,11 @@
       <w:color w:val="4472C4" w:themeColor="accent1"/>
     </w:rPr>
   </w:style>
-  <w:style w:type="paragraph" w:styleId="4">
+  <w:style w:type="paragraph" w:styleId="Heading4">
     <w:name w:val="heading 4"/>
-    <w:basedOn w:val="a0"/>
-    <w:next w:val="a0"/>
-    <w:link w:val="40"/>
+    <w:basedOn w:val="Normal"/>
+    <w:next w:val="Normal"/>
+    <w:link w:val="Heading4Char"/>
     <w:autoRedefine/>
     <w:qFormat/>
     <w:pPr>
@@ -6205,13 +4479,12 @@
       <w:lang w:val="en-US"/>
     </w:rPr>
   </w:style>
-  <w:style w:type="character" w:default="1" w:styleId="a1">
+  <w:style w:type="character" w:default="1" w:styleId="DefaultParagraphFont">
     <w:name w:val="Default Paragraph Font"/>
     <w:uiPriority w:val="1"/>
-    <w:semiHidden/>
     <w:unhideWhenUsed/>
   </w:style>
-  <w:style w:type="table" w:default="1" w:styleId="a2">
+  <w:style w:type="table" w:default="1" w:styleId="TableNormal">
     <w:name w:val="Normal Table"/>
     <w:uiPriority w:val="99"/>
     <w:semiHidden/>
@@ -6226,30 +4499,30 @@
       </w:tblCellMar>
     </w:tblPr>
   </w:style>
-  <w:style w:type="numbering" w:default="1" w:styleId="a3">
+  <w:style w:type="numbering" w:default="1" w:styleId="NoList">
     <w:name w:val="No List"/>
     <w:uiPriority w:val="99"/>
     <w:semiHidden/>
     <w:unhideWhenUsed/>
   </w:style>
-  <w:style w:type="paragraph" w:styleId="a4">
+  <w:style w:type="paragraph" w:styleId="BalloonText">
     <w:name w:val="Balloon Text"/>
-    <w:basedOn w:val="a0"/>
-    <w:link w:val="a5"/>
+    <w:basedOn w:val="Normal"/>
+    <w:link w:val="BalloonTextChar"/>
     <w:autoRedefine/>
     <w:uiPriority w:val="99"/>
     <w:semiHidden/>
     <w:unhideWhenUsed/>
     <w:qFormat/>
     <w:rPr>
-      <w:rFonts w:ascii="宋体" w:eastAsia="宋体"/>
+      <w:rFonts w:ascii="SimSun" w:eastAsia="SimSun"/>
       <w:sz w:val="18"/>
       <w:szCs w:val="18"/>
     </w:rPr>
   </w:style>
-  <w:style w:type="character" w:styleId="a6">
+  <w:style w:type="character" w:styleId="Emphasis">
     <w:name w:val="Emphasis"/>
-    <w:basedOn w:val="a1"/>
+    <w:basedOn w:val="DefaultParagraphFont"/>
     <w:autoRedefine/>
     <w:uiPriority w:val="20"/>
     <w:qFormat/>
@@ -6257,10 +4530,10 @@
       <w:i/>
     </w:rPr>
   </w:style>
-  <w:style w:type="paragraph" w:styleId="a7">
+  <w:style w:type="paragraph" w:styleId="Footer">
     <w:name w:val="footer"/>
-    <w:basedOn w:val="a0"/>
-    <w:link w:val="a8"/>
+    <w:basedOn w:val="Normal"/>
+    <w:link w:val="FooterChar"/>
     <w:autoRedefine/>
     <w:uiPriority w:val="99"/>
     <w:unhideWhenUsed/>
@@ -6272,10 +4545,10 @@
       </w:tabs>
     </w:pPr>
   </w:style>
-  <w:style w:type="paragraph" w:styleId="a9">
+  <w:style w:type="paragraph" w:styleId="Header">
     <w:name w:val="header"/>
-    <w:basedOn w:val="a0"/>
-    <w:link w:val="aa"/>
+    <w:basedOn w:val="Normal"/>
+    <w:link w:val="HeaderChar"/>
     <w:autoRedefine/>
     <w:uiPriority w:val="99"/>
     <w:unhideWhenUsed/>
@@ -6287,9 +4560,9 @@
       </w:tabs>
     </w:pPr>
   </w:style>
-  <w:style w:type="character" w:styleId="ab">
+  <w:style w:type="character" w:styleId="Hyperlink">
     <w:name w:val="Hyperlink"/>
-    <w:basedOn w:val="a1"/>
+    <w:basedOn w:val="DefaultParagraphFont"/>
     <w:autoRedefine/>
     <w:uiPriority w:val="99"/>
     <w:unhideWhenUsed/>
@@ -6299,9 +4572,9 @@
       <w:u w:val="single"/>
     </w:rPr>
   </w:style>
-  <w:style w:type="paragraph" w:styleId="ac">
+  <w:style w:type="paragraph" w:styleId="NormalWeb">
     <w:name w:val="Normal (Web)"/>
-    <w:basedOn w:val="a0"/>
+    <w:basedOn w:val="Normal"/>
     <w:autoRedefine/>
     <w:uiPriority w:val="99"/>
     <w:semiHidden/>
@@ -6311,15 +4584,15 @@
       <w:spacing w:before="100" w:beforeAutospacing="1" w:after="100" w:afterAutospacing="1"/>
     </w:pPr>
     <w:rPr>
-      <w:rFonts w:ascii="宋体" w:eastAsia="宋体" w:hAnsi="宋体" w:cs="宋体"/>
+      <w:rFonts w:ascii="SimSun" w:eastAsia="SimSun" w:hAnsi="SimSun" w:cs="SimSun"/>
       <w:sz w:val="24"/>
       <w:szCs w:val="24"/>
       <w:lang w:val="en-US"/>
     </w:rPr>
   </w:style>
-  <w:style w:type="table" w:styleId="ad">
+  <w:style w:type="table" w:styleId="TableGrid">
     <w:name w:val="Table Grid"/>
-    <w:basedOn w:val="a2"/>
+    <w:basedOn w:val="TableNormal"/>
     <w:autoRedefine/>
     <w:uiPriority w:val="59"/>
     <w:qFormat/>
@@ -6334,10 +4607,10 @@
       </w:tblBorders>
     </w:tblPr>
   </w:style>
-  <w:style w:type="character" w:customStyle="1" w:styleId="40">
-    <w:name w:val="标题 4 字符"/>
-    <w:basedOn w:val="a1"/>
-    <w:link w:val="4"/>
+  <w:style w:type="character" w:customStyle="1" w:styleId="Heading4Char">
+    <w:name w:val="Heading 4 Char"/>
+    <w:basedOn w:val="DefaultParagraphFont"/>
+    <w:link w:val="Heading4"/>
     <w:autoRedefine/>
     <w:qFormat/>
     <w:rPr>
@@ -6367,32 +4640,32 @@
       <w:lang w:val="en-US"/>
     </w:rPr>
   </w:style>
-  <w:style w:type="character" w:customStyle="1" w:styleId="aa">
-    <w:name w:val="页眉 字符"/>
-    <w:basedOn w:val="a1"/>
-    <w:link w:val="a9"/>
+  <w:style w:type="character" w:customStyle="1" w:styleId="HeaderChar">
+    <w:name w:val="Header Char"/>
+    <w:basedOn w:val="DefaultParagraphFont"/>
+    <w:link w:val="Header"/>
     <w:autoRedefine/>
     <w:uiPriority w:val="99"/>
     <w:qFormat/>
   </w:style>
-  <w:style w:type="character" w:customStyle="1" w:styleId="a8">
-    <w:name w:val="页脚 字符"/>
-    <w:basedOn w:val="a1"/>
-    <w:link w:val="a7"/>
+  <w:style w:type="character" w:customStyle="1" w:styleId="FooterChar">
+    <w:name w:val="Footer Char"/>
+    <w:basedOn w:val="DefaultParagraphFont"/>
+    <w:link w:val="Footer"/>
     <w:autoRedefine/>
     <w:uiPriority w:val="99"/>
     <w:qFormat/>
   </w:style>
-  <w:style w:type="character" w:customStyle="1" w:styleId="a5">
-    <w:name w:val="批注框文本 字符"/>
-    <w:basedOn w:val="a1"/>
-    <w:link w:val="a4"/>
+  <w:style w:type="character" w:customStyle="1" w:styleId="BalloonTextChar">
+    <w:name w:val="Balloon Text Char"/>
+    <w:basedOn w:val="DefaultParagraphFont"/>
+    <w:link w:val="BalloonText"/>
     <w:autoRedefine/>
     <w:uiPriority w:val="99"/>
     <w:semiHidden/>
     <w:qFormat/>
     <w:rPr>
-      <w:rFonts w:ascii="宋体" w:eastAsia="宋体"/>
+      <w:rFonts w:ascii="SimSun" w:eastAsia="SimSun"/>
       <w:sz w:val="18"/>
       <w:szCs w:val="18"/>
     </w:rPr>
@@ -6415,10 +4688,10 @@
       <w:suppressLineNumbers/>
     </w:pPr>
   </w:style>
-  <w:style w:type="character" w:customStyle="1" w:styleId="30">
-    <w:name w:val="标题 3 字符"/>
-    <w:basedOn w:val="a1"/>
-    <w:link w:val="3"/>
+  <w:style w:type="character" w:customStyle="1" w:styleId="Heading3Char">
+    <w:name w:val="Heading 3 Char"/>
+    <w:basedOn w:val="DefaultParagraphFont"/>
+    <w:link w:val="Heading3"/>
     <w:autoRedefine/>
     <w:uiPriority w:val="9"/>
     <w:semiHidden/>
@@ -6430,9 +4703,9 @@
       <w:color w:val="4472C4" w:themeColor="accent1"/>
     </w:rPr>
   </w:style>
-  <w:style w:type="paragraph" w:styleId="a">
+  <w:style w:type="paragraph" w:styleId="ListParagraph">
     <w:name w:val="List Paragraph"/>
-    <w:basedOn w:val="a0"/>
+    <w:basedOn w:val="Normal"/>
     <w:autoRedefine/>
     <w:uiPriority w:val="34"/>
     <w:qFormat/>
@@ -6454,14 +4727,14 @@
   </w:style>
   <w:style w:type="character" w:customStyle="1" w:styleId="highlight">
     <w:name w:val="highlight"/>
-    <w:basedOn w:val="a1"/>
+    <w:basedOn w:val="DefaultParagraphFont"/>
     <w:autoRedefine/>
     <w:qFormat/>
   </w:style>
-  <w:style w:type="character" w:customStyle="1" w:styleId="10">
-    <w:name w:val="标题 1 字符"/>
-    <w:basedOn w:val="a1"/>
-    <w:link w:val="1"/>
+  <w:style w:type="character" w:customStyle="1" w:styleId="Heading1Char">
+    <w:name w:val="Heading 1 Char"/>
+    <w:basedOn w:val="DefaultParagraphFont"/>
+    <w:link w:val="Heading1"/>
     <w:autoRedefine/>
     <w:uiPriority w:val="9"/>
     <w:qFormat/>
@@ -6474,7 +4747,7 @@
   </w:style>
   <w:style w:type="character" w:customStyle="1" w:styleId="UnresolvedMention1">
     <w:name w:val="Unresolved Mention1"/>
-    <w:basedOn w:val="a1"/>
+    <w:basedOn w:val="DefaultParagraphFont"/>
     <w:autoRedefine/>
     <w:uiPriority w:val="99"/>
     <w:semiHidden/>
@@ -6487,7 +4760,7 @@
   </w:style>
   <w:style w:type="table" w:customStyle="1" w:styleId="31">
     <w:name w:val="无格式表格 31"/>
-    <w:basedOn w:val="a2"/>
+    <w:basedOn w:val="TableNormal"/>
     <w:autoRedefine/>
     <w:uiPriority w:val="43"/>
     <w:qFormat/>
@@ -6588,7 +4861,7 @@
   </w:style>
   <w:style w:type="table" w:customStyle="1" w:styleId="41">
     <w:name w:val="无格式表格 41"/>
-    <w:basedOn w:val="a2"/>
+    <w:basedOn w:val="TableNormal"/>
     <w:autoRedefine/>
     <w:uiPriority w:val="44"/>
     <w:qFormat/>
@@ -6632,14 +4905,14 @@
   </w:style>
   <w:style w:type="paragraph" w:customStyle="1" w:styleId="src">
     <w:name w:val="src"/>
-    <w:basedOn w:val="a0"/>
+    <w:basedOn w:val="Normal"/>
     <w:autoRedefine/>
     <w:qFormat/>
     <w:pPr>
       <w:spacing w:before="100" w:beforeAutospacing="1" w:after="100" w:afterAutospacing="1"/>
     </w:pPr>
     <w:rPr>
-      <w:rFonts w:ascii="宋体" w:eastAsia="宋体" w:hAnsi="宋体" w:cs="宋体"/>
+      <w:rFonts w:ascii="SimSun" w:eastAsia="SimSun" w:hAnsi="SimSun" w:cs="SimSun"/>
       <w:sz w:val="24"/>
       <w:szCs w:val="24"/>
       <w:lang w:val="en-US"/>
@@ -6647,13 +4920,13 @@
   </w:style>
   <w:style w:type="character" w:customStyle="1" w:styleId="searchglhighlight">
     <w:name w:val="search_gl_highlight"/>
-    <w:basedOn w:val="a1"/>
+    <w:basedOn w:val="DefaultParagraphFont"/>
     <w:autoRedefine/>
     <w:qFormat/>
   </w:style>
-  <w:style w:type="character" w:styleId="ae">
+  <w:style w:type="character" w:styleId="Strong">
     <w:name w:val="Strong"/>
-    <w:basedOn w:val="a1"/>
+    <w:basedOn w:val="DefaultParagraphFont"/>
     <w:uiPriority w:val="22"/>
     <w:qFormat/>
     <w:rsid w:val="00B27B15"/>
@@ -6662,10 +4935,10 @@
       <w:bCs/>
     </w:rPr>
   </w:style>
-  <w:style w:type="paragraph" w:styleId="af">
+  <w:style w:type="paragraph" w:styleId="FootnoteText">
     <w:name w:val="footnote text"/>
-    <w:basedOn w:val="a0"/>
-    <w:link w:val="af0"/>
+    <w:basedOn w:val="Normal"/>
+    <w:link w:val="FootnoteTextChar"/>
     <w:uiPriority w:val="99"/>
     <w:semiHidden/>
     <w:unhideWhenUsed/>
@@ -6675,10 +4948,10 @@
       <w:szCs w:val="20"/>
     </w:rPr>
   </w:style>
-  <w:style w:type="character" w:customStyle="1" w:styleId="af0">
-    <w:name w:val="脚注文本 字符"/>
-    <w:basedOn w:val="a1"/>
-    <w:link w:val="af"/>
+  <w:style w:type="character" w:customStyle="1" w:styleId="FootnoteTextChar">
+    <w:name w:val="Footnote Text Char"/>
+    <w:basedOn w:val="DefaultParagraphFont"/>
+    <w:link w:val="FootnoteText"/>
     <w:uiPriority w:val="99"/>
     <w:semiHidden/>
     <w:rsid w:val="00423A28"/>
@@ -6686,9 +4959,9 @@
       <w:rFonts w:asciiTheme="minorHAnsi" w:eastAsiaTheme="minorEastAsia" w:hAnsiTheme="minorHAnsi" w:cstheme="minorBidi"/>
     </w:rPr>
   </w:style>
-  <w:style w:type="character" w:styleId="af1">
+  <w:style w:type="character" w:styleId="FootnoteReference">
     <w:name w:val="footnote reference"/>
-    <w:basedOn w:val="a1"/>
+    <w:basedOn w:val="DefaultParagraphFont"/>
     <w:uiPriority w:val="99"/>
     <w:semiHidden/>
     <w:unhideWhenUsed/>
@@ -6697,9 +4970,9 @@
       <w:vertAlign w:val="superscript"/>
     </w:rPr>
   </w:style>
-  <w:style w:type="character" w:styleId="af2">
+  <w:style w:type="character" w:styleId="UnresolvedMention">
     <w:name w:val="Unresolved Mention"/>
-    <w:basedOn w:val="a1"/>
+    <w:basedOn w:val="DefaultParagraphFont"/>
     <w:uiPriority w:val="99"/>
     <w:semiHidden/>
     <w:unhideWhenUsed/>
@@ -6997,6 +5270,28 @@
 </a:theme>
 </file>
 
+<file path=word/webextensions/taskpanes.xml><?xml version="1.0" encoding="utf-8"?>
+<wetp:taskpanes xmlns:wetp="http://schemas.microsoft.com/office/webextensions/taskpanes/2010/11">
+  <wetp:taskpane dockstate="right" visibility="0" width="350" row="0">
+    <wetp:webextensionref xmlns:r="http://schemas.openxmlformats.org/officeDocument/2006/relationships" r:id="rId1"/>
+  </wetp:taskpane>
+</wetp:taskpanes>
+</file>
+
+<file path=word/webextensions/webextension1.xml><?xml version="1.0" encoding="utf-8"?>
+<we:webextension xmlns:we="http://schemas.microsoft.com/office/webextensions/webextension/2010/11" id="{2426DFF1-665D-584B-A2D2-D40FC682ACD6}">
+  <we:reference id="WA200010725" version="1.0.0.1" store="Omex" storeType="OMEX"/>
+  <we:alternateReferences>
+    <we:reference id="WA200010725" version="1.0.0.1" store="WA200010725" storeType="OMEX"/>
+  </we:alternateReferences>
+  <we:properties>
+    <we:property name="claude.fileId" value="&quot;fdee0fe0-150f-4416-8618-99e5155314ea&quot;"/>
+  </we:properties>
+  <we:bindings/>
+  <we:snapshot xmlns:r="http://schemas.openxmlformats.org/officeDocument/2006/relationships"/>
+</we:webextension>
+</file>
+
 <file path=customXml/item1.xml><?xml version="1.0" encoding="utf-8"?>
 <b:Sources xmlns:b="http://schemas.openxmlformats.org/officeDocument/2006/bibliography" xmlns="http://schemas.openxmlformats.org/officeDocument/2006/bibliography" SelectedStyle="\APA.XSL" StyleName="APA"/>
 </file>

</xml_diff>